<commit_message>
feat(uci): add runtime palette commands
</commit_message>
<xml_diff>
--- a/doc/uci_control_target.docx
+++ b/doc/uci_control_target.docx
@@ -1,6 +1,6 @@
 
 <file path=word/document.xml><?xml version="1.0" encoding="utf-8"?>
-<w:document xmlns:wpc="http://schemas.microsoft.com/office/word/2010/wordprocessingCanvas" xmlns:cx="http://schemas.microsoft.com/office/drawing/2014/chartex" xmlns:cx1="http://schemas.microsoft.com/office/drawing/2015/9/8/chartex" xmlns:cx2="http://schemas.microsoft.com/office/drawing/2015/10/21/chartex" xmlns:cx3="http://schemas.microsoft.com/office/drawing/2016/5/9/chartex" xmlns:cx4="http://schemas.microsoft.com/office/drawing/2016/5/10/chartex" xmlns:cx5="http://schemas.microsoft.com/office/drawing/2016/5/11/chartex" xmlns:cx6="http://schemas.microsoft.com/office/drawing/2016/5/12/chartex" xmlns:cx7="http://schemas.microsoft.com/office/drawing/2016/5/13/chartex" xmlns:cx8="http://schemas.microsoft.com/office/drawing/2016/5/14/chartex" xmlns:mc="http://schemas.openxmlformats.org/markup-compatibility/2006" xmlns:aink="http://schemas.microsoft.com/office/drawing/2016/ink" xmlns:am3d="http://schemas.microsoft.com/office/drawing/2017/model3d" xmlns:o="urn:schemas-microsoft-com:office:office" xmlns:oel="http://schemas.microsoft.com/office/2019/extlst" xmlns:r="http://schemas.openxmlformats.org/officeDocument/2006/relationships" xmlns:m="http://schemas.openxmlformats.org/officeDocument/2006/math" xmlns:v="urn:schemas-microsoft-com:vml" xmlns:wp14="http://schemas.microsoft.com/office/word/2010/wordprocessingDrawing" xmlns:wp="http://schemas.openxmlformats.org/drawingml/2006/wordprocessingDrawing" xmlns:w10="urn:schemas-microsoft-com:office:word" xmlns:w="http://schemas.openxmlformats.org/wordprocessingml/2006/main" xmlns:w14="http://schemas.microsoft.com/office/word/2010/wordml" xmlns:w15="http://schemas.microsoft.com/office/word/2012/wordml" xmlns:w16cex="http://schemas.microsoft.com/office/word/2018/wordml/cex" xmlns:w16cid="http://schemas.microsoft.com/office/word/2016/wordml/cid" xmlns:w16="http://schemas.microsoft.com/office/word/2018/wordml" xmlns:w16sdtdh="http://schemas.microsoft.com/office/word/2020/wordml/sdtdatahash" xmlns:w16se="http://schemas.microsoft.com/office/word/2015/wordml/symex" xmlns:wpg="http://schemas.microsoft.com/office/word/2010/wordprocessingGroup" xmlns:wpi="http://schemas.microsoft.com/office/word/2010/wordprocessingInk" xmlns:wne="http://schemas.microsoft.com/office/word/2006/wordml" xmlns:wps="http://schemas.microsoft.com/office/word/2010/wordprocessingShape" mc:Ignorable="w14 w15 w16se w16cid w16 w16cex w16sdtdh wp14">
+<w:document xmlns:wpc="http://schemas.microsoft.com/office/word/2010/wordprocessingCanvas" xmlns:cx="http://schemas.microsoft.com/office/drawing/2014/chartex" xmlns:cx1="http://schemas.microsoft.com/office/drawing/2015/9/8/chartex" xmlns:cx2="http://schemas.microsoft.com/office/drawing/2015/10/21/chartex" xmlns:cx3="http://schemas.microsoft.com/office/drawing/2016/5/9/chartex" xmlns:cx4="http://schemas.microsoft.com/office/drawing/2016/5/10/chartex" xmlns:cx5="http://schemas.microsoft.com/office/drawing/2016/5/11/chartex" xmlns:cx6="http://schemas.microsoft.com/office/drawing/2016/5/12/chartex" xmlns:cx7="http://schemas.microsoft.com/office/drawing/2016/5/13/chartex" xmlns:cx8="http://schemas.microsoft.com/office/drawing/2016/5/14/chartex" xmlns:mc="http://schemas.openxmlformats.org/markup-compatibility/2006" xmlns:m="http://schemas.openxmlformats.org/officeDocument/2006/math" xmlns:aink="http://schemas.microsoft.com/office/drawing/2016/ink" xmlns:am3d="http://schemas.microsoft.com/office/drawing/2017/model3d" xmlns:oel="http://schemas.microsoft.com/office/2019/extlst" xmlns:r="http://schemas.openxmlformats.org/officeDocument/2006/relationships" xmlns:wp14="http://schemas.microsoft.com/office/word/2010/wordprocessingDrawing" xmlns:wp="http://schemas.openxmlformats.org/drawingml/2006/wordprocessingDrawing" xmlns:wpg="http://schemas.microsoft.com/office/word/2010/wordprocessingGroup" xmlns:wpi="http://schemas.microsoft.com/office/word/2010/wordprocessingInk" xmlns:wps="http://schemas.microsoft.com/office/word/2010/wordprocessingShape" xmlns:o="urn:schemas-microsoft-com:office:office" xmlns:v="urn:schemas-microsoft-com:vml" xmlns:w10="urn:schemas-microsoft-com:office:word" xmlns:w="http://schemas.openxmlformats.org/wordprocessingml/2006/main" xmlns:w14="http://schemas.microsoft.com/office/word/2010/wordml" xmlns:w15="http://schemas.microsoft.com/office/word/2012/wordml" xmlns:w16cex="http://schemas.microsoft.com/office/word/2018/wordml/cex" xmlns:w16cid="http://schemas.microsoft.com/office/word/2016/wordml/cid" xmlns:w16="http://schemas.microsoft.com/office/word/2018/wordml" xmlns:w16sdtdh="http://schemas.microsoft.com/office/word/2020/wordml/sdtdatahash" xmlns:w16sdtfl="http://schemas.microsoft.com/office/word/2024/wordml/sdtformatlock" xmlns:w16se="http://schemas.microsoft.com/office/word/2015/wordml/symex" xmlns:w16du="http://schemas.microsoft.com/office/word/2023/wordml/word16du" xmlns:wne="http://schemas.microsoft.com/office/word/2006/wordml" mc:Ignorable="w14 w15 w16se w16cid w16 w16cex w16sdtdh w16sdtfl w16du wp14">
   <w:body>
     <w:tbl>
       <w:tblPr>
@@ -41,6 +41,7 @@
             <w:dataBinding w:prefixMappings="xmlns:ns0='http://schemas.openxmlformats.org/package/2006/metadata/core-properties' xmlns:ns1='http://purl.org/dc/elements/1.1/'" w:xpath="/ns0:coreProperties[1]/ns1:title[1]" w:storeItemID="{6C3C8BC8-F283-45AE-878A-BAB7291924A1}"/>
             <w:text/>
           </w:sdtPr>
+          <w:sdtEndPr/>
           <w:sdtContent>
             <w:tc>
               <w:tcPr>
@@ -104,6 +105,7 @@
             <w:dataBinding w:prefixMappings="xmlns:ns0='http://schemas.openxmlformats.org/package/2006/metadata/core-properties' xmlns:ns1='http://purl.org/dc/elements/1.1/'" w:xpath="/ns0:coreProperties[1]/ns1:subject[1]" w:storeItemID="{6C3C8BC8-F283-45AE-878A-BAB7291924A1}"/>
             <w:text/>
           </w:sdtPr>
+          <w:sdtEndPr/>
           <w:sdtContent>
             <w:tc>
               <w:tcPr>
@@ -166,6 +168,7 @@
                 <w:dataBinding w:prefixMappings="xmlns:ns0='http://schemas.openxmlformats.org/package/2006/metadata/core-properties' xmlns:ns1='http://purl.org/dc/elements/1.1/'" w:xpath="/ns0:coreProperties[1]/ns1:creator[1]" w:storeItemID="{6C3C8BC8-F283-45AE-878A-BAB7291924A1}"/>
                 <w:text w:multiLine="1"/>
               </w:sdtPr>
+              <w:sdtEndPr/>
               <w:sdtContent>
                 <w:r>
                   <w:rPr>
@@ -201,6 +204,7 @@
           <w:docPartUnique/>
         </w:docPartObj>
       </w:sdtPr>
+      <w:sdtEndPr/>
       <w:sdtContent>
         <w:p/>
         <w:p/>
@@ -239,38 +243,11 @@
             </w:r>
             <w:fldSimple w:instr=" DOCPROPERTY &quot;Version&quot; \* MERGEFORMAT ">
               <w:r>
-                <w:t>1.0</w:t>
+                <w:t>1.1</w:t>
               </w:r>
             </w:fldSimple>
             <w:r>
-              <w:rPr>
-                <w:bCs/>
-              </w:rPr>
-              <w:t xml:space="preserve">, </w:t>
-            </w:r>
-            <w:r>
-              <w:t xml:space="preserve"> </w:t>
-            </w:r>
-            <w:r>
-              <w:t>March</w:t>
-            </w:r>
-            <w:r>
-              <w:t xml:space="preserve"> </w:t>
-            </w:r>
-            <w:r>
-              <w:t>1</w:t>
-            </w:r>
-            <w:r>
-              <w:t>4</w:t>
-            </w:r>
-            <w:r>
-              <w:t>,</w:t>
-            </w:r>
-            <w:r>
-              <w:t xml:space="preserve"> 20</w:t>
-            </w:r>
-            <w:r>
-              <w:t>26</w:t>
+              <w:t>, August 15, 2026</w:t>
             </w:r>
           </w:p>
         </w:tc>
@@ -573,7 +550,7 @@
       <w:r>
         <w:fldChar w:fldCharType="separate"/>
       </w:r>
-      <w:hyperlink w:anchor="_Toc224418803" w:history="1">
+      <w:hyperlink w:anchor="_Toc237717287" w:history="1">
         <w:r>
           <w:rPr>
             <w:rStyle w:val="Hyperlink"/>
@@ -600,7 +577,7 @@
             <w:noProof/>
             <w:webHidden/>
           </w:rPr>
-          <w:instrText xml:space="preserve"> PAGEREF _Toc224418803 \h </w:instrText>
+          <w:instrText xml:space="preserve"> PAGEREF _Toc237717287 \h </w:instrText>
         </w:r>
         <w:r>
           <w:rPr>
@@ -646,7 +623,7 @@
           <w14:ligatures w14:val="standardContextual"/>
         </w:rPr>
       </w:pPr>
-      <w:hyperlink w:anchor="_Toc224418804" w:history="1">
+      <w:hyperlink w:anchor="_Toc237717288" w:history="1">
         <w:r>
           <w:rPr>
             <w:rStyle w:val="Hyperlink"/>
@@ -673,7 +650,7 @@
             <w:noProof/>
             <w:webHidden/>
           </w:rPr>
-          <w:instrText xml:space="preserve"> PAGEREF _Toc224418804 \h </w:instrText>
+          <w:instrText xml:space="preserve"> PAGEREF _Toc237717288 \h </w:instrText>
         </w:r>
         <w:r>
           <w:rPr>
@@ -719,7 +696,7 @@
           <w14:ligatures w14:val="standardContextual"/>
         </w:rPr>
       </w:pPr>
-      <w:hyperlink w:anchor="_Toc224418805" w:history="1">
+      <w:hyperlink w:anchor="_Toc237717289" w:history="1">
         <w:r>
           <w:rPr>
             <w:rStyle w:val="Hyperlink"/>
@@ -746,7 +723,7 @@
             <w:noProof/>
             <w:webHidden/>
           </w:rPr>
-          <w:instrText xml:space="preserve"> PAGEREF _Toc224418805 \h </w:instrText>
+          <w:instrText xml:space="preserve"> PAGEREF _Toc237717289 \h </w:instrText>
         </w:r>
         <w:r>
           <w:rPr>
@@ -789,7 +766,7 @@
           <w14:ligatures w14:val="standardContextual"/>
         </w:rPr>
       </w:pPr>
-      <w:hyperlink w:anchor="_Toc224418806" w:history="1">
+      <w:hyperlink w:anchor="_Toc237717290" w:history="1">
         <w:r>
           <w:rPr>
             <w:rStyle w:val="Hyperlink"/>
@@ -816,7 +793,7 @@
             <w:noProof/>
             <w:webHidden/>
           </w:rPr>
-          <w:instrText xml:space="preserve"> PAGEREF _Toc224418806 \h </w:instrText>
+          <w:instrText xml:space="preserve"> PAGEREF _Toc237717290 \h </w:instrText>
         </w:r>
         <w:r>
           <w:rPr>
@@ -862,7 +839,7 @@
           <w14:ligatures w14:val="standardContextual"/>
         </w:rPr>
       </w:pPr>
-      <w:hyperlink w:anchor="_Toc224418807" w:history="1">
+      <w:hyperlink w:anchor="_Toc237717291" w:history="1">
         <w:r>
           <w:rPr>
             <w:rStyle w:val="Hyperlink"/>
@@ -889,7 +866,7 @@
             <w:noProof/>
             <w:webHidden/>
           </w:rPr>
-          <w:instrText xml:space="preserve"> PAGEREF _Toc224418807 \h </w:instrText>
+          <w:instrText xml:space="preserve"> PAGEREF _Toc237717291 \h </w:instrText>
         </w:r>
         <w:r>
           <w:rPr>
@@ -935,7 +912,7 @@
           <w14:ligatures w14:val="standardContextual"/>
         </w:rPr>
       </w:pPr>
-      <w:hyperlink w:anchor="_Toc224418808" w:history="1">
+      <w:hyperlink w:anchor="_Toc237717292" w:history="1">
         <w:r>
           <w:rPr>
             <w:rStyle w:val="Hyperlink"/>
@@ -962,7 +939,7 @@
             <w:noProof/>
             <w:webHidden/>
           </w:rPr>
-          <w:instrText xml:space="preserve"> PAGEREF _Toc224418808 \h </w:instrText>
+          <w:instrText xml:space="preserve"> PAGEREF _Toc237717292 \h </w:instrText>
         </w:r>
         <w:r>
           <w:rPr>
@@ -1008,7 +985,7 @@
           <w14:ligatures w14:val="standardContextual"/>
         </w:rPr>
       </w:pPr>
-      <w:hyperlink w:anchor="_Toc224418809" w:history="1">
+      <w:hyperlink w:anchor="_Toc237717293" w:history="1">
         <w:r>
           <w:rPr>
             <w:rStyle w:val="Hyperlink"/>
@@ -1035,7 +1012,7 @@
             <w:noProof/>
             <w:webHidden/>
           </w:rPr>
-          <w:instrText xml:space="preserve"> PAGEREF _Toc224418809 \h </w:instrText>
+          <w:instrText xml:space="preserve"> PAGEREF _Toc237717293 \h </w:instrText>
         </w:r>
         <w:r>
           <w:rPr>
@@ -1081,7 +1058,7 @@
           <w14:ligatures w14:val="standardContextual"/>
         </w:rPr>
       </w:pPr>
-      <w:hyperlink w:anchor="_Toc224418810" w:history="1">
+      <w:hyperlink w:anchor="_Toc237717294" w:history="1">
         <w:r>
           <w:rPr>
             <w:rStyle w:val="Hyperlink"/>
@@ -1108,7 +1085,7 @@
             <w:noProof/>
             <w:webHidden/>
           </w:rPr>
-          <w:instrText xml:space="preserve"> PAGEREF _Toc224418810 \h </w:instrText>
+          <w:instrText xml:space="preserve"> PAGEREF _Toc237717294 \h </w:instrText>
         </w:r>
         <w:r>
           <w:rPr>
@@ -1154,7 +1131,7 @@
           <w14:ligatures w14:val="standardContextual"/>
         </w:rPr>
       </w:pPr>
-      <w:hyperlink w:anchor="_Toc224418811" w:history="1">
+      <w:hyperlink w:anchor="_Toc237717295" w:history="1">
         <w:r>
           <w:rPr>
             <w:rStyle w:val="Hyperlink"/>
@@ -1181,7 +1158,7 @@
             <w:noProof/>
             <w:webHidden/>
           </w:rPr>
-          <w:instrText xml:space="preserve"> PAGEREF _Toc224418811 \h </w:instrText>
+          <w:instrText xml:space="preserve"> PAGEREF _Toc237717295 \h </w:instrText>
         </w:r>
         <w:r>
           <w:rPr>
@@ -1227,7 +1204,7 @@
           <w14:ligatures w14:val="standardContextual"/>
         </w:rPr>
       </w:pPr>
-      <w:hyperlink w:anchor="_Toc224418812" w:history="1">
+      <w:hyperlink w:anchor="_Toc237717296" w:history="1">
         <w:r>
           <w:rPr>
             <w:rStyle w:val="Hyperlink"/>
@@ -1254,7 +1231,7 @@
             <w:noProof/>
             <w:webHidden/>
           </w:rPr>
-          <w:instrText xml:space="preserve"> PAGEREF _Toc224418812 \h </w:instrText>
+          <w:instrText xml:space="preserve"> PAGEREF _Toc237717296 \h </w:instrText>
         </w:r>
         <w:r>
           <w:rPr>
@@ -1300,7 +1277,7 @@
           <w14:ligatures w14:val="standardContextual"/>
         </w:rPr>
       </w:pPr>
-      <w:hyperlink w:anchor="_Toc224418813" w:history="1">
+      <w:hyperlink w:anchor="_Toc237717297" w:history="1">
         <w:r>
           <w:rPr>
             <w:rStyle w:val="Hyperlink"/>
@@ -1327,7 +1304,7 @@
             <w:noProof/>
             <w:webHidden/>
           </w:rPr>
-          <w:instrText xml:space="preserve"> PAGEREF _Toc224418813 \h </w:instrText>
+          <w:instrText xml:space="preserve"> PAGEREF _Toc237717297 \h </w:instrText>
         </w:r>
         <w:r>
           <w:rPr>
@@ -1373,7 +1350,7 @@
           <w14:ligatures w14:val="standardContextual"/>
         </w:rPr>
       </w:pPr>
-      <w:hyperlink w:anchor="_Toc224418814" w:history="1">
+      <w:hyperlink w:anchor="_Toc237717298" w:history="1">
         <w:r>
           <w:rPr>
             <w:rStyle w:val="Hyperlink"/>
@@ -1400,7 +1377,7 @@
             <w:noProof/>
             <w:webHidden/>
           </w:rPr>
-          <w:instrText xml:space="preserve"> PAGEREF _Toc224418814 \h </w:instrText>
+          <w:instrText xml:space="preserve"> PAGEREF _Toc237717298 \h </w:instrText>
         </w:r>
         <w:r>
           <w:rPr>
@@ -1446,7 +1423,7 @@
           <w14:ligatures w14:val="standardContextual"/>
         </w:rPr>
       </w:pPr>
-      <w:hyperlink w:anchor="_Toc224418815" w:history="1">
+      <w:hyperlink w:anchor="_Toc237717299" w:history="1">
         <w:r>
           <w:rPr>
             <w:rStyle w:val="Hyperlink"/>
@@ -1473,7 +1450,7 @@
             <w:noProof/>
             <w:webHidden/>
           </w:rPr>
-          <w:instrText xml:space="preserve"> PAGEREF _Toc224418815 \h </w:instrText>
+          <w:instrText xml:space="preserve"> PAGEREF _Toc237717299 \h </w:instrText>
         </w:r>
         <w:r>
           <w:rPr>
@@ -1519,7 +1496,7 @@
           <w14:ligatures w14:val="standardContextual"/>
         </w:rPr>
       </w:pPr>
-      <w:hyperlink w:anchor="_Toc224418816" w:history="1">
+      <w:hyperlink w:anchor="_Toc237717300" w:history="1">
         <w:r>
           <w:rPr>
             <w:rStyle w:val="Hyperlink"/>
@@ -1546,7 +1523,7 @@
             <w:noProof/>
             <w:webHidden/>
           </w:rPr>
-          <w:instrText xml:space="preserve"> PAGEREF _Toc224418816 \h </w:instrText>
+          <w:instrText xml:space="preserve"> PAGEREF _Toc237717300 \h </w:instrText>
         </w:r>
         <w:r>
           <w:rPr>
@@ -1592,7 +1569,7 @@
           <w14:ligatures w14:val="standardContextual"/>
         </w:rPr>
       </w:pPr>
-      <w:hyperlink w:anchor="_Toc224418817" w:history="1">
+      <w:hyperlink w:anchor="_Toc237717301" w:history="1">
         <w:r>
           <w:rPr>
             <w:rStyle w:val="Hyperlink"/>
@@ -1619,7 +1596,7 @@
             <w:noProof/>
             <w:webHidden/>
           </w:rPr>
-          <w:instrText xml:space="preserve"> PAGEREF _Toc224418817 \h </w:instrText>
+          <w:instrText xml:space="preserve"> PAGEREF _Toc237717301 \h </w:instrText>
         </w:r>
         <w:r>
           <w:rPr>
@@ -1665,7 +1642,7 @@
           <w14:ligatures w14:val="standardContextual"/>
         </w:rPr>
       </w:pPr>
-      <w:hyperlink w:anchor="_Toc224418818" w:history="1">
+      <w:hyperlink w:anchor="_Toc237717302" w:history="1">
         <w:r>
           <w:rPr>
             <w:rStyle w:val="Hyperlink"/>
@@ -1692,7 +1669,7 @@
             <w:noProof/>
             <w:webHidden/>
           </w:rPr>
-          <w:instrText xml:space="preserve"> PAGEREF _Toc224418818 \h </w:instrText>
+          <w:instrText xml:space="preserve"> PAGEREF _Toc237717302 \h </w:instrText>
         </w:r>
         <w:r>
           <w:rPr>
@@ -1738,7 +1715,7 @@
           <w14:ligatures w14:val="standardContextual"/>
         </w:rPr>
       </w:pPr>
-      <w:hyperlink w:anchor="_Toc224418819" w:history="1">
+      <w:hyperlink w:anchor="_Toc237717303" w:history="1">
         <w:r>
           <w:rPr>
             <w:rStyle w:val="Hyperlink"/>
@@ -1765,7 +1742,7 @@
             <w:noProof/>
             <w:webHidden/>
           </w:rPr>
-          <w:instrText xml:space="preserve"> PAGEREF _Toc224418819 \h </w:instrText>
+          <w:instrText xml:space="preserve"> PAGEREF _Toc237717303 \h </w:instrText>
         </w:r>
         <w:r>
           <w:rPr>
@@ -1811,7 +1788,7 @@
           <w14:ligatures w14:val="standardContextual"/>
         </w:rPr>
       </w:pPr>
-      <w:hyperlink w:anchor="_Toc224418820" w:history="1">
+      <w:hyperlink w:anchor="_Toc237717304" w:history="1">
         <w:r>
           <w:rPr>
             <w:rStyle w:val="Hyperlink"/>
@@ -1838,7 +1815,7 @@
             <w:noProof/>
             <w:webHidden/>
           </w:rPr>
-          <w:instrText xml:space="preserve"> PAGEREF _Toc224418820 \h </w:instrText>
+          <w:instrText xml:space="preserve"> PAGEREF _Toc237717304 \h </w:instrText>
         </w:r>
         <w:r>
           <w:rPr>
@@ -1884,7 +1861,7 @@
           <w14:ligatures w14:val="standardContextual"/>
         </w:rPr>
       </w:pPr>
-      <w:hyperlink w:anchor="_Toc224418821" w:history="1">
+      <w:hyperlink w:anchor="_Toc237717305" w:history="1">
         <w:r>
           <w:rPr>
             <w:rStyle w:val="Hyperlink"/>
@@ -1911,7 +1888,7 @@
             <w:noProof/>
             <w:webHidden/>
           </w:rPr>
-          <w:instrText xml:space="preserve"> PAGEREF _Toc224418821 \h </w:instrText>
+          <w:instrText xml:space="preserve"> PAGEREF _Toc237717305 \h </w:instrText>
         </w:r>
         <w:r>
           <w:rPr>
@@ -1957,7 +1934,7 @@
           <w14:ligatures w14:val="standardContextual"/>
         </w:rPr>
       </w:pPr>
-      <w:hyperlink w:anchor="_Toc224418822" w:history="1">
+      <w:hyperlink w:anchor="_Toc237717306" w:history="1">
         <w:r>
           <w:rPr>
             <w:rStyle w:val="Hyperlink"/>
@@ -1984,7 +1961,7 @@
             <w:noProof/>
             <w:webHidden/>
           </w:rPr>
-          <w:instrText xml:space="preserve"> PAGEREF _Toc224418822 \h </w:instrText>
+          <w:instrText xml:space="preserve"> PAGEREF _Toc237717306 \h </w:instrText>
         </w:r>
         <w:r>
           <w:rPr>
@@ -2030,7 +2007,7 @@
           <w14:ligatures w14:val="standardContextual"/>
         </w:rPr>
       </w:pPr>
-      <w:hyperlink w:anchor="_Toc224418823" w:history="1">
+      <w:hyperlink w:anchor="_Toc237717307" w:history="1">
         <w:r>
           <w:rPr>
             <w:rStyle w:val="Hyperlink"/>
@@ -2057,7 +2034,7 @@
             <w:noProof/>
             <w:webHidden/>
           </w:rPr>
-          <w:instrText xml:space="preserve"> PAGEREF _Toc224418823 \h </w:instrText>
+          <w:instrText xml:space="preserve"> PAGEREF _Toc237717307 \h </w:instrText>
         </w:r>
         <w:r>
           <w:rPr>
@@ -2089,6 +2066,660 @@
       </w:hyperlink>
     </w:p>
     <w:p>
+      <w:pPr>
+        <w:pStyle w:val="TOC2"/>
+        <w:tabs>
+          <w:tab w:val="right" w:leader="dot" w:pos="9629"/>
+        </w:tabs>
+        <w:rPr>
+          <w:rFonts w:eastAsiaTheme="minorEastAsia"/>
+          <w:noProof/>
+          <w:kern w:val="2"/>
+          <w:sz w:val="24"/>
+          <w:szCs w:val="24"/>
+          <w14:ligatures w14:val="standardContextual"/>
+        </w:rPr>
+      </w:pPr>
+      <w:hyperlink w:anchor="_Toc237717308" w:history="1">
+        <w:r>
+          <w:rPr>
+            <w:rStyle w:val="Hyperlink"/>
+            <w:noProof/>
+          </w:rPr>
+          <w:t>2.18. CTRL_CMD_GET_PALETTE (0x51)</w:t>
+        </w:r>
+        <w:r>
+          <w:rPr>
+            <w:noProof/>
+            <w:webHidden/>
+          </w:rPr>
+          <w:tab/>
+        </w:r>
+        <w:r>
+          <w:rPr>
+            <w:noProof/>
+            <w:webHidden/>
+          </w:rPr>
+          <w:fldChar w:fldCharType="begin"/>
+        </w:r>
+        <w:r>
+          <w:rPr>
+            <w:noProof/>
+            <w:webHidden/>
+          </w:rPr>
+          <w:instrText xml:space="preserve"> PAGEREF _Toc237717308 \h </w:instrText>
+        </w:r>
+        <w:r>
+          <w:rPr>
+            <w:noProof/>
+            <w:webHidden/>
+          </w:rPr>
+        </w:r>
+        <w:r>
+          <w:rPr>
+            <w:noProof/>
+            <w:webHidden/>
+          </w:rPr>
+          <w:fldChar w:fldCharType="separate"/>
+        </w:r>
+        <w:r>
+          <w:rPr>
+            <w:noProof/>
+            <w:webHidden/>
+          </w:rPr>
+          <w:t>8</w:t>
+        </w:r>
+        <w:r>
+          <w:rPr>
+            <w:noProof/>
+            <w:webHidden/>
+          </w:rPr>
+          <w:fldChar w:fldCharType="end"/>
+        </w:r>
+      </w:hyperlink>
+    </w:p>
+    <w:p>
+      <w:pPr>
+        <w:pStyle w:val="TOC2"/>
+        <w:tabs>
+          <w:tab w:val="right" w:leader="dot" w:pos="9629"/>
+        </w:tabs>
+        <w:rPr>
+          <w:rFonts w:eastAsiaTheme="minorEastAsia"/>
+          <w:noProof/>
+          <w:kern w:val="2"/>
+          <w:sz w:val="24"/>
+          <w:szCs w:val="24"/>
+          <w14:ligatures w14:val="standardContextual"/>
+        </w:rPr>
+      </w:pPr>
+      <w:hyperlink w:anchor="_Toc237717309" w:history="1">
+        <w:r>
+          <w:rPr>
+            <w:rStyle w:val="Hyperlink"/>
+            <w:noProof/>
+          </w:rPr>
+          <w:t>2.19. CTRL_CMD_SET_PALETTE (0x52)</w:t>
+        </w:r>
+        <w:r>
+          <w:rPr>
+            <w:noProof/>
+            <w:webHidden/>
+          </w:rPr>
+          <w:tab/>
+        </w:r>
+        <w:r>
+          <w:rPr>
+            <w:noProof/>
+            <w:webHidden/>
+          </w:rPr>
+          <w:fldChar w:fldCharType="begin"/>
+        </w:r>
+        <w:r>
+          <w:rPr>
+            <w:noProof/>
+            <w:webHidden/>
+          </w:rPr>
+          <w:instrText xml:space="preserve"> PAGEREF _Toc237717309 \h </w:instrText>
+        </w:r>
+        <w:r>
+          <w:rPr>
+            <w:noProof/>
+            <w:webHidden/>
+          </w:rPr>
+        </w:r>
+        <w:r>
+          <w:rPr>
+            <w:noProof/>
+            <w:webHidden/>
+          </w:rPr>
+          <w:fldChar w:fldCharType="separate"/>
+        </w:r>
+        <w:r>
+          <w:rPr>
+            <w:noProof/>
+            <w:webHidden/>
+          </w:rPr>
+          <w:t>8</w:t>
+        </w:r>
+        <w:r>
+          <w:rPr>
+            <w:noProof/>
+            <w:webHidden/>
+          </w:rPr>
+          <w:fldChar w:fldCharType="end"/>
+        </w:r>
+      </w:hyperlink>
+    </w:p>
+    <w:p>
+      <w:pPr>
+        <w:pStyle w:val="TOC2"/>
+        <w:tabs>
+          <w:tab w:val="right" w:leader="dot" w:pos="9629"/>
+        </w:tabs>
+        <w:rPr>
+          <w:rFonts w:eastAsiaTheme="minorEastAsia"/>
+          <w:noProof/>
+          <w:kern w:val="2"/>
+          <w:sz w:val="24"/>
+          <w:szCs w:val="24"/>
+          <w14:ligatures w14:val="standardContextual"/>
+        </w:rPr>
+      </w:pPr>
+      <w:hyperlink w:anchor="_Toc237717310" w:history="1">
+        <w:r>
+          <w:rPr>
+            <w:rStyle w:val="Hyperlink"/>
+            <w:noProof/>
+          </w:rPr>
+          <w:t>2.20. CTRL_CMD_SET_PALETTE_COLOR (0x53)</w:t>
+        </w:r>
+        <w:r>
+          <w:rPr>
+            <w:noProof/>
+            <w:webHidden/>
+          </w:rPr>
+          <w:tab/>
+        </w:r>
+        <w:r>
+          <w:rPr>
+            <w:noProof/>
+            <w:webHidden/>
+          </w:rPr>
+          <w:fldChar w:fldCharType="begin"/>
+        </w:r>
+        <w:r>
+          <w:rPr>
+            <w:noProof/>
+            <w:webHidden/>
+          </w:rPr>
+          <w:instrText xml:space="preserve"> PAGEREF _Toc237717310 \h </w:instrText>
+        </w:r>
+        <w:r>
+          <w:rPr>
+            <w:noProof/>
+            <w:webHidden/>
+          </w:rPr>
+        </w:r>
+        <w:r>
+          <w:rPr>
+            <w:noProof/>
+            <w:webHidden/>
+          </w:rPr>
+          <w:fldChar w:fldCharType="separate"/>
+        </w:r>
+        <w:r>
+          <w:rPr>
+            <w:noProof/>
+            <w:webHidden/>
+          </w:rPr>
+          <w:t>9</w:t>
+        </w:r>
+        <w:r>
+          <w:rPr>
+            <w:noProof/>
+            <w:webHidden/>
+          </w:rPr>
+          <w:fldChar w:fldCharType="end"/>
+        </w:r>
+      </w:hyperlink>
+    </w:p>
+    <w:p>
+      <w:pPr>
+        <w:pStyle w:val="TOC2"/>
+        <w:tabs>
+          <w:tab w:val="right" w:leader="dot" w:pos="9629"/>
+        </w:tabs>
+        <w:rPr>
+          <w:rFonts w:eastAsiaTheme="minorEastAsia"/>
+          <w:noProof/>
+          <w:kern w:val="2"/>
+          <w:sz w:val="24"/>
+          <w:szCs w:val="24"/>
+          <w14:ligatures w14:val="standardContextual"/>
+        </w:rPr>
+      </w:pPr>
+      <w:hyperlink w:anchor="_Toc237717311" w:history="1">
+        <w:r>
+          <w:rPr>
+            <w:rStyle w:val="Hyperlink"/>
+            <w:noProof/>
+          </w:rPr>
+          <w:t>2.21. CTRL_CMD_RESET_PALETTE (0x54)</w:t>
+        </w:r>
+        <w:r>
+          <w:rPr>
+            <w:noProof/>
+            <w:webHidden/>
+          </w:rPr>
+          <w:tab/>
+        </w:r>
+        <w:r>
+          <w:rPr>
+            <w:noProof/>
+            <w:webHidden/>
+          </w:rPr>
+          <w:fldChar w:fldCharType="begin"/>
+        </w:r>
+        <w:r>
+          <w:rPr>
+            <w:noProof/>
+            <w:webHidden/>
+          </w:rPr>
+          <w:instrText xml:space="preserve"> PAGEREF _Toc237717311 \h </w:instrText>
+        </w:r>
+        <w:r>
+          <w:rPr>
+            <w:noProof/>
+            <w:webHidden/>
+          </w:rPr>
+        </w:r>
+        <w:r>
+          <w:rPr>
+            <w:noProof/>
+            <w:webHidden/>
+          </w:rPr>
+          <w:fldChar w:fldCharType="separate"/>
+        </w:r>
+        <w:r>
+          <w:rPr>
+            <w:noProof/>
+            <w:webHidden/>
+          </w:rPr>
+          <w:t>9</w:t>
+        </w:r>
+        <w:r>
+          <w:rPr>
+            <w:noProof/>
+            <w:webHidden/>
+          </w:rPr>
+          <w:fldChar w:fldCharType="end"/>
+        </w:r>
+      </w:hyperlink>
+    </w:p>
+    <w:p>
+      <w:pPr>
+        <w:pStyle w:val="TOC2"/>
+        <w:tabs>
+          <w:tab w:val="right" w:leader="dot" w:pos="9629"/>
+        </w:tabs>
+        <w:rPr>
+          <w:rFonts w:eastAsiaTheme="minorEastAsia"/>
+          <w:noProof/>
+          <w:kern w:val="2"/>
+          <w:sz w:val="24"/>
+          <w:szCs w:val="24"/>
+          <w14:ligatures w14:val="standardContextual"/>
+        </w:rPr>
+      </w:pPr>
+      <w:hyperlink w:anchor="_Toc237717312" w:history="1">
+        <w:r>
+          <w:rPr>
+            <w:rStyle w:val="Hyperlink"/>
+            <w:noProof/>
+          </w:rPr>
+          <w:t>2.22. Runtime and VPL file behavior</w:t>
+        </w:r>
+        <w:r>
+          <w:rPr>
+            <w:noProof/>
+            <w:webHidden/>
+          </w:rPr>
+          <w:tab/>
+        </w:r>
+        <w:r>
+          <w:rPr>
+            <w:noProof/>
+            <w:webHidden/>
+          </w:rPr>
+          <w:fldChar w:fldCharType="begin"/>
+        </w:r>
+        <w:r>
+          <w:rPr>
+            <w:noProof/>
+            <w:webHidden/>
+          </w:rPr>
+          <w:instrText xml:space="preserve"> PAGEREF _Toc237717312 \h </w:instrText>
+        </w:r>
+        <w:r>
+          <w:rPr>
+            <w:noProof/>
+            <w:webHidden/>
+          </w:rPr>
+        </w:r>
+        <w:r>
+          <w:rPr>
+            <w:noProof/>
+            <w:webHidden/>
+          </w:rPr>
+          <w:fldChar w:fldCharType="separate"/>
+        </w:r>
+        <w:r>
+          <w:rPr>
+            <w:noProof/>
+            <w:webHidden/>
+          </w:rPr>
+          <w:t>9</w:t>
+        </w:r>
+        <w:r>
+          <w:rPr>
+            <w:noProof/>
+            <w:webHidden/>
+          </w:rPr>
+          <w:fldChar w:fldCharType="end"/>
+        </w:r>
+      </w:hyperlink>
+    </w:p>
+    <w:p>
+      <w:pPr>
+        <w:pStyle w:val="TOC1"/>
+        <w:rPr>
+          <w:rFonts w:eastAsiaTheme="minorEastAsia"/>
+          <w:b w:val="0"/>
+          <w:noProof/>
+          <w:kern w:val="2"/>
+          <w:szCs w:val="24"/>
+          <w14:ligatures w14:val="standardContextual"/>
+        </w:rPr>
+      </w:pPr>
+      <w:hyperlink w:anchor="_Toc237717313" w:history="1">
+        <w:r>
+          <w:rPr>
+            <w:rStyle w:val="Hyperlink"/>
+            <w:noProof/>
+          </w:rPr>
+          <w:t>3. Palette programming examples</w:t>
+        </w:r>
+        <w:r>
+          <w:rPr>
+            <w:noProof/>
+            <w:webHidden/>
+          </w:rPr>
+          <w:tab/>
+        </w:r>
+        <w:r>
+          <w:rPr>
+            <w:noProof/>
+            <w:webHidden/>
+          </w:rPr>
+          <w:fldChar w:fldCharType="begin"/>
+        </w:r>
+        <w:r>
+          <w:rPr>
+            <w:noProof/>
+            <w:webHidden/>
+          </w:rPr>
+          <w:instrText xml:space="preserve"> PAGEREF _Toc237717313 \h </w:instrText>
+        </w:r>
+        <w:r>
+          <w:rPr>
+            <w:noProof/>
+            <w:webHidden/>
+          </w:rPr>
+        </w:r>
+        <w:r>
+          <w:rPr>
+            <w:noProof/>
+            <w:webHidden/>
+          </w:rPr>
+          <w:fldChar w:fldCharType="separate"/>
+        </w:r>
+        <w:r>
+          <w:rPr>
+            <w:noProof/>
+            <w:webHidden/>
+          </w:rPr>
+          <w:t>11</w:t>
+        </w:r>
+        <w:r>
+          <w:rPr>
+            <w:noProof/>
+            <w:webHidden/>
+          </w:rPr>
+          <w:fldChar w:fldCharType="end"/>
+        </w:r>
+      </w:hyperlink>
+    </w:p>
+    <w:p>
+      <w:pPr>
+        <w:pStyle w:val="TOC2"/>
+        <w:tabs>
+          <w:tab w:val="right" w:leader="dot" w:pos="9629"/>
+        </w:tabs>
+        <w:rPr>
+          <w:rFonts w:eastAsiaTheme="minorEastAsia"/>
+          <w:noProof/>
+          <w:kern w:val="2"/>
+          <w:sz w:val="24"/>
+          <w:szCs w:val="24"/>
+          <w14:ligatures w14:val="standardContextual"/>
+        </w:rPr>
+      </w:pPr>
+      <w:hyperlink w:anchor="_Toc237717314" w:history="1">
+        <w:r>
+          <w:rPr>
+            <w:rStyle w:val="Hyperlink"/>
+            <w:noProof/>
+          </w:rPr>
+          <w:t>3.1. 6502 assembly: set one color, then reset</w:t>
+        </w:r>
+        <w:r>
+          <w:rPr>
+            <w:noProof/>
+            <w:webHidden/>
+          </w:rPr>
+          <w:tab/>
+        </w:r>
+        <w:r>
+          <w:rPr>
+            <w:noProof/>
+            <w:webHidden/>
+          </w:rPr>
+          <w:fldChar w:fldCharType="begin"/>
+        </w:r>
+        <w:r>
+          <w:rPr>
+            <w:noProof/>
+            <w:webHidden/>
+          </w:rPr>
+          <w:instrText xml:space="preserve"> PAGEREF _Toc237717314 \h </w:instrText>
+        </w:r>
+        <w:r>
+          <w:rPr>
+            <w:noProof/>
+            <w:webHidden/>
+          </w:rPr>
+        </w:r>
+        <w:r>
+          <w:rPr>
+            <w:noProof/>
+            <w:webHidden/>
+          </w:rPr>
+          <w:fldChar w:fldCharType="separate"/>
+        </w:r>
+        <w:r>
+          <w:rPr>
+            <w:noProof/>
+            <w:webHidden/>
+          </w:rPr>
+          <w:t>11</w:t>
+        </w:r>
+        <w:r>
+          <w:rPr>
+            <w:noProof/>
+            <w:webHidden/>
+          </w:rPr>
+          <w:fldChar w:fldCharType="end"/>
+        </w:r>
+      </w:hyperlink>
+    </w:p>
+    <w:p>
+      <w:pPr>
+        <w:pStyle w:val="TOC2"/>
+        <w:tabs>
+          <w:tab w:val="right" w:leader="dot" w:pos="9629"/>
+        </w:tabs>
+        <w:rPr>
+          <w:rFonts w:eastAsiaTheme="minorEastAsia"/>
+          <w:noProof/>
+          <w:kern w:val="2"/>
+          <w:sz w:val="24"/>
+          <w:szCs w:val="24"/>
+          <w14:ligatures w14:val="standardContextual"/>
+        </w:rPr>
+      </w:pPr>
+      <w:hyperlink w:anchor="_Toc237717315" w:history="1">
+        <w:r>
+          <w:rPr>
+            <w:rStyle w:val="Hyperlink"/>
+            <w:noProof/>
+          </w:rPr>
+          <w:t>3.2. 6502 assembly: read all 16 colors</w:t>
+        </w:r>
+        <w:r>
+          <w:rPr>
+            <w:noProof/>
+            <w:webHidden/>
+          </w:rPr>
+          <w:tab/>
+        </w:r>
+        <w:r>
+          <w:rPr>
+            <w:noProof/>
+            <w:webHidden/>
+          </w:rPr>
+          <w:fldChar w:fldCharType="begin"/>
+        </w:r>
+        <w:r>
+          <w:rPr>
+            <w:noProof/>
+            <w:webHidden/>
+          </w:rPr>
+          <w:instrText xml:space="preserve"> PAGEREF _Toc237717315 \h </w:instrText>
+        </w:r>
+        <w:r>
+          <w:rPr>
+            <w:noProof/>
+            <w:webHidden/>
+          </w:rPr>
+        </w:r>
+        <w:r>
+          <w:rPr>
+            <w:noProof/>
+            <w:webHidden/>
+          </w:rPr>
+          <w:fldChar w:fldCharType="separate"/>
+        </w:r>
+        <w:r>
+          <w:rPr>
+            <w:noProof/>
+            <w:webHidden/>
+          </w:rPr>
+          <w:t>12</w:t>
+        </w:r>
+        <w:r>
+          <w:rPr>
+            <w:noProof/>
+            <w:webHidden/>
+          </w:rPr>
+          <w:fldChar w:fldCharType="end"/>
+        </w:r>
+      </w:hyperlink>
+    </w:p>
+    <w:p>
+      <w:pPr>
+        <w:pStyle w:val="TOC2"/>
+        <w:tabs>
+          <w:tab w:val="right" w:leader="dot" w:pos="9629"/>
+        </w:tabs>
+        <w:rPr>
+          <w:rFonts w:eastAsiaTheme="minorEastAsia"/>
+          <w:noProof/>
+          <w:kern w:val="2"/>
+          <w:sz w:val="24"/>
+          <w:szCs w:val="24"/>
+          <w14:ligatures w14:val="standardContextual"/>
+        </w:rPr>
+      </w:pPr>
+      <w:hyperlink w:anchor="_Toc237717316" w:history="1">
+        <w:r>
+          <w:rPr>
+            <w:rStyle w:val="Hyperlink"/>
+            <w:noProof/>
+          </w:rPr>
+          <w:t>3.3. Commodore BASIC V2: set one color, then reset</w:t>
+        </w:r>
+        <w:r>
+          <w:rPr>
+            <w:noProof/>
+            <w:webHidden/>
+          </w:rPr>
+          <w:tab/>
+        </w:r>
+        <w:r>
+          <w:rPr>
+            <w:noProof/>
+            <w:webHidden/>
+          </w:rPr>
+          <w:fldChar w:fldCharType="begin"/>
+        </w:r>
+        <w:r>
+          <w:rPr>
+            <w:noProof/>
+            <w:webHidden/>
+          </w:rPr>
+          <w:instrText xml:space="preserve"> PAGEREF _Toc237717316 \h </w:instrText>
+        </w:r>
+        <w:r>
+          <w:rPr>
+            <w:noProof/>
+            <w:webHidden/>
+          </w:rPr>
+        </w:r>
+        <w:r>
+          <w:rPr>
+            <w:noProof/>
+            <w:webHidden/>
+          </w:rPr>
+          <w:fldChar w:fldCharType="separate"/>
+        </w:r>
+        <w:r>
+          <w:rPr>
+            <w:noProof/>
+            <w:webHidden/>
+          </w:rPr>
+          <w:t>13</w:t>
+        </w:r>
+        <w:r>
+          <w:rPr>
+            <w:noProof/>
+            <w:webHidden/>
+          </w:rPr>
+          <w:fldChar w:fldCharType="end"/>
+        </w:r>
+      </w:hyperlink>
+    </w:p>
+    <w:p>
       <w:r>
         <w:fldChar w:fldCharType="end"/>
       </w:r>
@@ -2097,7 +2728,7 @@
       <w:pPr>
         <w:pStyle w:val="Heading1"/>
       </w:pPr>
-      <w:bookmarkStart w:id="0" w:name="_Toc224418803"/>
+      <w:bookmarkStart w:id="0" w:name="_Toc237717287"/>
       <w:r>
         <w:lastRenderedPageBreak/>
         <w:t>Introduction</w:t>
@@ -2108,7 +2739,7 @@
       <w:pPr>
         <w:pStyle w:val="Heading2"/>
       </w:pPr>
-      <w:bookmarkStart w:id="1" w:name="_Toc224418804"/>
+      <w:bookmarkStart w:id="1" w:name="_Toc237717288"/>
       <w:r>
         <w:t>Context</w:t>
       </w:r>
@@ -2191,7 +2822,7 @@
       <w:pPr>
         <w:pStyle w:val="Heading2"/>
       </w:pPr>
-      <w:bookmarkStart w:id="2" w:name="_Toc224418805"/>
+      <w:bookmarkStart w:id="2" w:name="_Toc237717289"/>
       <w:r>
         <w:t>Purpose of this document</w:t>
       </w:r>
@@ -2212,7 +2843,7 @@
       <w:pPr>
         <w:pStyle w:val="Heading1"/>
       </w:pPr>
-      <w:bookmarkStart w:id="3" w:name="_Toc224418806"/>
+      <w:bookmarkStart w:id="3" w:name="_Toc237717290"/>
       <w:r>
         <w:lastRenderedPageBreak/>
         <w:t>Commands</w:t>
@@ -2259,10 +2890,7 @@
         <w:t>The following paragraphs describe each of the commands of “</w:t>
       </w:r>
       <w:r>
-        <w:t xml:space="preserve">Control </w:t>
-      </w:r>
-      <w:r>
-        <w:t>T</w:t>
+        <w:t>Control T</w:t>
       </w:r>
       <w:r>
         <w:t>arget</w:t>
@@ -2275,7 +2903,7 @@
       <w:pPr>
         <w:pStyle w:val="Heading2"/>
       </w:pPr>
-      <w:bookmarkStart w:id="4" w:name="_Toc224418807"/>
+      <w:bookmarkStart w:id="4" w:name="_Toc237717291"/>
       <w:r>
         <w:t>CTRL</w:t>
       </w:r>
@@ -2389,7 +3017,7 @@
       <w:pPr>
         <w:pStyle w:val="Heading2"/>
       </w:pPr>
-      <w:bookmarkStart w:id="5" w:name="_Toc224418808"/>
+      <w:bookmarkStart w:id="5" w:name="_Toc237717292"/>
       <w:r>
         <w:t>CTRL_CMD_FINISH_CAPTURE (</w:t>
       </w:r>
@@ -2456,7 +3084,7 @@
       <w:pPr>
         <w:pStyle w:val="Heading2"/>
       </w:pPr>
-      <w:bookmarkStart w:id="6" w:name="_Toc224418809"/>
+      <w:bookmarkStart w:id="6" w:name="_Toc237717293"/>
       <w:r>
         <w:t>CTRL_CMD_FREEZE (</w:t>
       </w:r>
@@ -2541,7 +3169,7 @@
       <w:pPr>
         <w:pStyle w:val="Heading2"/>
       </w:pPr>
-      <w:bookmarkStart w:id="7" w:name="_Toc224418810"/>
+      <w:bookmarkStart w:id="7" w:name="_Toc237717294"/>
       <w:r>
         <w:t>CTRL_CMD_REBOOT (</w:t>
       </w:r>
@@ -2634,7 +3262,7 @@
       <w:pPr>
         <w:pStyle w:val="Heading2"/>
       </w:pPr>
-      <w:bookmarkStart w:id="8" w:name="_Toc224418811"/>
+      <w:bookmarkStart w:id="8" w:name="_Toc237717295"/>
       <w:r>
         <w:lastRenderedPageBreak/>
         <w:t>CTRL_CMD_LOAD_REU (</w:t>
@@ -2761,13 +3389,7 @@
         <w:rPr>
           <w:rStyle w:val="CodeChar"/>
         </w:rPr>
-        <w:t>81,INVALID PARAMS</w:t>
-      </w:r>
-      <w:r>
-        <w:rPr>
-          <w:rStyle w:val="CodeChar"/>
-        </w:rPr>
-        <w:t xml:space="preserve"> </w:t>
+        <w:t xml:space="preserve">81,INVALID PARAMS </w:t>
       </w:r>
     </w:p>
     <w:p>
@@ -2810,7 +3432,7 @@
       <w:pPr>
         <w:pStyle w:val="Heading2"/>
       </w:pPr>
-      <w:bookmarkStart w:id="9" w:name="_Toc224418812"/>
+      <w:bookmarkStart w:id="9" w:name="_Toc237717296"/>
       <w:r>
         <w:t>CTRL_CMD_U64_SAVEMEM</w:t>
       </w:r>
@@ -2877,13 +3499,7 @@
         <w:rPr>
           <w:rStyle w:val="CodeChar"/>
         </w:rPr>
-        <w:t>/temp/</w:t>
-      </w:r>
-      <w:r>
-        <w:rPr>
-          <w:rStyle w:val="CodeChar"/>
-        </w:rPr>
-        <w:t>c64_memory.bin</w:t>
+        <w:t>/temp/c64_memory.bin</w:t>
       </w:r>
       <w:r>
         <w:t>”</w:t>
@@ -2933,7 +3549,7 @@
       <w:pPr>
         <w:pStyle w:val="Heading2"/>
       </w:pPr>
-      <w:bookmarkStart w:id="10" w:name="_Toc224418813"/>
+      <w:bookmarkStart w:id="10" w:name="_Toc237717297"/>
       <w:r>
         <w:t>CTRL_CMD_DECODE_TRACK (</w:t>
       </w:r>
@@ -3126,7 +3742,7 @@
       <w:pPr>
         <w:pStyle w:val="Heading2"/>
       </w:pPr>
-      <w:bookmarkStart w:id="11" w:name="_Toc224418814"/>
+      <w:bookmarkStart w:id="11" w:name="_Toc237717298"/>
       <w:r>
         <w:lastRenderedPageBreak/>
         <w:t>CTRL_CMD_EASYFLASH</w:t>
@@ -3166,26 +3782,10 @@
         <w:t xml:space="preserve"> </w:t>
       </w:r>
       <w:r>
-        <w:t xml:space="preserve">The </w:t>
-      </w:r>
-      <w:proofErr w:type="spellStart"/>
-      <w:r>
-        <w:t>EasyFlash</w:t>
-      </w:r>
-      <w:proofErr w:type="spellEnd"/>
-      <w:r>
-        <w:t xml:space="preserve"> Erase command e</w:t>
-      </w:r>
-      <w:r>
-        <w:t xml:space="preserve">mulates the sector-erase function of an </w:t>
-      </w:r>
-      <w:proofErr w:type="spellStart"/>
-      <w:r>
-        <w:t>EasyFlash</w:t>
-      </w:r>
-      <w:proofErr w:type="spellEnd"/>
-      <w:r>
-        <w:t xml:space="preserve"> cartridge. This command erases a 64 KiB sector of the emulated 1 MiB Flash chip.</w:t>
+        <w:t>The EasyFlash Erase command e</w:t>
+      </w:r>
+      <w:r>
+        <w:t>mulates the sector-erase function of an EasyFlash cartridge. This command erases a 64 KiB sector of the emulated 1 MiB Flash chip.</w:t>
       </w:r>
     </w:p>
     <w:p>
@@ -3296,7 +3896,7 @@
       <w:pPr>
         <w:pStyle w:val="Heading2"/>
       </w:pPr>
-      <w:bookmarkStart w:id="12" w:name="_Toc224418815"/>
+      <w:bookmarkStart w:id="12" w:name="_Toc237717299"/>
       <w:r>
         <w:t>CTRL_CMD_GET_HWINFO (</w:t>
       </w:r>
@@ -3488,7 +4088,7 @@
       <w:pPr>
         <w:pStyle w:val="Heading2"/>
       </w:pPr>
-      <w:bookmarkStart w:id="13" w:name="_Toc224418816"/>
+      <w:bookmarkStart w:id="13" w:name="_Toc237717300"/>
       <w:r>
         <w:lastRenderedPageBreak/>
         <w:t>CTRL_CMD_GET_DRVINFO ($29)</w:t>
@@ -3789,10 +4389,7 @@
               <w:cnfStyle w:val="000000100000" w:firstRow="0" w:lastRow="0" w:firstColumn="0" w:lastColumn="0" w:oddVBand="0" w:evenVBand="0" w:oddHBand="1" w:evenHBand="0" w:firstRowFirstColumn="0" w:firstRowLastColumn="0" w:lastRowFirstColumn="0" w:lastRowLastColumn="0"/>
             </w:pPr>
             <w:r>
-              <w:t>$0</w:t>
-            </w:r>
-            <w:r>
-              <w:t>F</w:t>
+              <w:t>$0F</w:t>
             </w:r>
           </w:p>
         </w:tc>
@@ -3821,10 +4418,7 @@
               <w:cnfStyle w:val="000000010000" w:firstRow="0" w:lastRow="0" w:firstColumn="0" w:lastColumn="0" w:oddVBand="0" w:evenVBand="0" w:oddHBand="0" w:evenHBand="1" w:firstRowFirstColumn="0" w:firstRowLastColumn="0" w:lastRowFirstColumn="0" w:lastRowLastColumn="0"/>
             </w:pPr>
             <w:r>
-              <w:t>$</w:t>
-            </w:r>
-            <w:r>
-              <w:t>50</w:t>
+              <w:t>$50</w:t>
             </w:r>
           </w:p>
         </w:tc>
@@ -3876,7 +4470,7 @@
       <w:pPr>
         <w:pStyle w:val="Heading2"/>
       </w:pPr>
-      <w:bookmarkStart w:id="14" w:name="_Toc224418817"/>
+      <w:bookmarkStart w:id="14" w:name="_Toc237717301"/>
       <w:r>
         <w:t>CTRL_CMD_ENABLE_</w:t>
       </w:r>
@@ -3970,7 +4564,7 @@
       <w:pPr>
         <w:pStyle w:val="Heading2"/>
       </w:pPr>
-      <w:bookmarkStart w:id="15" w:name="_Toc224418818"/>
+      <w:bookmarkStart w:id="15" w:name="_Toc237717302"/>
       <w:r>
         <w:t>CTRL_CMD_</w:t>
       </w:r>
@@ -4042,13 +4636,7 @@
         <w:t>ontrols the power state of emulated drive A</w:t>
       </w:r>
       <w:r>
-        <w:t>: This command turns the drive O</w:t>
-      </w:r>
-      <w:r>
-        <w:t>FF</w:t>
-      </w:r>
-      <w:r>
-        <w:t>.</w:t>
+        <w:t>: This command turns the drive OFF.</w:t>
       </w:r>
     </w:p>
     <w:p>
@@ -4073,7 +4661,7 @@
       <w:pPr>
         <w:pStyle w:val="Heading2"/>
       </w:pPr>
-      <w:bookmarkStart w:id="16" w:name="_Toc224418819"/>
+      <w:bookmarkStart w:id="16" w:name="_Toc237717303"/>
       <w:r>
         <w:t>CTRL_CMD_ENABLE_</w:t>
       </w:r>
@@ -4084,22 +4672,13 @@
         <w:t>_</w:t>
       </w:r>
       <w:r>
-        <w:t>B</w:t>
-      </w:r>
-      <w:r>
-        <w:t xml:space="preserve"> </w:t>
+        <w:t xml:space="preserve">B </w:t>
       </w:r>
       <w:r>
         <w:t>(</w:t>
       </w:r>
       <w:r>
-        <w:t>0x3</w:t>
-      </w:r>
-      <w:r>
-        <w:t>2</w:t>
-      </w:r>
-      <w:r>
-        <w:t>)</w:t>
+        <w:t>0x32)</w:t>
       </w:r>
       <w:bookmarkEnd w:id="16"/>
     </w:p>
@@ -4151,10 +4730,7 @@
         <w:t xml:space="preserve">ontrols the power state of emulated drive </w:t>
       </w:r>
       <w:r>
-        <w:t>B</w:t>
-      </w:r>
-      <w:r>
-        <w:t>: This command turns the drive ON.</w:t>
+        <w:t>B: This command turns the drive ON.</w:t>
       </w:r>
     </w:p>
     <w:p>
@@ -4179,7 +4755,7 @@
       <w:pPr>
         <w:pStyle w:val="Heading2"/>
       </w:pPr>
-      <w:bookmarkStart w:id="17" w:name="_Toc224418820"/>
+      <w:bookmarkStart w:id="17" w:name="_Toc237717304"/>
       <w:r>
         <w:t>CTRL_CMD_</w:t>
       </w:r>
@@ -4205,10 +4781,7 @@
         <w:t>3</w:t>
       </w:r>
       <w:r>
-        <w:t>3</w:t>
-      </w:r>
-      <w:r>
-        <w:t>)</w:t>
+        <w:t>3)</w:t>
       </w:r>
       <w:bookmarkEnd w:id="17"/>
     </w:p>
@@ -4260,16 +4833,7 @@
         <w:t xml:space="preserve">ontrols the power state of emulated drive </w:t>
       </w:r>
       <w:r>
-        <w:t>B</w:t>
-      </w:r>
-      <w:r>
-        <w:t>: This command turns the drive O</w:t>
-      </w:r>
-      <w:r>
-        <w:t>FF</w:t>
-      </w:r>
-      <w:r>
-        <w:t>.</w:t>
+        <w:t>B: This command turns the drive OFF.</w:t>
       </w:r>
     </w:p>
     <w:p>
@@ -4314,7 +4878,7 @@
           <w:bCs/>
         </w:rPr>
       </w:pPr>
-      <w:bookmarkStart w:id="18" w:name="_Toc224418821"/>
+      <w:bookmarkStart w:id="18" w:name="_Toc237717305"/>
       <w:r>
         <w:rPr>
           <w:rStyle w:val="Heading2Char"/>
@@ -4456,22 +5020,150 @@
           <w:bCs/>
         </w:rPr>
       </w:pPr>
-      <w:bookmarkStart w:id="19" w:name="_Toc224418822"/>
+      <w:bookmarkStart w:id="19" w:name="_Toc237717306"/>
       <w:r>
         <w:rPr>
           <w:rStyle w:val="Heading2Char"/>
           <w:b/>
           <w:bCs/>
         </w:rPr>
-        <w:t>CTRL_CMD_GET_DRIVE_</w:t>
-      </w:r>
+        <w:t>CTRL_CMD_GET_DRIVE_B_POWER (0x35)</w:t>
+      </w:r>
+      <w:bookmarkEnd w:id="19"/>
+    </w:p>
+    <w:p>
+      <w:r>
+        <w:rPr>
+          <w:b/>
+          <w:bCs/>
+        </w:rPr>
+        <w:t>Command format</w:t>
+      </w:r>
+      <w:r>
+        <w:t xml:space="preserve">: </w:t>
+      </w:r>
+      <w:r>
+        <w:rPr>
+          <w:rStyle w:val="CodeChar"/>
+        </w:rPr>
+        <w:t>$04 $</w:t>
+      </w:r>
+      <w:r>
+        <w:rPr>
+          <w:rStyle w:val="CodeChar"/>
+        </w:rPr>
+        <w:t>3</w:t>
+      </w:r>
+      <w:r>
+        <w:rPr>
+          <w:rStyle w:val="CodeChar"/>
+        </w:rPr>
+        <w:t>5</w:t>
+      </w:r>
+    </w:p>
+    <w:p>
+      <w:r>
+        <w:rPr>
+          <w:b/>
+          <w:bCs/>
+        </w:rPr>
+        <w:t>Description</w:t>
+      </w:r>
+      <w:r>
+        <w:t xml:space="preserve">: </w:t>
+      </w:r>
+      <w:r>
+        <w:t>With this command the power state of drive B can be queried.</w:t>
+      </w:r>
+    </w:p>
+    <w:p>
+      <w:pPr>
+        <w:rPr>
+          <w:b/>
+          <w:bCs/>
+        </w:rPr>
+      </w:pPr>
+      <w:r>
+        <w:rPr>
+          <w:b/>
+          <w:bCs/>
+        </w:rPr>
+        <w:t>Response:</w:t>
+      </w:r>
+      <w:r>
+        <w:rPr>
+          <w:b/>
+          <w:bCs/>
+        </w:rPr>
+        <w:t xml:space="preserve"> “</w:t>
+      </w:r>
+      <w:r>
+        <w:rPr>
+          <w:rStyle w:val="CodeChar"/>
+        </w:rPr>
+        <w:t>off</w:t>
+      </w:r>
+      <w:r>
+        <w:rPr>
+          <w:b/>
+          <w:bCs/>
+        </w:rPr>
+        <w:t>” or “</w:t>
+      </w:r>
+      <w:r>
+        <w:rPr>
+          <w:rStyle w:val="CodeChar"/>
+        </w:rPr>
+        <w:t xml:space="preserve">on </w:t>
+      </w:r>
+      <w:r>
+        <w:rPr>
+          <w:b/>
+          <w:bCs/>
+        </w:rPr>
+        <w:t>”</w:t>
+      </w:r>
+    </w:p>
+    <w:p>
+      <w:pPr>
+        <w:rPr>
+          <w:b/>
+          <w:bCs/>
+        </w:rPr>
+      </w:pPr>
+      <w:r>
+        <w:rPr>
+          <w:b/>
+          <w:bCs/>
+        </w:rPr>
+        <w:t>Status:</w:t>
+      </w:r>
+      <w:r>
+        <w:rPr>
+          <w:b/>
+          <w:bCs/>
+        </w:rPr>
+        <w:t xml:space="preserve"> </w:t>
+      </w:r>
+      <w:r>
+        <w:rPr>
+          <w:rStyle w:val="CodeChar"/>
+        </w:rPr>
+        <w:t>00,OK</w:t>
+      </w:r>
+    </w:p>
+    <w:p>
+      <w:pPr>
+        <w:pStyle w:val="Heading2"/>
+      </w:pPr>
+      <w:bookmarkStart w:id="20" w:name="_Toc237717307"/>
       <w:r>
         <w:rPr>
           <w:rStyle w:val="Heading2Char"/>
           <w:b/>
           <w:bCs/>
         </w:rPr>
-        <w:t>B</w:t>
+        <w:t>CTRL_CMD_GET_</w:t>
       </w:r>
       <w:r>
         <w:rPr>
@@ -4479,7 +5171,7 @@
           <w:b/>
           <w:bCs/>
         </w:rPr>
-        <w:t>_POWER (0x3</w:t>
+        <w:t>MP3_</w:t>
       </w:r>
       <w:r>
         <w:rPr>
@@ -4487,149 +5179,15 @@
           <w:b/>
           <w:bCs/>
         </w:rPr>
-        <w:t>5)</w:t>
-      </w:r>
-      <w:bookmarkEnd w:id="19"/>
-    </w:p>
-    <w:p>
-      <w:r>
-        <w:rPr>
-          <w:b/>
-          <w:bCs/>
-        </w:rPr>
-        <w:t>Command format</w:t>
-      </w:r>
-      <w:r>
-        <w:t xml:space="preserve">: </w:t>
-      </w:r>
-      <w:r>
-        <w:rPr>
-          <w:rStyle w:val="CodeChar"/>
-        </w:rPr>
-        <w:t>$04 $</w:t>
-      </w:r>
-      <w:r>
-        <w:rPr>
-          <w:rStyle w:val="CodeChar"/>
-        </w:rPr>
-        <w:t>3</w:t>
-      </w:r>
-      <w:r>
-        <w:rPr>
-          <w:rStyle w:val="CodeChar"/>
-        </w:rPr>
-        <w:t>5</w:t>
-      </w:r>
-    </w:p>
-    <w:p>
-      <w:r>
-        <w:rPr>
-          <w:b/>
-          <w:bCs/>
-        </w:rPr>
-        <w:t>Description</w:t>
-      </w:r>
-      <w:r>
-        <w:t xml:space="preserve">: </w:t>
-      </w:r>
-      <w:r>
-        <w:t xml:space="preserve">With this command the power state </w:t>
-      </w:r>
-      <w:r>
-        <w:t xml:space="preserve">of drive B </w:t>
-      </w:r>
-      <w:r>
-        <w:t>can be queried.</w:t>
-      </w:r>
-    </w:p>
-    <w:p>
-      <w:pPr>
-        <w:rPr>
-          <w:b/>
-          <w:bCs/>
-        </w:rPr>
-      </w:pPr>
-      <w:r>
-        <w:rPr>
-          <w:b/>
-          <w:bCs/>
-        </w:rPr>
-        <w:t>Response:</w:t>
-      </w:r>
-      <w:r>
-        <w:rPr>
-          <w:b/>
-          <w:bCs/>
-        </w:rPr>
-        <w:t xml:space="preserve"> “</w:t>
-      </w:r>
-      <w:r>
-        <w:rPr>
-          <w:rStyle w:val="CodeChar"/>
-        </w:rPr>
-        <w:t>off</w:t>
-      </w:r>
-      <w:r>
-        <w:rPr>
-          <w:b/>
-          <w:bCs/>
-        </w:rPr>
-        <w:t>” or “</w:t>
-      </w:r>
-      <w:r>
-        <w:rPr>
-          <w:rStyle w:val="CodeChar"/>
-        </w:rPr>
-        <w:t xml:space="preserve">on </w:t>
-      </w:r>
-      <w:r>
-        <w:rPr>
-          <w:b/>
-          <w:bCs/>
-        </w:rPr>
-        <w:t>”</w:t>
-      </w:r>
-    </w:p>
-    <w:p>
-      <w:pPr>
-        <w:rPr>
-          <w:b/>
-          <w:bCs/>
-        </w:rPr>
-      </w:pPr>
-      <w:r>
-        <w:rPr>
-          <w:b/>
-          <w:bCs/>
-        </w:rPr>
-        <w:t>Status:</w:t>
-      </w:r>
-      <w:r>
-        <w:rPr>
-          <w:b/>
-          <w:bCs/>
-        </w:rPr>
-        <w:t xml:space="preserve"> </w:t>
-      </w:r>
-      <w:r>
-        <w:rPr>
-          <w:rStyle w:val="CodeChar"/>
-        </w:rPr>
-        <w:t>00,OK</w:t>
-      </w:r>
-    </w:p>
-    <w:p>
-      <w:pPr>
-        <w:pStyle w:val="Heading2"/>
-      </w:pPr>
-      <w:bookmarkStart w:id="20" w:name="_Toc224418823"/>
+        <w:t>RAMDISKINFO (</w:t>
+      </w:r>
       <w:r>
         <w:rPr>
           <w:rStyle w:val="Heading2Char"/>
           <w:b/>
           <w:bCs/>
         </w:rPr>
-        <w:t>CTRL_CMD_GET_</w:t>
+        <w:t>0x</w:t>
       </w:r>
       <w:r>
         <w:rPr>
@@ -4637,126 +5195,1078 @@
           <w:b/>
           <w:bCs/>
         </w:rPr>
-        <w:t>MP3_</w:t>
-      </w:r>
-      <w:r>
-        <w:rPr>
-          <w:rStyle w:val="Heading2Char"/>
+        <w:t>40)</w:t>
+      </w:r>
+      <w:bookmarkEnd w:id="20"/>
+    </w:p>
+    <w:p>
+      <w:r>
+        <w:rPr>
           <w:b/>
           <w:bCs/>
         </w:rPr>
-        <w:t>RAMDISKINFO (</w:t>
-      </w:r>
-      <w:r>
-        <w:rPr>
-          <w:rStyle w:val="Heading2Char"/>
+        <w:t>Command format</w:t>
+      </w:r>
+      <w:r>
+        <w:t xml:space="preserve">: </w:t>
+      </w:r>
+      <w:r>
+        <w:rPr>
+          <w:rStyle w:val="CodeChar"/>
+        </w:rPr>
+        <w:t>$04 $40</w:t>
+      </w:r>
+    </w:p>
+    <w:p>
+      <w:r>
+        <w:rPr>
           <w:b/>
           <w:bCs/>
         </w:rPr>
-        <w:t>0x</w:t>
-      </w:r>
-      <w:r>
-        <w:rPr>
-          <w:rStyle w:val="Heading2Char"/>
+        <w:t>Description</w:t>
+      </w:r>
+      <w:r>
+        <w:t xml:space="preserve">: </w:t>
+      </w:r>
+      <w:r>
+        <w:t>This is a command specifically made for Geos MegaPatch 3. It returns the configuration of the RAM disks found in the REU image.</w:t>
+      </w:r>
+    </w:p>
+    <w:p>
+      <w:r>
+        <w:rPr>
           <w:b/>
           <w:bCs/>
         </w:rPr>
-        <w:t>40)</w:t>
-      </w:r>
-      <w:bookmarkEnd w:id="20"/>
-    </w:p>
-    <w:p>
-      <w:r>
+        <w:t xml:space="preserve">Response: </w:t>
+      </w:r>
+      <w:r>
+        <w:t xml:space="preserve">An </w:t>
+      </w:r>
+      <w:r>
+        <w:t>8-byte status block (2 bytes per drive) indicating RAM disk types (1541, 1571, 1581, or Native) and their sizes.</w:t>
+      </w:r>
+      <w:r>
+        <w:t xml:space="preserve"> The first of the two bytes indicates the type (0x41, 0x71, 0x81 or 0xDD)</w:t>
+      </w:r>
+      <w:r>
+        <w:t>. For native partitions, the second byte indicates the size expressed in blocks of 64 KiB, otherwise it’s zero.</w:t>
+      </w:r>
+    </w:p>
+    <w:p>
+      <w:pPr>
         <w:rPr>
           <w:b/>
           <w:bCs/>
         </w:rPr>
-        <w:t>Command format</w:t>
-      </w:r>
-      <w:r>
-        <w:t xml:space="preserve">: </w:t>
-      </w:r>
-      <w:r>
-        <w:rPr>
-          <w:rStyle w:val="CodeChar"/>
-        </w:rPr>
-        <w:t>$04 $40</w:t>
-      </w:r>
-    </w:p>
-    <w:p>
+      </w:pPr>
       <w:r>
         <w:rPr>
           <w:b/>
           <w:bCs/>
         </w:rPr>
-        <w:t>Description</w:t>
-      </w:r>
-      <w:r>
-        <w:t xml:space="preserve">: </w:t>
-      </w:r>
-      <w:r>
-        <w:t xml:space="preserve">This is a command specifically made for Geos </w:t>
-      </w:r>
-      <w:proofErr w:type="spellStart"/>
-      <w:r>
-        <w:t>MegaPatch</w:t>
-      </w:r>
-      <w:proofErr w:type="spellEnd"/>
-      <w:r>
-        <w:t xml:space="preserve"> 3. It returns the configuration of the RAM disks found in the REU image.</w:t>
-      </w:r>
-    </w:p>
-    <w:p>
+        <w:t>Status:</w:t>
+      </w:r>
       <w:r>
         <w:rPr>
           <w:b/>
           <w:bCs/>
         </w:rPr>
-        <w:t xml:space="preserve">Response: </w:t>
-      </w:r>
-      <w:r>
-        <w:t xml:space="preserve">An </w:t>
-      </w:r>
-      <w:r>
-        <w:t>8-byte status block (2 bytes per drive) indicating RAM disk types (1541, 1571, 1581, or Native) and their sizes.</w:t>
-      </w:r>
-      <w:r>
-        <w:t xml:space="preserve"> The first of the two bytes indicates the type (0x41, 0x71, 0x81 or 0xDD)</w:t>
-      </w:r>
-      <w:r>
-        <w:t>. For native partitions, the second byte indicates the size expressed in blocks of 64 KiB, otherwise it’s zero.</w:t>
-      </w:r>
-    </w:p>
-    <w:p>
-      <w:pPr>
+        <w:t xml:space="preserve"> </w:t>
+      </w:r>
+      <w:r>
+        <w:rPr>
+          <w:rStyle w:val="CodeChar"/>
+        </w:rPr>
+        <w:t>00,OK</w:t>
+      </w:r>
+    </w:p>
+    <w:p/>
+    <w:p/>
+    <w:p>
+      <w:pPr>
+        <w:pStyle w:val="Heading2"/>
+      </w:pPr>
+      <w:bookmarkStart w:id="21" w:name="ctrl_cmd_get_palette-0x51"/>
+      <w:bookmarkStart w:id="22" w:name="_Toc237717308"/>
+      <w:r>
+        <w:t>CTRL_CMD_GET_PALETTE (0x51)</w:t>
+      </w:r>
+      <w:bookmarkEnd w:id="22"/>
+    </w:p>
+    <w:p>
+      <w:r>
         <w:rPr>
           <w:b/>
           <w:bCs/>
         </w:rPr>
-      </w:pPr>
+        <w:t>Command format:</w:t>
+      </w:r>
+      <w:r>
+        <w:t xml:space="preserve"> $04 $51</w:t>
+      </w:r>
+    </w:p>
+    <w:p>
       <w:r>
         <w:rPr>
           <w:b/>
           <w:bCs/>
         </w:rPr>
-        <w:t>Status:</w:t>
-      </w:r>
+        <w:t>Availability:</w:t>
+      </w:r>
+      <w:r>
+        <w:t xml:space="preserve"> Ultimate 64, Ultimate 64 Elite, Ultimate 64-II, Ultimate 64 Elite-II, and Commodore 64 Ultimate.</w:t>
+      </w:r>
+    </w:p>
+    <w:p>
       <w:r>
         <w:rPr>
           <w:b/>
           <w:bCs/>
         </w:rPr>
+        <w:t>Description:</w:t>
+      </w:r>
+      <w:r>
         <w:t xml:space="preserve"> </w:t>
       </w:r>
       <w:r>
-        <w:rPr>
-          <w:rStyle w:val="CodeChar"/>
-        </w:rPr>
-        <w:t>00,OK</w:t>
-      </w:r>
-    </w:p>
-    <w:p/>
-    <w:p/>
+        <w:t>Returns the currently applied runtime palette. The response is 48 bytes: 16 consecutive RGB triples in C64 color-number order (0 through 15). Each component is an unsigned 8-bit value. For example, response bytes 45, 46, and 47 are the red, green, and blue components of color 15.</w:t>
+      </w:r>
+    </w:p>
+    <w:p>
+      <w:r>
+        <w:rPr>
+          <w:b/>
+          <w:bCs/>
+        </w:rPr>
+        <w:t>Response:</w:t>
+      </w:r>
+      <w:r>
+        <w:t xml:space="preserve"> [R0 G0 B0] ... [R15 G15 B15]</w:t>
+      </w:r>
+    </w:p>
+    <w:p>
+      <w:r>
+        <w:rPr>
+          <w:b/>
+          <w:bCs/>
+        </w:rPr>
+        <w:t>Status:</w:t>
+      </w:r>
+      <w:r>
+        <w:t xml:space="preserve"> 00,OK. A payload or any command length other than two bytes returns 81,INVALID PARAMS.</w:t>
+      </w:r>
+    </w:p>
+    <w:p>
+      <w:r>
+        <w:t>On other Ultimate products this command is not implemented and returns 21,UNKNOWN COMMAND.</w:t>
+      </w:r>
+    </w:p>
+    <w:p>
+      <w:pPr>
+        <w:pStyle w:val="Heading2"/>
+      </w:pPr>
+      <w:bookmarkStart w:id="23" w:name="ctrl_cmd_set_palette-0x52"/>
+      <w:bookmarkStart w:id="24" w:name="_Toc237717309"/>
+      <w:bookmarkEnd w:id="21"/>
+      <w:r>
+        <w:t>CTRL_CMD_SET_PALETTE (0x52)</w:t>
+      </w:r>
+      <w:bookmarkEnd w:id="24"/>
+    </w:p>
+    <w:p>
+      <w:r>
+        <w:rPr>
+          <w:b/>
+          <w:bCs/>
+        </w:rPr>
+        <w:t>Command format:</w:t>
+      </w:r>
+      <w:r>
+        <w:t xml:space="preserve"> $04 $52 [R0 G0 B0] ... [R15 G15 B15]</w:t>
+      </w:r>
+    </w:p>
+    <w:p>
+      <w:r>
+        <w:rPr>
+          <w:b/>
+          <w:bCs/>
+        </w:rPr>
+        <w:lastRenderedPageBreak/>
+        <w:t>Availability:</w:t>
+      </w:r>
+      <w:r>
+        <w:t xml:space="preserve"> Ultimate 64 family only, as listed for GET_PALETTE.</w:t>
+      </w:r>
+    </w:p>
+    <w:p>
+      <w:r>
+        <w:rPr>
+          <w:b/>
+          <w:bCs/>
+        </w:rPr>
+        <w:t>Description:</w:t>
+      </w:r>
+      <w:r>
+        <w:t xml:space="preserve"> Replaces all 16 colors of the runtime palette. The command must contain exactly 48 RGB bytes after the target and command bytes, for a total command length of 50 bytes.</w:t>
+      </w:r>
+    </w:p>
+    <w:p>
+      <w:r>
+        <w:rPr>
+          <w:b/>
+          <w:bCs/>
+        </w:rPr>
+        <w:t>Response:</w:t>
+      </w:r>
+      <w:r>
+        <w:t xml:space="preserve"> None.</w:t>
+      </w:r>
+    </w:p>
+    <w:p>
+      <w:r>
+        <w:rPr>
+          <w:b/>
+          <w:bCs/>
+        </w:rPr>
+        <w:t>Status:</w:t>
+      </w:r>
+      <w:r>
+        <w:t xml:space="preserve"> 00,OK, or 81,INVALID PARAMS when the command length is not exactly 50 bytes. Invalid commands do not change the palette.</w:t>
+      </w:r>
+    </w:p>
+    <w:p>
+      <w:pPr>
+        <w:pStyle w:val="Heading2"/>
+      </w:pPr>
+      <w:bookmarkStart w:id="25" w:name="ctrl_cmd_set_palette_color-0x53"/>
+      <w:bookmarkStart w:id="26" w:name="_Toc237717310"/>
+      <w:bookmarkEnd w:id="23"/>
+      <w:r>
+        <w:t>CTRL_CMD_SET_PALETTE_COLOR (0x53)</w:t>
+      </w:r>
+      <w:bookmarkEnd w:id="26"/>
+    </w:p>
+    <w:p>
+      <w:r>
+        <w:rPr>
+          <w:b/>
+          <w:bCs/>
+        </w:rPr>
+        <w:t>Command format:</w:t>
+      </w:r>
+      <w:r>
+        <w:t xml:space="preserve"> $04 $53 [INDEX] [R] [G] [B]</w:t>
+      </w:r>
+    </w:p>
+    <w:p>
+      <w:r>
+        <w:rPr>
+          <w:b/>
+          <w:bCs/>
+        </w:rPr>
+        <w:t>Availability:</w:t>
+      </w:r>
+      <w:r>
+        <w:t xml:space="preserve"> Ultimate 64 family only, as listed for GET_PALETTE.</w:t>
+      </w:r>
+    </w:p>
+    <w:p>
+      <w:r>
+        <w:rPr>
+          <w:b/>
+          <w:bCs/>
+        </w:rPr>
+        <w:t>Description:</w:t>
+      </w:r>
+      <w:r>
+        <w:t xml:space="preserve"> Replaces one runtime color without rewriting the other 15 colors. INDEX is the C64 color number and must be in the range 0 through 15. The command must be exactly six bytes long.</w:t>
+      </w:r>
+    </w:p>
+    <w:p>
+      <w:r>
+        <w:rPr>
+          <w:b/>
+          <w:bCs/>
+        </w:rPr>
+        <w:t>Response:</w:t>
+      </w:r>
+      <w:r>
+        <w:t xml:space="preserve"> None.</w:t>
+      </w:r>
+    </w:p>
+    <w:p>
+      <w:r>
+        <w:rPr>
+          <w:b/>
+          <w:bCs/>
+        </w:rPr>
+        <w:t>Status:</w:t>
+      </w:r>
+      <w:r>
+        <w:t xml:space="preserve"> 00,OK, or 81,INVALID PARAMS for an invalid index or command length. Invalid commands do not change the palette.</w:t>
+      </w:r>
+    </w:p>
+    <w:p>
+      <w:pPr>
+        <w:pStyle w:val="Heading2"/>
+      </w:pPr>
+      <w:bookmarkStart w:id="27" w:name="ctrl_cmd_reset_palette-0x54"/>
+      <w:bookmarkStart w:id="28" w:name="_Toc237717311"/>
+      <w:bookmarkEnd w:id="25"/>
+      <w:r>
+        <w:t>CTRL_CMD_RESET_PALETTE (0x54)</w:t>
+      </w:r>
+      <w:bookmarkEnd w:id="28"/>
+    </w:p>
+    <w:p>
+      <w:r>
+        <w:rPr>
+          <w:b/>
+          <w:bCs/>
+        </w:rPr>
+        <w:t>Command format:</w:t>
+      </w:r>
+      <w:r>
+        <w:t xml:space="preserve"> $04 $54</w:t>
+      </w:r>
+    </w:p>
+    <w:p>
+      <w:r>
+        <w:rPr>
+          <w:b/>
+          <w:bCs/>
+        </w:rPr>
+        <w:t>Availability:</w:t>
+      </w:r>
+      <w:r>
+        <w:t xml:space="preserve"> </w:t>
+      </w:r>
+      <w:r>
+        <w:t>Ultimate 64 family only, as listed for GET_PALETTE.</w:t>
+      </w:r>
+    </w:p>
+    <w:p>
+      <w:r>
+        <w:rPr>
+          <w:b/>
+          <w:bCs/>
+        </w:rPr>
+        <w:t>Description:</w:t>
+      </w:r>
+      <w:r>
+        <w:t xml:space="preserve"> Restores the runtime palette to the firmware’s built-in C64 default colors. No RGB payload is required.</w:t>
+      </w:r>
+    </w:p>
+    <w:p>
+      <w:r>
+        <w:rPr>
+          <w:b/>
+          <w:bCs/>
+        </w:rPr>
+        <w:t>Response:</w:t>
+      </w:r>
+      <w:r>
+        <w:t xml:space="preserve"> None.</w:t>
+      </w:r>
+    </w:p>
+    <w:p>
+      <w:r>
+        <w:rPr>
+          <w:b/>
+          <w:bCs/>
+        </w:rPr>
+        <w:t>Status:</w:t>
+      </w:r>
+      <w:r>
+        <w:t xml:space="preserve"> 00,OK. A payload or any command length other than two bytes returns 81,INVALID PARAMS without changing the palette.</w:t>
+      </w:r>
+    </w:p>
+    <w:p>
+      <w:pPr>
+        <w:pStyle w:val="Heading2"/>
+      </w:pPr>
+      <w:bookmarkStart w:id="29" w:name="runtime-and-vpl-file-behavior"/>
+      <w:bookmarkStart w:id="30" w:name="_Toc237717312"/>
+      <w:bookmarkEnd w:id="27"/>
+      <w:r>
+        <w:t>Runtime and VPL file behavior</w:t>
+      </w:r>
+      <w:bookmarkEnd w:id="30"/>
+    </w:p>
+    <w:p>
+      <w:r>
+        <w:t>The four palette commands change runtime video output only. They do not write flash configuration and do not select, create, or overwrite a VPL file. A later palette change from the configuration UI, applying a VPL file, or rebooting the Ultimate may replace the runtime palette.</w:t>
+      </w:r>
+    </w:p>
+    <w:p>
+      <w:r>
+        <w:t>A C64 program can load and save VPL files through the existing Ultimate-DOS UCI target ($01 or $02):</w:t>
+      </w:r>
+    </w:p>
+    <w:p>
+      <w:pPr>
+        <w:numPr>
+          <w:ilvl w:val="0"/>
+          <w:numId w:val="49"/>
+        </w:numPr>
+      </w:pPr>
+      <w:r>
+        <w:t>To load: DOS_CMD_OPEN_FILE ($02) with attribute $01, DOS_CMD_READ_DATA ($04), then DOS_CMD_CLOSE_FILE ($03)</w:t>
+      </w:r>
+      <w:r>
+        <w:t>. Parse 16 RGB lines and send them with SET_PALETTE.</w:t>
+      </w:r>
+    </w:p>
+    <w:p>
+      <w:pPr>
+        <w:numPr>
+          <w:ilvl w:val="0"/>
+          <w:numId w:val="49"/>
+        </w:numPr>
+      </w:pPr>
+      <w:r>
+        <w:t>To save or overwrite: DOS_CMD_OPEN_FILE ($02) with attribute $0E, one or more DOS_CMD_WRITE_DATA ($05) commands, then DOS_CMD_CLOSE_FILE ($03).</w:t>
+      </w:r>
+    </w:p>
+    <w:p>
+      <w:r>
+        <w:t>A VPL file contains 16 non-empty RGB lines in C64 color-number order. Components are hexadecimal. Blank lines and text after # are ignored. This is the built-in default palette in VPL form:</w:t>
+      </w:r>
+    </w:p>
+    <w:p>
+      <w:r>
+        <w:lastRenderedPageBreak/>
+        <w:t>00 00 00 # 0 black</w:t>
+      </w:r>
+      <w:r>
+        <w:br/>
+        <w:t>F7 F7 F7 # 1 white</w:t>
+      </w:r>
+      <w:r>
+        <w:br/>
+        <w:t>8D 2F 34 # 2 red</w:t>
+      </w:r>
+      <w:r>
+        <w:br/>
+        <w:t>6A D4 CD # 3 cyan</w:t>
+      </w:r>
+      <w:r>
+        <w:br/>
+        <w:t>98 35 A4 # 4 purple</w:t>
+      </w:r>
+      <w:r>
+        <w:br/>
+        <w:t>4C B4 42 # 5 green</w:t>
+      </w:r>
+      <w:r>
+        <w:br/>
+      </w:r>
+      <w:r>
+        <w:t>2C 29 B1 # 6 blue</w:t>
+      </w:r>
+      <w:r>
+        <w:br/>
+        <w:t>EF EF 5D # 7 yellow</w:t>
+      </w:r>
+      <w:r>
+        <w:br/>
+        <w:t>98 4E 20 # 8 orange</w:t>
+      </w:r>
+      <w:r>
+        <w:br/>
+        <w:t>5B 38 00 # 9 brown</w:t>
+      </w:r>
+      <w:r>
+        <w:br/>
+        <w:t>D1 67 6D # 10 light red</w:t>
+      </w:r>
+      <w:r>
+        <w:br/>
+        <w:t>4A 4A 4A # 11 dark gray</w:t>
+      </w:r>
+      <w:r>
+        <w:br/>
+        <w:t>7B 7B 7B # 12 gray</w:t>
+      </w:r>
+      <w:r>
+        <w:br/>
+        <w:t>9F EF 93 # 13 light green</w:t>
+      </w:r>
+      <w:r>
+        <w:br/>
+        <w:t>6D 6A EF # 14 light blue</w:t>
+      </w:r>
+      <w:r>
+        <w:br/>
+        <w:t>B2 B2 B2 # 15 light gray</w:t>
+      </w:r>
+    </w:p>
+    <w:p>
+      <w:pPr>
+        <w:pStyle w:val="Heading1"/>
+      </w:pPr>
+      <w:bookmarkStart w:id="31" w:name="palette-programming-examples"/>
+      <w:bookmarkStart w:id="32" w:name="_Toc237717313"/>
+      <w:bookmarkEnd w:id="29"/>
+      <w:r>
+        <w:lastRenderedPageBreak/>
+        <w:t>Palette programming examples</w:t>
+      </w:r>
+      <w:bookmarkEnd w:id="32"/>
+    </w:p>
+    <w:p>
+      <w:r>
+        <w:t xml:space="preserve">The Command Interface setting must be enabled before these examples run. The transport and register meanings are defined in </w:t>
+      </w:r>
+      <w:r>
+        <w:rPr>
+          <w:i/>
+          <w:iCs/>
+        </w:rPr>
+        <w:t>Ultimate Command Interface - Register API</w:t>
+      </w:r>
+      <w:r>
+        <w:t>.</w:t>
+      </w:r>
+    </w:p>
+    <w:p>
+      <w:pPr>
+        <w:pStyle w:val="Heading2"/>
+      </w:pPr>
+      <w:bookmarkStart w:id="33" w:name="assembly-set-one-color-then-reset"/>
+      <w:bookmarkStart w:id="34" w:name="_Toc237717314"/>
+      <w:r>
+        <w:t>6502 assembly: set one color, then reset</w:t>
+      </w:r>
+      <w:bookmarkEnd w:id="34"/>
+    </w:p>
+    <w:p>
+      <w:r>
+        <w:t>This complete example prints a banner using color 15, changes that color from light gray to red, waits for a key, and restores the built-in palette. Assemble it at $C000 and start it with SYS 49152. Production code should also read and check the status bytes at $DF1F; successful commands return the ASCII string 00,OK.</w:t>
+      </w:r>
+    </w:p>
+    <w:p>
+      <w:r>
+        <w:t>* = $C000</w:t>
+      </w:r>
+      <w:r>
+        <w:br/>
+      </w:r>
+      <w:r>
+        <w:br/>
+        <w:t>UCI_CONTROL  = $DF1C</w:t>
+      </w:r>
+      <w:r>
+        <w:br/>
+        <w:t>UCI_COMMAND  = $DF1D</w:t>
+      </w:r>
+      <w:r>
+        <w:br/>
+      </w:r>
+      <w:r>
+        <w:br/>
+        <w:t>PUSH_CMD     = $01</w:t>
+      </w:r>
+      <w:r>
+        <w:br/>
+        <w:t>DATA_ACCEPT  = $02</w:t>
+      </w:r>
+      <w:r>
+        <w:br/>
+        <w:t>STATE_MASK   = $30</w:t>
+      </w:r>
+      <w:r>
+        <w:br/>
+        <w:t>STATE_BUSY   = $10</w:t>
+      </w:r>
+      <w:r>
+        <w:br/>
+        <w:t>STATE_LAST   = $20</w:t>
+      </w:r>
+      <w:r>
+        <w:br/>
+      </w:r>
+      <w:r>
+        <w:br/>
+        <w:t>start:</w:t>
+      </w:r>
+      <w:r>
+        <w:br/>
+        <w:t xml:space="preserve">        lda #$93              </w:t>
+      </w:r>
+      <w:r>
+        <w:t>; clear screen</w:t>
+      </w:r>
+      <w:r>
+        <w:br/>
+        <w:t xml:space="preserve">        jsr $FFD2             ; KERNAL CHROUT</w:t>
+      </w:r>
+      <w:r>
+        <w:br/>
+        <w:t xml:space="preserve">        lda #$0f</w:t>
+      </w:r>
+      <w:r>
+        <w:br/>
+        <w:t xml:space="preserve">        sta $0286             ; current text color = color 15</w:t>
+      </w:r>
+      <w:r>
+        <w:br/>
+        <w:t xml:space="preserve">        ldx #$00</w:t>
+      </w:r>
+      <w:r>
+        <w:br/>
+        <w:t>show:   lda banner,x</w:t>
+      </w:r>
+      <w:r>
+        <w:br/>
+        <w:t xml:space="preserve">        beq change</w:t>
+      </w:r>
+      <w:r>
+        <w:br/>
+        <w:t xml:space="preserve">        jsr $FFD2</w:t>
+      </w:r>
+      <w:r>
+        <w:br/>
+        <w:t xml:space="preserve">        inx</w:t>
+      </w:r>
+      <w:r>
+        <w:br/>
+        <w:t xml:space="preserve">        bne show</w:t>
+      </w:r>
+      <w:r>
+        <w:br/>
+        <w:t>change: jsr set_light_gray_red</w:t>
+      </w:r>
+      <w:r>
+        <w:br/>
+        <w:t>key:    jsr $FFE4             ; KERNAL GETIN</w:t>
+      </w:r>
+      <w:r>
+        <w:br/>
+        <w:t xml:space="preserve">        beq key</w:t>
+      </w:r>
+      <w:r>
+        <w:br/>
+        <w:t xml:space="preserve">        jsr reset_palette</w:t>
+      </w:r>
+      <w:r>
+        <w:br/>
+        <w:t xml:space="preserve">        rts</w:t>
+      </w:r>
+      <w:r>
+        <w:br/>
+      </w:r>
+      <w:r>
+        <w:br/>
+        <w:t>banner: .text "COLOR 15: RED - PRESS A KEY", 0</w:t>
+      </w:r>
+      <w:r>
+        <w:br/>
+      </w:r>
+      <w:r>
+        <w:br/>
+        <w:t>set_light_gray_red:</w:t>
+      </w:r>
+      <w:r>
+        <w:br/>
+        <w:t xml:space="preserve">        lda #$04              ; Control target</w:t>
+      </w:r>
+      <w:r>
+        <w:br/>
+      </w:r>
+      <w:r>
+        <w:t xml:space="preserve">        sta UCI_COMMAND</w:t>
+      </w:r>
+      <w:r>
+        <w:br/>
+        <w:t xml:space="preserve">        lda #$53              ; SET_PALETTE_COLOR</w:t>
+      </w:r>
+      <w:r>
+        <w:br/>
+        <w:t xml:space="preserve">        sta UCI_COMMAND</w:t>
+      </w:r>
+      <w:r>
+        <w:br/>
+        <w:t xml:space="preserve">        lda #$0f              ; color 15</w:t>
+      </w:r>
+      <w:r>
+        <w:br/>
+        <w:t xml:space="preserve">        sta UCI_COMMAND</w:t>
+      </w:r>
+      <w:r>
+        <w:br/>
+      </w:r>
+      <w:r>
+        <w:lastRenderedPageBreak/>
+        <w:t xml:space="preserve">        lda #$ff              ; red</w:t>
+      </w:r>
+      <w:r>
+        <w:br/>
+        <w:t xml:space="preserve">        sta UCI_COMMAND</w:t>
+      </w:r>
+      <w:r>
+        <w:br/>
+        <w:t xml:space="preserve">        lda #$00              ; green, blue</w:t>
+      </w:r>
+      <w:r>
+        <w:br/>
+        <w:t xml:space="preserve">        sta UCI_COMMAND</w:t>
+      </w:r>
+      <w:r>
+        <w:br/>
+        <w:t xml:space="preserve">        sta UCI_COMMAND</w:t>
+      </w:r>
+      <w:r>
+        <w:br/>
+        <w:t xml:space="preserve">        jsr send_and_accept</w:t>
+      </w:r>
+      <w:r>
+        <w:br/>
+        <w:t xml:space="preserve">        rts</w:t>
+      </w:r>
+      <w:r>
+        <w:br/>
+      </w:r>
+      <w:r>
+        <w:br/>
+        <w:t>reset_palette:</w:t>
+      </w:r>
+      <w:r>
+        <w:br/>
+        <w:t xml:space="preserve">        lda #$04              ; Control target</w:t>
+      </w:r>
+      <w:r>
+        <w:br/>
+        <w:t xml:space="preserve">        sta UCI_COMMAND</w:t>
+      </w:r>
+      <w:r>
+        <w:br/>
+        <w:t xml:space="preserve">        lda #$54              ; RESET_PALETTE</w:t>
+      </w:r>
+      <w:r>
+        <w:br/>
+        <w:t xml:space="preserve">        sta UCI_COMMAND</w:t>
+      </w:r>
+      <w:r>
+        <w:br/>
+      </w:r>
+      <w:r>
+        <w:t xml:space="preserve">        jsr send_and_accept</w:t>
+      </w:r>
+      <w:r>
+        <w:br/>
+        <w:t xml:space="preserve">        rts</w:t>
+      </w:r>
+      <w:r>
+        <w:br/>
+      </w:r>
+      <w:r>
+        <w:br/>
+        <w:t>send_and_accept:</w:t>
+      </w:r>
+      <w:r>
+        <w:br/>
+        <w:t xml:space="preserve">        lda #PUSH_CMD</w:t>
+      </w:r>
+      <w:r>
+        <w:br/>
+        <w:t xml:space="preserve">        sta UCI_CONTROL</w:t>
+      </w:r>
+      <w:r>
+        <w:br/>
+        <w:t>wait:  lda UCI_CONTROL</w:t>
+      </w:r>
+      <w:r>
+        <w:br/>
+        <w:t xml:space="preserve">        and #STATE_MASK</w:t>
+      </w:r>
+      <w:r>
+        <w:br/>
+        <w:t xml:space="preserve">        cmp #STATE_BUSY</w:t>
+      </w:r>
+      <w:r>
+        <w:br/>
+        <w:t xml:space="preserve">        beq wait</w:t>
+      </w:r>
+      <w:r>
+        <w:br/>
+        <w:t xml:space="preserve">        cmp #STATE_LAST</w:t>
+      </w:r>
+      <w:r>
+        <w:br/>
+        <w:t xml:space="preserve">        bne protocol_error</w:t>
+      </w:r>
+      <w:r>
+        <w:br/>
+        <w:t xml:space="preserve">        lda #DATA_ACCEPT</w:t>
+      </w:r>
+      <w:r>
+        <w:br/>
+        <w:t xml:space="preserve">        sta UCI_CONTROL</w:t>
+      </w:r>
+      <w:r>
+        <w:br/>
+        <w:t xml:space="preserve">        rts</w:t>
+      </w:r>
+      <w:r>
+        <w:br/>
+      </w:r>
+      <w:r>
+        <w:br/>
+        <w:t>protocol_error:</w:t>
+      </w:r>
+      <w:r>
+        <w:br/>
+        <w:t xml:space="preserve">        ; Application-specific error handling goes here.</w:t>
+      </w:r>
+      <w:r>
+        <w:br/>
+        <w:t xml:space="preserve">        rts</w:t>
+      </w:r>
+    </w:p>
+    <w:p>
+      <w:pPr>
+        <w:pStyle w:val="Heading2"/>
+      </w:pPr>
+      <w:bookmarkStart w:id="35" w:name="assembly-read-all-16-colors"/>
+      <w:bookmarkStart w:id="36" w:name="_Toc237717315"/>
+      <w:bookmarkEnd w:id="33"/>
+      <w:r>
+        <w:t>6502 assembly: read all 16 colors</w:t>
+      </w:r>
+      <w:bookmarkEnd w:id="36"/>
+    </w:p>
+    <w:p>
+      <w:r>
+        <w:t xml:space="preserve">After STATE_LAST is reached, bit 7 of $DF1C </w:t>
+      </w:r>
+      <w:r>
+        <w:t>indicates that another response byte is available at $DF1E.</w:t>
+      </w:r>
+    </w:p>
+    <w:p>
+      <w:r>
+        <w:t>UCI_RESPONSE = $DF1E</w:t>
+      </w:r>
+      <w:r>
+        <w:br/>
+        <w:t>palette      = $C000          ; 48-byte application buffer</w:t>
+      </w:r>
+      <w:r>
+        <w:br/>
+      </w:r>
+      <w:r>
+        <w:br/>
+        <w:t>get_palette:</w:t>
+      </w:r>
+      <w:r>
+        <w:br/>
+        <w:t xml:space="preserve">        lda #$04</w:t>
+      </w:r>
+      <w:r>
+        <w:br/>
+        <w:t xml:space="preserve">        sta UCI_COMMAND</w:t>
+      </w:r>
+      <w:r>
+        <w:br/>
+        <w:t xml:space="preserve">        lda #$51              ; GET_PALETTE</w:t>
+      </w:r>
+      <w:r>
+        <w:br/>
+        <w:t xml:space="preserve">        sta UCI_COMMAND</w:t>
+      </w:r>
+      <w:r>
+        <w:br/>
+        <w:t xml:space="preserve">        lda #PUSH_CMD</w:t>
+      </w:r>
+      <w:r>
+        <w:br/>
+        <w:t xml:space="preserve">        sta UCI_CONTROL</w:t>
+      </w:r>
+      <w:r>
+        <w:br/>
+        <w:t>wait2: lda UCI_CONTROL</w:t>
+      </w:r>
+      <w:r>
+        <w:br/>
+      </w:r>
+      <w:r>
+        <w:lastRenderedPageBreak/>
+        <w:t xml:space="preserve">        and #STATE_MASK</w:t>
+      </w:r>
+      <w:r>
+        <w:br/>
+        <w:t xml:space="preserve">        cmp #STATE_BUSY</w:t>
+      </w:r>
+      <w:r>
+        <w:br/>
+        <w:t xml:space="preserve">        beq wait2</w:t>
+      </w:r>
+      <w:r>
+        <w:br/>
+        <w:t xml:space="preserve">        cmp #STATE_LAST</w:t>
+      </w:r>
+      <w:r>
+        <w:br/>
+        <w:t xml:space="preserve">        bne protocol_error</w:t>
+      </w:r>
+      <w:r>
+        <w:br/>
+        <w:t xml:space="preserve">        ldx #$00</w:t>
+      </w:r>
+      <w:r>
+        <w:br/>
+        <w:t>read:  lda UCI_CONTROL</w:t>
+      </w:r>
+      <w:r>
+        <w:br/>
+      </w:r>
+      <w:r>
+        <w:t xml:space="preserve">        bpl done              ; bit 7 clear: response queue empty</w:t>
+      </w:r>
+      <w:r>
+        <w:br/>
+        <w:t xml:space="preserve">        lda UCI_RESPONSE</w:t>
+      </w:r>
+      <w:r>
+        <w:br/>
+        <w:t xml:space="preserve">        sta palette,x</w:t>
+      </w:r>
+      <w:r>
+        <w:br/>
+        <w:t xml:space="preserve">        inx</w:t>
+      </w:r>
+      <w:r>
+        <w:br/>
+        <w:t xml:space="preserve">        bne read</w:t>
+      </w:r>
+      <w:r>
+        <w:br/>
+        <w:t>done:  cpx #48</w:t>
+      </w:r>
+      <w:r>
+        <w:br/>
+        <w:t xml:space="preserve">        bne protocol_error</w:t>
+      </w:r>
+      <w:r>
+        <w:br/>
+        <w:t xml:space="preserve">        lda #DATA_ACCEPT</w:t>
+      </w:r>
+      <w:r>
+        <w:br/>
+        <w:t xml:space="preserve">        sta UCI_CONTROL</w:t>
+      </w:r>
+      <w:r>
+        <w:br/>
+        <w:t xml:space="preserve">        rts</w:t>
+      </w:r>
+    </w:p>
+    <w:p>
+      <w:pPr>
+        <w:pStyle w:val="Heading2"/>
+      </w:pPr>
+      <w:bookmarkStart w:id="37" w:name="Xf9cbbc4790aa07470d7a908e110b501ef5efa3c"/>
+      <w:bookmarkStart w:id="38" w:name="_Toc237717316"/>
+      <w:bookmarkEnd w:id="35"/>
+      <w:r>
+        <w:t>Commodore BASIC V2: set one color, then reset</w:t>
+      </w:r>
+      <w:bookmarkEnd w:id="38"/>
+    </w:p>
+    <w:p>
+      <w:r>
+        <w:t xml:space="preserve">Stock BASIC has no built-in UCI statement, but it can access the UCI registers with POKE and PEEK. This complete example prints a banner in color 15, changes it to red, waits for a key, and then uses RESET_PALETTE </w:t>
+      </w:r>
+      <w:r>
+        <w:t>to return it to light gray.</w:t>
+      </w:r>
+    </w:p>
+    <w:p>
+      <w:r>
+        <w:t>10 C=57116:D=57117:T=57119</w:t>
+      </w:r>
+      <w:r>
+        <w:br/>
+        <w:t>20 IF PEEK(D)&lt;&gt;201 THEN PRINT "UCI NOT AVAILABLE":END</w:t>
+      </w:r>
+      <w:r>
+        <w:br/>
+        <w:t>25 PRINT CHR$(147):POKE 646,15:PRINT "COLOR 15: RED - PRESS A KEY"</w:t>
+      </w:r>
+      <w:r>
+        <w:br/>
+        <w:t>30 N=6:GOSUB 200</w:t>
+      </w:r>
+      <w:r>
+        <w:br/>
+        <w:t>50 GET K$:IF K$="" THEN 50</w:t>
+      </w:r>
+      <w:r>
+        <w:br/>
+        <w:t>60 N=0:GOSUB 200</w:t>
+      </w:r>
+      <w:r>
+        <w:br/>
+        <w:t>70 PRINT "DEFAULT PALETTE RESTORED":END</w:t>
+      </w:r>
+      <w:r>
+        <w:br/>
+        <w:t>100 DATA 4,83,15,255,0,0</w:t>
+      </w:r>
+      <w:r>
+        <w:br/>
+        <w:t>200 IF (PEEK(C) AND 48)&lt;&gt;0 THEN PRINT "UCI BUSY":END</w:t>
+      </w:r>
+      <w:r>
+        <w:br/>
+        <w:t>210 IF N=0 THEN POKE D,4:POKE D,84:GOTO 230</w:t>
+      </w:r>
+      <w:r>
+        <w:br/>
+        <w:t>220 FOR I=1 TO N:READ B:POKE D,B:NEXT</w:t>
+      </w:r>
+      <w:r>
+        <w:br/>
+        <w:t>230 POKE C,1</w:t>
+      </w:r>
+      <w:r>
+        <w:br/>
+        <w:t>240 S=PEEK(C) AND 48:IF S=16 THEN 240</w:t>
+      </w:r>
+      <w:r>
+        <w:br/>
+      </w:r>
+      <w:r>
+        <w:t>250 IF S&lt;&gt;32 THEN PRINT "UCI PROTOCOL ERROR":END</w:t>
+      </w:r>
+      <w:r>
+        <w:br/>
+        <w:t>260 A$=""</w:t>
+      </w:r>
+      <w:r>
+        <w:br/>
+        <w:t>270 IF (PEEK(C) AND 64)=0 THEN 290</w:t>
+      </w:r>
+      <w:r>
+        <w:br/>
+        <w:t>280 A$=A$+CHR$(PEEK(T)):GOTO 270</w:t>
+      </w:r>
+      <w:r>
+        <w:br/>
+        <w:t>290 POKE C,2:PRINT A$:RETURN</w:t>
+      </w:r>
+    </w:p>
+    <w:p>
+      <w:r>
+        <w:t xml:space="preserve">The repository also contains software/6502/cmd_test_rom.tas, an old test cartridge that installs an @ BASIC statement. With that test ROM active, the single-color command can be written as @ "$04$53$0F$FF$00$00". The @ </w:t>
+      </w:r>
+      <w:r>
+        <w:t>extension is not installed at the normal production BASIC prompt, so portable programs should use the register protocol above or install their own wedge.</w:t>
+      </w:r>
+      <w:bookmarkEnd w:id="31"/>
+      <w:bookmarkEnd w:id="37"/>
+    </w:p>
     <w:sectPr>
       <w:headerReference w:type="default" r:id="rId8"/>
       <w:footerReference w:type="default" r:id="rId9"/>
@@ -4778,7 +6288,7 @@
 </file>
 
 <file path=word/endnotes.xml><?xml version="1.0" encoding="utf-8"?>
-<w:endnotes xmlns:wpc="http://schemas.microsoft.com/office/word/2010/wordprocessingCanvas" xmlns:cx="http://schemas.microsoft.com/office/drawing/2014/chartex" xmlns:cx1="http://schemas.microsoft.com/office/drawing/2015/9/8/chartex" xmlns:cx2="http://schemas.microsoft.com/office/drawing/2015/10/21/chartex" xmlns:cx3="http://schemas.microsoft.com/office/drawing/2016/5/9/chartex" xmlns:cx4="http://schemas.microsoft.com/office/drawing/2016/5/10/chartex" xmlns:cx5="http://schemas.microsoft.com/office/drawing/2016/5/11/chartex" xmlns:cx6="http://schemas.microsoft.com/office/drawing/2016/5/12/chartex" xmlns:cx7="http://schemas.microsoft.com/office/drawing/2016/5/13/chartex" xmlns:cx8="http://schemas.microsoft.com/office/drawing/2016/5/14/chartex" xmlns:mc="http://schemas.openxmlformats.org/markup-compatibility/2006" xmlns:aink="http://schemas.microsoft.com/office/drawing/2016/ink" xmlns:am3d="http://schemas.microsoft.com/office/drawing/2017/model3d" xmlns:o="urn:schemas-microsoft-com:office:office" xmlns:oel="http://schemas.microsoft.com/office/2019/extlst" xmlns:r="http://schemas.openxmlformats.org/officeDocument/2006/relationships" xmlns:m="http://schemas.openxmlformats.org/officeDocument/2006/math" xmlns:v="urn:schemas-microsoft-com:vml" xmlns:wp14="http://schemas.microsoft.com/office/word/2010/wordprocessingDrawing" xmlns:wp="http://schemas.openxmlformats.org/drawingml/2006/wordprocessingDrawing" xmlns:w10="urn:schemas-microsoft-com:office:word" xmlns:w="http://schemas.openxmlformats.org/wordprocessingml/2006/main" xmlns:w14="http://schemas.microsoft.com/office/word/2010/wordml" xmlns:w15="http://schemas.microsoft.com/office/word/2012/wordml" xmlns:w16cex="http://schemas.microsoft.com/office/word/2018/wordml/cex" xmlns:w16cid="http://schemas.microsoft.com/office/word/2016/wordml/cid" xmlns:w16="http://schemas.microsoft.com/office/word/2018/wordml" xmlns:w16sdtdh="http://schemas.microsoft.com/office/word/2020/wordml/sdtdatahash" xmlns:w16se="http://schemas.microsoft.com/office/word/2015/wordml/symex" xmlns:wpg="http://schemas.microsoft.com/office/word/2010/wordprocessingGroup" xmlns:wpi="http://schemas.microsoft.com/office/word/2010/wordprocessingInk" xmlns:wne="http://schemas.microsoft.com/office/word/2006/wordml" xmlns:wps="http://schemas.microsoft.com/office/word/2010/wordprocessingShape" mc:Ignorable="w14 w15 w16se w16cid w16 w16cex w16sdtdh wp14">
+<w:endnotes xmlns:wpc="http://schemas.microsoft.com/office/word/2010/wordprocessingCanvas" xmlns:cx="http://schemas.microsoft.com/office/drawing/2014/chartex" xmlns:cx1="http://schemas.microsoft.com/office/drawing/2015/9/8/chartex" xmlns:cx2="http://schemas.microsoft.com/office/drawing/2015/10/21/chartex" xmlns:cx3="http://schemas.microsoft.com/office/drawing/2016/5/9/chartex" xmlns:cx4="http://schemas.microsoft.com/office/drawing/2016/5/10/chartex" xmlns:cx5="http://schemas.microsoft.com/office/drawing/2016/5/11/chartex" xmlns:cx6="http://schemas.microsoft.com/office/drawing/2016/5/12/chartex" xmlns:cx7="http://schemas.microsoft.com/office/drawing/2016/5/13/chartex" xmlns:cx8="http://schemas.microsoft.com/office/drawing/2016/5/14/chartex" xmlns:mc="http://schemas.openxmlformats.org/markup-compatibility/2006" xmlns:m="http://schemas.openxmlformats.org/officeDocument/2006/math" xmlns:aink="http://schemas.microsoft.com/office/drawing/2016/ink" xmlns:am3d="http://schemas.microsoft.com/office/drawing/2017/model3d" xmlns:oel="http://schemas.microsoft.com/office/2019/extlst" xmlns:r="http://schemas.openxmlformats.org/officeDocument/2006/relationships" xmlns:wp14="http://schemas.microsoft.com/office/word/2010/wordprocessingDrawing" xmlns:wp="http://schemas.openxmlformats.org/drawingml/2006/wordprocessingDrawing" xmlns:wpg="http://schemas.microsoft.com/office/word/2010/wordprocessingGroup" xmlns:wpi="http://schemas.microsoft.com/office/word/2010/wordprocessingInk" xmlns:wps="http://schemas.microsoft.com/office/word/2010/wordprocessingShape" xmlns:o="urn:schemas-microsoft-com:office:office" xmlns:v="urn:schemas-microsoft-com:vml" xmlns:w10="urn:schemas-microsoft-com:office:word" xmlns:w="http://schemas.openxmlformats.org/wordprocessingml/2006/main" xmlns:w14="http://schemas.microsoft.com/office/word/2010/wordml" xmlns:w15="http://schemas.microsoft.com/office/word/2012/wordml" xmlns:w16cex="http://schemas.microsoft.com/office/word/2018/wordml/cex" xmlns:w16cid="http://schemas.microsoft.com/office/word/2016/wordml/cid" xmlns:w16="http://schemas.microsoft.com/office/word/2018/wordml" xmlns:w16sdtdh="http://schemas.microsoft.com/office/word/2020/wordml/sdtdatahash" xmlns:w16sdtfl="http://schemas.microsoft.com/office/word/2024/wordml/sdtformatlock" xmlns:w16se="http://schemas.microsoft.com/office/word/2015/wordml/symex" xmlns:w16du="http://schemas.microsoft.com/office/word/2023/wordml/word16du" xmlns:wne="http://schemas.microsoft.com/office/word/2006/wordml" mc:Ignorable="w14 w15 w16se w16cid w16 w16cex w16sdtdh w16sdtfl w16du wp14">
   <w:endnote w:type="separator" w:id="-1">
     <w:p>
       <w:pPr>
@@ -4803,7 +6313,7 @@
 </file>
 
 <file path=word/footer1.xml><?xml version="1.0" encoding="utf-8"?>
-<w:ftr xmlns:wpc="http://schemas.microsoft.com/office/word/2010/wordprocessingCanvas" xmlns:cx="http://schemas.microsoft.com/office/drawing/2014/chartex" xmlns:cx1="http://schemas.microsoft.com/office/drawing/2015/9/8/chartex" xmlns:cx2="http://schemas.microsoft.com/office/drawing/2015/10/21/chartex" xmlns:cx3="http://schemas.microsoft.com/office/drawing/2016/5/9/chartex" xmlns:cx4="http://schemas.microsoft.com/office/drawing/2016/5/10/chartex" xmlns:cx5="http://schemas.microsoft.com/office/drawing/2016/5/11/chartex" xmlns:cx6="http://schemas.microsoft.com/office/drawing/2016/5/12/chartex" xmlns:cx7="http://schemas.microsoft.com/office/drawing/2016/5/13/chartex" xmlns:cx8="http://schemas.microsoft.com/office/drawing/2016/5/14/chartex" xmlns:mc="http://schemas.openxmlformats.org/markup-compatibility/2006" xmlns:aink="http://schemas.microsoft.com/office/drawing/2016/ink" xmlns:am3d="http://schemas.microsoft.com/office/drawing/2017/model3d" xmlns:o="urn:schemas-microsoft-com:office:office" xmlns:oel="http://schemas.microsoft.com/office/2019/extlst" xmlns:r="http://schemas.openxmlformats.org/officeDocument/2006/relationships" xmlns:m="http://schemas.openxmlformats.org/officeDocument/2006/math" xmlns:v="urn:schemas-microsoft-com:vml" xmlns:wp14="http://schemas.microsoft.com/office/word/2010/wordprocessingDrawing" xmlns:wp="http://schemas.openxmlformats.org/drawingml/2006/wordprocessingDrawing" xmlns:w10="urn:schemas-microsoft-com:office:word" xmlns:w="http://schemas.openxmlformats.org/wordprocessingml/2006/main" xmlns:w14="http://schemas.microsoft.com/office/word/2010/wordml" xmlns:w15="http://schemas.microsoft.com/office/word/2012/wordml" xmlns:w16cex="http://schemas.microsoft.com/office/word/2018/wordml/cex" xmlns:w16cid="http://schemas.microsoft.com/office/word/2016/wordml/cid" xmlns:w16="http://schemas.microsoft.com/office/word/2018/wordml" xmlns:w16sdtdh="http://schemas.microsoft.com/office/word/2020/wordml/sdtdatahash" xmlns:w16se="http://schemas.microsoft.com/office/word/2015/wordml/symex" xmlns:wpg="http://schemas.microsoft.com/office/word/2010/wordprocessingGroup" xmlns:wpi="http://schemas.microsoft.com/office/word/2010/wordprocessingInk" xmlns:wne="http://schemas.microsoft.com/office/word/2006/wordml" xmlns:wps="http://schemas.microsoft.com/office/word/2010/wordprocessingShape" mc:Ignorable="w14 w15 w16se w16cid w16 w16cex w16sdtdh wp14">
+<w:ftr xmlns:wpc="http://schemas.microsoft.com/office/word/2010/wordprocessingCanvas" xmlns:cx="http://schemas.microsoft.com/office/drawing/2014/chartex" xmlns:cx1="http://schemas.microsoft.com/office/drawing/2015/9/8/chartex" xmlns:cx2="http://schemas.microsoft.com/office/drawing/2015/10/21/chartex" xmlns:cx3="http://schemas.microsoft.com/office/drawing/2016/5/9/chartex" xmlns:cx4="http://schemas.microsoft.com/office/drawing/2016/5/10/chartex" xmlns:cx5="http://schemas.microsoft.com/office/drawing/2016/5/11/chartex" xmlns:cx6="http://schemas.microsoft.com/office/drawing/2016/5/12/chartex" xmlns:cx7="http://schemas.microsoft.com/office/drawing/2016/5/13/chartex" xmlns:cx8="http://schemas.microsoft.com/office/drawing/2016/5/14/chartex" xmlns:mc="http://schemas.openxmlformats.org/markup-compatibility/2006" xmlns:m="http://schemas.openxmlformats.org/officeDocument/2006/math" xmlns:aink="http://schemas.microsoft.com/office/drawing/2016/ink" xmlns:am3d="http://schemas.microsoft.com/office/drawing/2017/model3d" xmlns:oel="http://schemas.microsoft.com/office/2019/extlst" xmlns:r="http://schemas.openxmlformats.org/officeDocument/2006/relationships" xmlns:wp14="http://schemas.microsoft.com/office/word/2010/wordprocessingDrawing" xmlns:wp="http://schemas.openxmlformats.org/drawingml/2006/wordprocessingDrawing" xmlns:wpg="http://schemas.microsoft.com/office/word/2010/wordprocessingGroup" xmlns:wpi="http://schemas.microsoft.com/office/word/2010/wordprocessingInk" xmlns:wps="http://schemas.microsoft.com/office/word/2010/wordprocessingShape" xmlns:o="urn:schemas-microsoft-com:office:office" xmlns:v="urn:schemas-microsoft-com:vml" xmlns:w10="urn:schemas-microsoft-com:office:word" xmlns:w="http://schemas.openxmlformats.org/wordprocessingml/2006/main" xmlns:w14="http://schemas.microsoft.com/office/word/2010/wordml" xmlns:w15="http://schemas.microsoft.com/office/word/2012/wordml" xmlns:w16cex="http://schemas.microsoft.com/office/word/2018/wordml/cex" xmlns:w16cid="http://schemas.microsoft.com/office/word/2016/wordml/cid" xmlns:w16="http://schemas.microsoft.com/office/word/2018/wordml" xmlns:w16sdtdh="http://schemas.microsoft.com/office/word/2020/wordml/sdtdatahash" xmlns:w16sdtfl="http://schemas.microsoft.com/office/word/2024/wordml/sdtformatlock" xmlns:w16se="http://schemas.microsoft.com/office/word/2015/wordml/symex" xmlns:w16du="http://schemas.microsoft.com/office/word/2023/wordml/word16du" xmlns:wne="http://schemas.microsoft.com/office/word/2006/wordml" mc:Ignorable="w14 w15 w16se w16cid w16 w16cex w16sdtdh w16sdtfl w16du wp14">
   <w:p>
     <w:pPr>
       <w:pStyle w:val="Footer"/>
@@ -4843,31 +6353,7 @@
             </w:r>
           </w:fldSimple>
           <w:r>
-            <w:rPr>
-              <w:bCs/>
-            </w:rPr>
-            <w:t xml:space="preserve">, </w:t>
-          </w:r>
-          <w:r>
-            <w:t xml:space="preserve"> </w:t>
-          </w:r>
-          <w:r>
-            <w:t xml:space="preserve">March </w:t>
-          </w:r>
-          <w:r>
-            <w:t>1</w:t>
-          </w:r>
-          <w:r>
-            <w:t>4</w:t>
-          </w:r>
-          <w:r>
-            <w:t>,</w:t>
-          </w:r>
-          <w:r>
-            <w:t xml:space="preserve"> 20</w:t>
-          </w:r>
-          <w:r>
-            <w:t>26</w:t>
+            <w:t>, August 15, 2026</w:t>
           </w:r>
         </w:p>
       </w:tc>
@@ -4936,7 +6422,7 @@
 </file>
 
 <file path=word/footnotes.xml><?xml version="1.0" encoding="utf-8"?>
-<w:footnotes xmlns:wpc="http://schemas.microsoft.com/office/word/2010/wordprocessingCanvas" xmlns:cx="http://schemas.microsoft.com/office/drawing/2014/chartex" xmlns:cx1="http://schemas.microsoft.com/office/drawing/2015/9/8/chartex" xmlns:cx2="http://schemas.microsoft.com/office/drawing/2015/10/21/chartex" xmlns:cx3="http://schemas.microsoft.com/office/drawing/2016/5/9/chartex" xmlns:cx4="http://schemas.microsoft.com/office/drawing/2016/5/10/chartex" xmlns:cx5="http://schemas.microsoft.com/office/drawing/2016/5/11/chartex" xmlns:cx6="http://schemas.microsoft.com/office/drawing/2016/5/12/chartex" xmlns:cx7="http://schemas.microsoft.com/office/drawing/2016/5/13/chartex" xmlns:cx8="http://schemas.microsoft.com/office/drawing/2016/5/14/chartex" xmlns:mc="http://schemas.openxmlformats.org/markup-compatibility/2006" xmlns:aink="http://schemas.microsoft.com/office/drawing/2016/ink" xmlns:am3d="http://schemas.microsoft.com/office/drawing/2017/model3d" xmlns:o="urn:schemas-microsoft-com:office:office" xmlns:oel="http://schemas.microsoft.com/office/2019/extlst" xmlns:r="http://schemas.openxmlformats.org/officeDocument/2006/relationships" xmlns:m="http://schemas.openxmlformats.org/officeDocument/2006/math" xmlns:v="urn:schemas-microsoft-com:vml" xmlns:wp14="http://schemas.microsoft.com/office/word/2010/wordprocessingDrawing" xmlns:wp="http://schemas.openxmlformats.org/drawingml/2006/wordprocessingDrawing" xmlns:w10="urn:schemas-microsoft-com:office:word" xmlns:w="http://schemas.openxmlformats.org/wordprocessingml/2006/main" xmlns:w14="http://schemas.microsoft.com/office/word/2010/wordml" xmlns:w15="http://schemas.microsoft.com/office/word/2012/wordml" xmlns:w16cex="http://schemas.microsoft.com/office/word/2018/wordml/cex" xmlns:w16cid="http://schemas.microsoft.com/office/word/2016/wordml/cid" xmlns:w16="http://schemas.microsoft.com/office/word/2018/wordml" xmlns:w16sdtdh="http://schemas.microsoft.com/office/word/2020/wordml/sdtdatahash" xmlns:w16se="http://schemas.microsoft.com/office/word/2015/wordml/symex" xmlns:wpg="http://schemas.microsoft.com/office/word/2010/wordprocessingGroup" xmlns:wpi="http://schemas.microsoft.com/office/word/2010/wordprocessingInk" xmlns:wne="http://schemas.microsoft.com/office/word/2006/wordml" xmlns:wps="http://schemas.microsoft.com/office/word/2010/wordprocessingShape" mc:Ignorable="w14 w15 w16se w16cid w16 w16cex w16sdtdh wp14">
+<w:footnotes xmlns:wpc="http://schemas.microsoft.com/office/word/2010/wordprocessingCanvas" xmlns:cx="http://schemas.microsoft.com/office/drawing/2014/chartex" xmlns:cx1="http://schemas.microsoft.com/office/drawing/2015/9/8/chartex" xmlns:cx2="http://schemas.microsoft.com/office/drawing/2015/10/21/chartex" xmlns:cx3="http://schemas.microsoft.com/office/drawing/2016/5/9/chartex" xmlns:cx4="http://schemas.microsoft.com/office/drawing/2016/5/10/chartex" xmlns:cx5="http://schemas.microsoft.com/office/drawing/2016/5/11/chartex" xmlns:cx6="http://schemas.microsoft.com/office/drawing/2016/5/12/chartex" xmlns:cx7="http://schemas.microsoft.com/office/drawing/2016/5/13/chartex" xmlns:cx8="http://schemas.microsoft.com/office/drawing/2016/5/14/chartex" xmlns:mc="http://schemas.openxmlformats.org/markup-compatibility/2006" xmlns:m="http://schemas.openxmlformats.org/officeDocument/2006/math" xmlns:aink="http://schemas.microsoft.com/office/drawing/2016/ink" xmlns:am3d="http://schemas.microsoft.com/office/drawing/2017/model3d" xmlns:oel="http://schemas.microsoft.com/office/2019/extlst" xmlns:r="http://schemas.openxmlformats.org/officeDocument/2006/relationships" xmlns:wp14="http://schemas.microsoft.com/office/word/2010/wordprocessingDrawing" xmlns:wp="http://schemas.openxmlformats.org/drawingml/2006/wordprocessingDrawing" xmlns:wpg="http://schemas.microsoft.com/office/word/2010/wordprocessingGroup" xmlns:wpi="http://schemas.microsoft.com/office/word/2010/wordprocessingInk" xmlns:wps="http://schemas.microsoft.com/office/word/2010/wordprocessingShape" xmlns:o="urn:schemas-microsoft-com:office:office" xmlns:v="urn:schemas-microsoft-com:vml" xmlns:w10="urn:schemas-microsoft-com:office:word" xmlns:w="http://schemas.openxmlformats.org/wordprocessingml/2006/main" xmlns:w14="http://schemas.microsoft.com/office/word/2010/wordml" xmlns:w15="http://schemas.microsoft.com/office/word/2012/wordml" xmlns:w16cex="http://schemas.microsoft.com/office/word/2018/wordml/cex" xmlns:w16cid="http://schemas.microsoft.com/office/word/2016/wordml/cid" xmlns:w16="http://schemas.microsoft.com/office/word/2018/wordml" xmlns:w16sdtdh="http://schemas.microsoft.com/office/word/2020/wordml/sdtdatahash" xmlns:w16sdtfl="http://schemas.microsoft.com/office/word/2024/wordml/sdtformatlock" xmlns:w16se="http://schemas.microsoft.com/office/word/2015/wordml/symex" xmlns:w16du="http://schemas.microsoft.com/office/word/2023/wordml/word16du" xmlns:wne="http://schemas.microsoft.com/office/word/2006/wordml" mc:Ignorable="w14 w15 w16se w16cid w16 w16cex w16sdtdh w16sdtfl w16du wp14">
   <w:footnote w:type="separator" w:id="-1">
     <w:p>
       <w:pPr>
@@ -4961,7 +6447,7 @@
 </file>
 
 <file path=word/header1.xml><?xml version="1.0" encoding="utf-8"?>
-<w:hdr xmlns:wpc="http://schemas.microsoft.com/office/word/2010/wordprocessingCanvas" xmlns:cx="http://schemas.microsoft.com/office/drawing/2014/chartex" xmlns:cx1="http://schemas.microsoft.com/office/drawing/2015/9/8/chartex" xmlns:cx2="http://schemas.microsoft.com/office/drawing/2015/10/21/chartex" xmlns:cx3="http://schemas.microsoft.com/office/drawing/2016/5/9/chartex" xmlns:cx4="http://schemas.microsoft.com/office/drawing/2016/5/10/chartex" xmlns:cx5="http://schemas.microsoft.com/office/drawing/2016/5/11/chartex" xmlns:cx6="http://schemas.microsoft.com/office/drawing/2016/5/12/chartex" xmlns:cx7="http://schemas.microsoft.com/office/drawing/2016/5/13/chartex" xmlns:cx8="http://schemas.microsoft.com/office/drawing/2016/5/14/chartex" xmlns:mc="http://schemas.openxmlformats.org/markup-compatibility/2006" xmlns:aink="http://schemas.microsoft.com/office/drawing/2016/ink" xmlns:am3d="http://schemas.microsoft.com/office/drawing/2017/model3d" xmlns:o="urn:schemas-microsoft-com:office:office" xmlns:oel="http://schemas.microsoft.com/office/2019/extlst" xmlns:r="http://schemas.openxmlformats.org/officeDocument/2006/relationships" xmlns:m="http://schemas.openxmlformats.org/officeDocument/2006/math" xmlns:v="urn:schemas-microsoft-com:vml" xmlns:wp14="http://schemas.microsoft.com/office/word/2010/wordprocessingDrawing" xmlns:wp="http://schemas.openxmlformats.org/drawingml/2006/wordprocessingDrawing" xmlns:w10="urn:schemas-microsoft-com:office:word" xmlns:w="http://schemas.openxmlformats.org/wordprocessingml/2006/main" xmlns:w14="http://schemas.microsoft.com/office/word/2010/wordml" xmlns:w15="http://schemas.microsoft.com/office/word/2012/wordml" xmlns:w16cex="http://schemas.microsoft.com/office/word/2018/wordml/cex" xmlns:w16cid="http://schemas.microsoft.com/office/word/2016/wordml/cid" xmlns:w16="http://schemas.microsoft.com/office/word/2018/wordml" xmlns:w16sdtdh="http://schemas.microsoft.com/office/word/2020/wordml/sdtdatahash" xmlns:w16se="http://schemas.microsoft.com/office/word/2015/wordml/symex" xmlns:wpg="http://schemas.microsoft.com/office/word/2010/wordprocessingGroup" xmlns:wpi="http://schemas.microsoft.com/office/word/2010/wordprocessingInk" xmlns:wne="http://schemas.microsoft.com/office/word/2006/wordml" xmlns:wps="http://schemas.microsoft.com/office/word/2010/wordprocessingShape" mc:Ignorable="w14 w15 w16se w16cid w16 w16cex w16sdtdh wp14">
+<w:hdr xmlns:wpc="http://schemas.microsoft.com/office/word/2010/wordprocessingCanvas" xmlns:cx="http://schemas.microsoft.com/office/drawing/2014/chartex" xmlns:cx1="http://schemas.microsoft.com/office/drawing/2015/9/8/chartex" xmlns:cx2="http://schemas.microsoft.com/office/drawing/2015/10/21/chartex" xmlns:cx3="http://schemas.microsoft.com/office/drawing/2016/5/9/chartex" xmlns:cx4="http://schemas.microsoft.com/office/drawing/2016/5/10/chartex" xmlns:cx5="http://schemas.microsoft.com/office/drawing/2016/5/11/chartex" xmlns:cx6="http://schemas.microsoft.com/office/drawing/2016/5/12/chartex" xmlns:cx7="http://schemas.microsoft.com/office/drawing/2016/5/13/chartex" xmlns:cx8="http://schemas.microsoft.com/office/drawing/2016/5/14/chartex" xmlns:mc="http://schemas.openxmlformats.org/markup-compatibility/2006" xmlns:m="http://schemas.openxmlformats.org/officeDocument/2006/math" xmlns:aink="http://schemas.microsoft.com/office/drawing/2016/ink" xmlns:am3d="http://schemas.microsoft.com/office/drawing/2017/model3d" xmlns:oel="http://schemas.microsoft.com/office/2019/extlst" xmlns:r="http://schemas.openxmlformats.org/officeDocument/2006/relationships" xmlns:wp14="http://schemas.microsoft.com/office/word/2010/wordprocessingDrawing" xmlns:wp="http://schemas.openxmlformats.org/drawingml/2006/wordprocessingDrawing" xmlns:wpg="http://schemas.microsoft.com/office/word/2010/wordprocessingGroup" xmlns:wpi="http://schemas.microsoft.com/office/word/2010/wordprocessingInk" xmlns:wps="http://schemas.microsoft.com/office/word/2010/wordprocessingShape" xmlns:o="urn:schemas-microsoft-com:office:office" xmlns:v="urn:schemas-microsoft-com:vml" xmlns:w10="urn:schemas-microsoft-com:office:word" xmlns:w="http://schemas.openxmlformats.org/wordprocessingml/2006/main" xmlns:w14="http://schemas.microsoft.com/office/word/2010/wordml" xmlns:w15="http://schemas.microsoft.com/office/word/2012/wordml" xmlns:w16cex="http://schemas.microsoft.com/office/word/2018/wordml/cex" xmlns:w16cid="http://schemas.microsoft.com/office/word/2016/wordml/cid" xmlns:w16="http://schemas.microsoft.com/office/word/2018/wordml" xmlns:w16sdtdh="http://schemas.microsoft.com/office/word/2020/wordml/sdtdatahash" xmlns:w16sdtfl="http://schemas.microsoft.com/office/word/2024/wordml/sdtformatlock" xmlns:w16se="http://schemas.microsoft.com/office/word/2015/wordml/symex" xmlns:w16du="http://schemas.microsoft.com/office/word/2023/wordml/word16du" xmlns:wne="http://schemas.microsoft.com/office/word/2006/wordml" mc:Ignorable="w14 w15 w16se w16cid w16 w16cex w16sdtdh w16sdtfl w16du wp14">
   <w:tbl>
     <w:tblPr>
       <w:tblStyle w:val="TableGrid"/>
@@ -4994,6 +6480,7 @@
               <w:dataBinding w:prefixMappings="xmlns:ns0='http://schemas.openxmlformats.org/package/2006/metadata/core-properties' xmlns:ns1='http://purl.org/dc/elements/1.1/'" w:xpath="/ns0:coreProperties[1]/ns1:title[1]" w:storeItemID="{6C3C8BC8-F283-45AE-878A-BAB7291924A1}"/>
               <w:text/>
             </w:sdtPr>
+            <w:sdtEndPr/>
             <w:sdtContent>
               <w:r>
                 <w:t>UCI Control Target</w:t>
@@ -5023,6 +6510,7 @@
               <w:dataBinding w:prefixMappings="xmlns:ns0='http://schemas.openxmlformats.org/package/2006/metadata/core-properties' xmlns:ns1='http://purl.org/dc/elements/1.1/'" w:xpath="/ns0:coreProperties[1]/ns1:subject[1]" w:storeItemID="{6C3C8BC8-F283-45AE-878A-BAB7291924A1}"/>
               <w:text/>
             </w:sdtPr>
+            <w:sdtEndPr/>
             <w:sdtContent>
               <w:r>
                 <w:t>Command Summary</w:t>
@@ -5042,7 +6530,7 @@
 </file>
 
 <file path=word/numbering.xml><?xml version="1.0" encoding="utf-8"?>
-<w:numbering xmlns:wpc="http://schemas.microsoft.com/office/word/2010/wordprocessingCanvas" xmlns:cx="http://schemas.microsoft.com/office/drawing/2014/chartex" xmlns:cx1="http://schemas.microsoft.com/office/drawing/2015/9/8/chartex" xmlns:cx2="http://schemas.microsoft.com/office/drawing/2015/10/21/chartex" xmlns:cx3="http://schemas.microsoft.com/office/drawing/2016/5/9/chartex" xmlns:cx4="http://schemas.microsoft.com/office/drawing/2016/5/10/chartex" xmlns:cx5="http://schemas.microsoft.com/office/drawing/2016/5/11/chartex" xmlns:cx6="http://schemas.microsoft.com/office/drawing/2016/5/12/chartex" xmlns:cx7="http://schemas.microsoft.com/office/drawing/2016/5/13/chartex" xmlns:cx8="http://schemas.microsoft.com/office/drawing/2016/5/14/chartex" xmlns:mc="http://schemas.openxmlformats.org/markup-compatibility/2006" xmlns:aink="http://schemas.microsoft.com/office/drawing/2016/ink" xmlns:am3d="http://schemas.microsoft.com/office/drawing/2017/model3d" xmlns:o="urn:schemas-microsoft-com:office:office" xmlns:oel="http://schemas.microsoft.com/office/2019/extlst" xmlns:r="http://schemas.openxmlformats.org/officeDocument/2006/relationships" xmlns:m="http://schemas.openxmlformats.org/officeDocument/2006/math" xmlns:v="urn:schemas-microsoft-com:vml" xmlns:wp14="http://schemas.microsoft.com/office/word/2010/wordprocessingDrawing" xmlns:wp="http://schemas.openxmlformats.org/drawingml/2006/wordprocessingDrawing" xmlns:w10="urn:schemas-microsoft-com:office:word" xmlns:w="http://schemas.openxmlformats.org/wordprocessingml/2006/main" xmlns:w14="http://schemas.microsoft.com/office/word/2010/wordml" xmlns:w15="http://schemas.microsoft.com/office/word/2012/wordml" xmlns:w16cex="http://schemas.microsoft.com/office/word/2018/wordml/cex" xmlns:w16cid="http://schemas.microsoft.com/office/word/2016/wordml/cid" xmlns:w16="http://schemas.microsoft.com/office/word/2018/wordml" xmlns:w16sdtdh="http://schemas.microsoft.com/office/word/2020/wordml/sdtdatahash" xmlns:w16se="http://schemas.microsoft.com/office/word/2015/wordml/symex" xmlns:wpg="http://schemas.microsoft.com/office/word/2010/wordprocessingGroup" xmlns:wpi="http://schemas.microsoft.com/office/word/2010/wordprocessingInk" xmlns:wne="http://schemas.microsoft.com/office/word/2006/wordml" xmlns:wps="http://schemas.microsoft.com/office/word/2010/wordprocessingShape" mc:Ignorable="w14 w15 w16se w16cid w16 w16cex w16sdtdh wp14">
+<w:numbering xmlns:wpc="http://schemas.microsoft.com/office/word/2010/wordprocessingCanvas" xmlns:cx="http://schemas.microsoft.com/office/drawing/2014/chartex" xmlns:cx1="http://schemas.microsoft.com/office/drawing/2015/9/8/chartex" xmlns:cx2="http://schemas.microsoft.com/office/drawing/2015/10/21/chartex" xmlns:cx3="http://schemas.microsoft.com/office/drawing/2016/5/9/chartex" xmlns:cx4="http://schemas.microsoft.com/office/drawing/2016/5/10/chartex" xmlns:cx5="http://schemas.microsoft.com/office/drawing/2016/5/11/chartex" xmlns:cx6="http://schemas.microsoft.com/office/drawing/2016/5/12/chartex" xmlns:cx7="http://schemas.microsoft.com/office/drawing/2016/5/13/chartex" xmlns:cx8="http://schemas.microsoft.com/office/drawing/2016/5/14/chartex" xmlns:mc="http://schemas.openxmlformats.org/markup-compatibility/2006" xmlns:m="http://schemas.openxmlformats.org/officeDocument/2006/math" xmlns:aink="http://schemas.microsoft.com/office/drawing/2016/ink" xmlns:am3d="http://schemas.microsoft.com/office/drawing/2017/model3d" xmlns:oel="http://schemas.microsoft.com/office/2019/extlst" xmlns:r="http://schemas.openxmlformats.org/officeDocument/2006/relationships" xmlns:wp14="http://schemas.microsoft.com/office/word/2010/wordprocessingDrawing" xmlns:wp="http://schemas.openxmlformats.org/drawingml/2006/wordprocessingDrawing" xmlns:wpg="http://schemas.microsoft.com/office/word/2010/wordprocessingGroup" xmlns:wpi="http://schemas.microsoft.com/office/word/2010/wordprocessingInk" xmlns:wps="http://schemas.microsoft.com/office/word/2010/wordprocessingShape" xmlns:o="urn:schemas-microsoft-com:office:office" xmlns:v="urn:schemas-microsoft-com:vml" xmlns:w10="urn:schemas-microsoft-com:office:word" xmlns:w="http://schemas.openxmlformats.org/wordprocessingml/2006/main" xmlns:w14="http://schemas.microsoft.com/office/word/2010/wordml" xmlns:w15="http://schemas.microsoft.com/office/word/2012/wordml" xmlns:w16cex="http://schemas.microsoft.com/office/word/2018/wordml/cex" xmlns:w16cid="http://schemas.microsoft.com/office/word/2016/wordml/cid" xmlns:w16="http://schemas.microsoft.com/office/word/2018/wordml" xmlns:w16sdtdh="http://schemas.microsoft.com/office/word/2020/wordml/sdtdatahash" xmlns:w16sdtfl="http://schemas.microsoft.com/office/word/2024/wordml/sdtformatlock" xmlns:w16se="http://schemas.microsoft.com/office/word/2015/wordml/symex" xmlns:w16du="http://schemas.microsoft.com/office/word/2023/wordml/word16du" xmlns:wne="http://schemas.microsoft.com/office/word/2006/wordml" mc:Ignorable="w14 w15 w16se w16cid w16 w16cex w16sdtdh w16sdtfl w16du wp14">
   <w:abstractNum w:abstractNumId="0" w15:restartNumberingAfterBreak="0">
     <w:nsid w:val="028E418D"/>
     <w:multiLevelType w:val="multilevel"/>
@@ -5753,6 +7241,119 @@
     </w:lvl>
   </w:abstractNum>
   <w:abstractNum w:abstractNumId="5" w15:restartNumberingAfterBreak="0">
+    <w:nsid w:val="0E0F7FD4"/>
+    <w:multiLevelType w:val="multilevel"/>
+    <w:tmpl w:val="655263FA"/>
+    <w:lvl w:ilvl="0">
+      <w:start w:val="1"/>
+      <w:numFmt w:val="decimal"/>
+      <w:lvlText w:val="%1."/>
+      <w:lvlJc w:val="left"/>
+      <w:pPr>
+        <w:tabs>
+          <w:tab w:val="num" w:pos="720"/>
+        </w:tabs>
+        <w:ind w:left="720" w:hanging="720"/>
+      </w:pPr>
+    </w:lvl>
+    <w:lvl w:ilvl="1">
+      <w:start w:val="1"/>
+      <w:numFmt w:val="decimal"/>
+      <w:lvlText w:val="%2."/>
+      <w:lvlJc w:val="left"/>
+      <w:pPr>
+        <w:tabs>
+          <w:tab w:val="num" w:pos="1440"/>
+        </w:tabs>
+        <w:ind w:left="1440" w:hanging="720"/>
+      </w:pPr>
+    </w:lvl>
+    <w:lvl w:ilvl="2">
+      <w:start w:val="1"/>
+      <w:numFmt w:val="decimal"/>
+      <w:lvlText w:val="%3."/>
+      <w:lvlJc w:val="left"/>
+      <w:pPr>
+        <w:tabs>
+          <w:tab w:val="num" w:pos="2160"/>
+        </w:tabs>
+        <w:ind w:left="2160" w:hanging="720"/>
+      </w:pPr>
+    </w:lvl>
+    <w:lvl w:ilvl="3">
+      <w:start w:val="1"/>
+      <w:numFmt w:val="decimal"/>
+      <w:lvlText w:val="%4."/>
+      <w:lvlJc w:val="left"/>
+      <w:pPr>
+        <w:tabs>
+          <w:tab w:val="num" w:pos="2880"/>
+        </w:tabs>
+        <w:ind w:left="2880" w:hanging="720"/>
+      </w:pPr>
+    </w:lvl>
+    <w:lvl w:ilvl="4">
+      <w:start w:val="1"/>
+      <w:numFmt w:val="decimal"/>
+      <w:lvlText w:val="%5."/>
+      <w:lvlJc w:val="left"/>
+      <w:pPr>
+        <w:tabs>
+          <w:tab w:val="num" w:pos="3600"/>
+        </w:tabs>
+        <w:ind w:left="3600" w:hanging="720"/>
+      </w:pPr>
+    </w:lvl>
+    <w:lvl w:ilvl="5">
+      <w:start w:val="1"/>
+      <w:numFmt w:val="decimal"/>
+      <w:lvlText w:val="%6."/>
+      <w:lvlJc w:val="left"/>
+      <w:pPr>
+        <w:tabs>
+          <w:tab w:val="num" w:pos="4320"/>
+        </w:tabs>
+        <w:ind w:left="4320" w:hanging="720"/>
+      </w:pPr>
+    </w:lvl>
+    <w:lvl w:ilvl="6">
+      <w:start w:val="1"/>
+      <w:numFmt w:val="decimal"/>
+      <w:lvlText w:val="%7."/>
+      <w:lvlJc w:val="left"/>
+      <w:pPr>
+        <w:tabs>
+          <w:tab w:val="num" w:pos="5040"/>
+        </w:tabs>
+        <w:ind w:left="5040" w:hanging="720"/>
+      </w:pPr>
+    </w:lvl>
+    <w:lvl w:ilvl="7">
+      <w:start w:val="1"/>
+      <w:numFmt w:val="decimal"/>
+      <w:lvlText w:val="%8."/>
+      <w:lvlJc w:val="left"/>
+      <w:pPr>
+        <w:tabs>
+          <w:tab w:val="num" w:pos="5760"/>
+        </w:tabs>
+        <w:ind w:left="5760" w:hanging="720"/>
+      </w:pPr>
+    </w:lvl>
+    <w:lvl w:ilvl="8">
+      <w:start w:val="1"/>
+      <w:numFmt w:val="decimal"/>
+      <w:lvlText w:val="%9."/>
+      <w:lvlJc w:val="left"/>
+      <w:pPr>
+        <w:tabs>
+          <w:tab w:val="num" w:pos="6480"/>
+        </w:tabs>
+        <w:ind w:left="6480" w:hanging="720"/>
+      </w:pPr>
+    </w:lvl>
+  </w:abstractNum>
+  <w:abstractNum w:abstractNumId="6" w15:restartNumberingAfterBreak="0">
     <w:nsid w:val="104B48DA"/>
     <w:multiLevelType w:val="multilevel"/>
     <w:tmpl w:val="4586ACB8"/>
@@ -5901,7 +7502,7 @@
       </w:rPr>
     </w:lvl>
   </w:abstractNum>
-  <w:abstractNum w:abstractNumId="6" w15:restartNumberingAfterBreak="0">
+  <w:abstractNum w:abstractNumId="7" w15:restartNumberingAfterBreak="0">
     <w:nsid w:val="10A070FA"/>
     <w:multiLevelType w:val="hybridMultilevel"/>
     <w:tmpl w:val="F7A8763C"/>
@@ -6014,7 +7615,7 @@
       </w:rPr>
     </w:lvl>
   </w:abstractNum>
-  <w:abstractNum w:abstractNumId="7" w15:restartNumberingAfterBreak="0">
+  <w:abstractNum w:abstractNumId="8" w15:restartNumberingAfterBreak="0">
     <w:nsid w:val="17536D8F"/>
     <w:multiLevelType w:val="multilevel"/>
     <w:tmpl w:val="CED2061A"/>
@@ -6163,7 +7764,7 @@
       </w:rPr>
     </w:lvl>
   </w:abstractNum>
-  <w:abstractNum w:abstractNumId="8" w15:restartNumberingAfterBreak="0">
+  <w:abstractNum w:abstractNumId="9" w15:restartNumberingAfterBreak="0">
     <w:nsid w:val="1EBB18AC"/>
     <w:multiLevelType w:val="hybridMultilevel"/>
     <w:tmpl w:val="8064E77C"/>
@@ -6276,7 +7877,7 @@
       </w:rPr>
     </w:lvl>
   </w:abstractNum>
-  <w:abstractNum w:abstractNumId="9" w15:restartNumberingAfterBreak="0">
+  <w:abstractNum w:abstractNumId="10" w15:restartNumberingAfterBreak="0">
     <w:nsid w:val="1EE456D7"/>
     <w:multiLevelType w:val="multilevel"/>
     <w:tmpl w:val="7E4A6352"/>
@@ -6425,7 +8026,7 @@
       </w:rPr>
     </w:lvl>
   </w:abstractNum>
-  <w:abstractNum w:abstractNumId="10" w15:restartNumberingAfterBreak="0">
+  <w:abstractNum w:abstractNumId="11" w15:restartNumberingAfterBreak="0">
     <w:nsid w:val="219D4E00"/>
     <w:multiLevelType w:val="hybridMultilevel"/>
     <w:tmpl w:val="53845F66"/>
@@ -6538,7 +8139,7 @@
       </w:rPr>
     </w:lvl>
   </w:abstractNum>
-  <w:abstractNum w:abstractNumId="11" w15:restartNumberingAfterBreak="0">
+  <w:abstractNum w:abstractNumId="12" w15:restartNumberingAfterBreak="0">
     <w:nsid w:val="22653A1A"/>
     <w:multiLevelType w:val="hybridMultilevel"/>
     <w:tmpl w:val="1E4A6208"/>
@@ -6627,7 +8228,7 @@
       </w:pPr>
     </w:lvl>
   </w:abstractNum>
-  <w:abstractNum w:abstractNumId="12" w15:restartNumberingAfterBreak="0">
+  <w:abstractNum w:abstractNumId="13" w15:restartNumberingAfterBreak="0">
     <w:nsid w:val="231F051F"/>
     <w:multiLevelType w:val="hybridMultilevel"/>
     <w:tmpl w:val="265031FC"/>
@@ -6740,7 +8341,7 @@
       </w:rPr>
     </w:lvl>
   </w:abstractNum>
-  <w:abstractNum w:abstractNumId="13" w15:restartNumberingAfterBreak="0">
+  <w:abstractNum w:abstractNumId="14" w15:restartNumberingAfterBreak="0">
     <w:nsid w:val="27EC373C"/>
     <w:multiLevelType w:val="hybridMultilevel"/>
     <w:tmpl w:val="8084D50C"/>
@@ -6853,7 +8454,120 @@
       </w:rPr>
     </w:lvl>
   </w:abstractNum>
-  <w:abstractNum w:abstractNumId="14" w15:restartNumberingAfterBreak="0">
+  <w:abstractNum w:abstractNumId="15" w15:restartNumberingAfterBreak="0">
+    <w:nsid w:val="2B7727AB"/>
+    <w:multiLevelType w:val="multilevel"/>
+    <w:tmpl w:val="F9F0FE38"/>
+    <w:lvl w:ilvl="0">
+      <w:start w:val="1"/>
+      <w:numFmt w:val="decimal"/>
+      <w:lvlText w:val="%1."/>
+      <w:lvlJc w:val="left"/>
+      <w:pPr>
+        <w:tabs>
+          <w:tab w:val="num" w:pos="720"/>
+        </w:tabs>
+        <w:ind w:left="720" w:hanging="720"/>
+      </w:pPr>
+    </w:lvl>
+    <w:lvl w:ilvl="1">
+      <w:start w:val="1"/>
+      <w:numFmt w:val="decimal"/>
+      <w:lvlText w:val="%2."/>
+      <w:lvlJc w:val="left"/>
+      <w:pPr>
+        <w:tabs>
+          <w:tab w:val="num" w:pos="1440"/>
+        </w:tabs>
+        <w:ind w:left="1440" w:hanging="720"/>
+      </w:pPr>
+    </w:lvl>
+    <w:lvl w:ilvl="2">
+      <w:start w:val="1"/>
+      <w:numFmt w:val="decimal"/>
+      <w:lvlText w:val="%3."/>
+      <w:lvlJc w:val="left"/>
+      <w:pPr>
+        <w:tabs>
+          <w:tab w:val="num" w:pos="2160"/>
+        </w:tabs>
+        <w:ind w:left="2160" w:hanging="720"/>
+      </w:pPr>
+    </w:lvl>
+    <w:lvl w:ilvl="3">
+      <w:start w:val="1"/>
+      <w:numFmt w:val="decimal"/>
+      <w:lvlText w:val="%4."/>
+      <w:lvlJc w:val="left"/>
+      <w:pPr>
+        <w:tabs>
+          <w:tab w:val="num" w:pos="2880"/>
+        </w:tabs>
+        <w:ind w:left="2880" w:hanging="720"/>
+      </w:pPr>
+    </w:lvl>
+    <w:lvl w:ilvl="4">
+      <w:start w:val="1"/>
+      <w:numFmt w:val="decimal"/>
+      <w:lvlText w:val="%5."/>
+      <w:lvlJc w:val="left"/>
+      <w:pPr>
+        <w:tabs>
+          <w:tab w:val="num" w:pos="3600"/>
+        </w:tabs>
+        <w:ind w:left="3600" w:hanging="720"/>
+      </w:pPr>
+    </w:lvl>
+    <w:lvl w:ilvl="5">
+      <w:start w:val="1"/>
+      <w:numFmt w:val="decimal"/>
+      <w:lvlText w:val="%6."/>
+      <w:lvlJc w:val="left"/>
+      <w:pPr>
+        <w:tabs>
+          <w:tab w:val="num" w:pos="4320"/>
+        </w:tabs>
+        <w:ind w:left="4320" w:hanging="720"/>
+      </w:pPr>
+    </w:lvl>
+    <w:lvl w:ilvl="6">
+      <w:start w:val="1"/>
+      <w:numFmt w:val="decimal"/>
+      <w:lvlText w:val="%7."/>
+      <w:lvlJc w:val="left"/>
+      <w:pPr>
+        <w:tabs>
+          <w:tab w:val="num" w:pos="5040"/>
+        </w:tabs>
+        <w:ind w:left="5040" w:hanging="720"/>
+      </w:pPr>
+    </w:lvl>
+    <w:lvl w:ilvl="7">
+      <w:start w:val="1"/>
+      <w:numFmt w:val="decimal"/>
+      <w:lvlText w:val="%8."/>
+      <w:lvlJc w:val="left"/>
+      <w:pPr>
+        <w:tabs>
+          <w:tab w:val="num" w:pos="5760"/>
+        </w:tabs>
+        <w:ind w:left="5760" w:hanging="720"/>
+      </w:pPr>
+    </w:lvl>
+    <w:lvl w:ilvl="8">
+      <w:start w:val="1"/>
+      <w:numFmt w:val="decimal"/>
+      <w:lvlText w:val="%9."/>
+      <w:lvlJc w:val="left"/>
+      <w:pPr>
+        <w:tabs>
+          <w:tab w:val="num" w:pos="6480"/>
+        </w:tabs>
+        <w:ind w:left="6480" w:hanging="720"/>
+      </w:pPr>
+    </w:lvl>
+  </w:abstractNum>
+  <w:abstractNum w:abstractNumId="16" w15:restartNumberingAfterBreak="0">
     <w:nsid w:val="2C404A9B"/>
     <w:multiLevelType w:val="multilevel"/>
     <w:tmpl w:val="B8CE60B6"/>
@@ -7002,7 +8716,7 @@
       </w:rPr>
     </w:lvl>
   </w:abstractNum>
-  <w:abstractNum w:abstractNumId="15" w15:restartNumberingAfterBreak="0">
+  <w:abstractNum w:abstractNumId="17" w15:restartNumberingAfterBreak="0">
     <w:nsid w:val="2D2C2B30"/>
     <w:multiLevelType w:val="hybridMultilevel"/>
     <w:tmpl w:val="1DBCFB62"/>
@@ -7088,7 +8802,7 @@
       </w:pPr>
     </w:lvl>
   </w:abstractNum>
-  <w:abstractNum w:abstractNumId="16" w15:restartNumberingAfterBreak="0">
+  <w:abstractNum w:abstractNumId="18" w15:restartNumberingAfterBreak="0">
     <w:nsid w:val="323D0CA0"/>
     <w:multiLevelType w:val="multilevel"/>
     <w:tmpl w:val="7E4A6352"/>
@@ -7237,7 +8951,7 @@
       </w:rPr>
     </w:lvl>
   </w:abstractNum>
-  <w:abstractNum w:abstractNumId="17" w15:restartNumberingAfterBreak="0">
+  <w:abstractNum w:abstractNumId="19" w15:restartNumberingAfterBreak="0">
     <w:nsid w:val="324B2E5D"/>
     <w:multiLevelType w:val="multilevel"/>
     <w:tmpl w:val="7E4A6352"/>
@@ -7386,7 +9100,7 @@
       </w:rPr>
     </w:lvl>
   </w:abstractNum>
-  <w:abstractNum w:abstractNumId="18" w15:restartNumberingAfterBreak="0">
+  <w:abstractNum w:abstractNumId="20" w15:restartNumberingAfterBreak="0">
     <w:nsid w:val="39CF033A"/>
     <w:multiLevelType w:val="hybridMultilevel"/>
     <w:tmpl w:val="E012ADAA"/>
@@ -7499,7 +9213,7 @@
       </w:rPr>
     </w:lvl>
   </w:abstractNum>
-  <w:abstractNum w:abstractNumId="19" w15:restartNumberingAfterBreak="0">
+  <w:abstractNum w:abstractNumId="21" w15:restartNumberingAfterBreak="0">
     <w:nsid w:val="3A8549DF"/>
     <w:multiLevelType w:val="multilevel"/>
     <w:tmpl w:val="60F0303E"/>
@@ -7648,7 +9362,7 @@
       </w:rPr>
     </w:lvl>
   </w:abstractNum>
-  <w:abstractNum w:abstractNumId="20" w15:restartNumberingAfterBreak="0">
+  <w:abstractNum w:abstractNumId="22" w15:restartNumberingAfterBreak="0">
     <w:nsid w:val="3AFB673A"/>
     <w:multiLevelType w:val="hybridMultilevel"/>
     <w:tmpl w:val="B60ED516"/>
@@ -7760,7 +9474,7 @@
       </w:rPr>
     </w:lvl>
   </w:abstractNum>
-  <w:abstractNum w:abstractNumId="21" w15:restartNumberingAfterBreak="0">
+  <w:abstractNum w:abstractNumId="23" w15:restartNumberingAfterBreak="0">
     <w:nsid w:val="3AFD3BEC"/>
     <w:multiLevelType w:val="hybridMultilevel"/>
     <w:tmpl w:val="03E6C9DE"/>
@@ -7873,7 +9587,7 @@
       </w:rPr>
     </w:lvl>
   </w:abstractNum>
-  <w:abstractNum w:abstractNumId="22" w15:restartNumberingAfterBreak="0">
+  <w:abstractNum w:abstractNumId="24" w15:restartNumberingAfterBreak="0">
     <w:nsid w:val="44EE1DE3"/>
     <w:multiLevelType w:val="multilevel"/>
     <w:tmpl w:val="693CC074"/>
@@ -8022,7 +9736,7 @@
       </w:rPr>
     </w:lvl>
   </w:abstractNum>
-  <w:abstractNum w:abstractNumId="23" w15:restartNumberingAfterBreak="0">
+  <w:abstractNum w:abstractNumId="25" w15:restartNumberingAfterBreak="0">
     <w:nsid w:val="452D2107"/>
     <w:multiLevelType w:val="hybridMultilevel"/>
     <w:tmpl w:val="DC2872D8"/>
@@ -8134,7 +9848,7 @@
       </w:rPr>
     </w:lvl>
   </w:abstractNum>
-  <w:abstractNum w:abstractNumId="24" w15:restartNumberingAfterBreak="0">
+  <w:abstractNum w:abstractNumId="26" w15:restartNumberingAfterBreak="0">
     <w:nsid w:val="45B27887"/>
     <w:multiLevelType w:val="multilevel"/>
     <w:tmpl w:val="47C8419C"/>
@@ -8283,7 +9997,7 @@
       </w:rPr>
     </w:lvl>
   </w:abstractNum>
-  <w:abstractNum w:abstractNumId="25" w15:restartNumberingAfterBreak="0">
+  <w:abstractNum w:abstractNumId="27" w15:restartNumberingAfterBreak="0">
     <w:nsid w:val="45E10E38"/>
     <w:multiLevelType w:val="hybridMultilevel"/>
     <w:tmpl w:val="6B1EBCA0"/>
@@ -8396,7 +10110,7 @@
       </w:rPr>
     </w:lvl>
   </w:abstractNum>
-  <w:abstractNum w:abstractNumId="26" w15:restartNumberingAfterBreak="0">
+  <w:abstractNum w:abstractNumId="28" w15:restartNumberingAfterBreak="0">
     <w:nsid w:val="47055198"/>
     <w:multiLevelType w:val="hybridMultilevel"/>
     <w:tmpl w:val="0D3056CA"/>
@@ -8509,7 +10223,7 @@
       </w:rPr>
     </w:lvl>
   </w:abstractNum>
-  <w:abstractNum w:abstractNumId="27" w15:restartNumberingAfterBreak="0">
+  <w:abstractNum w:abstractNumId="29" w15:restartNumberingAfterBreak="0">
     <w:nsid w:val="48496D19"/>
     <w:multiLevelType w:val="multilevel"/>
     <w:tmpl w:val="7E4A6352"/>
@@ -8658,7 +10372,7 @@
       </w:rPr>
     </w:lvl>
   </w:abstractNum>
-  <w:abstractNum w:abstractNumId="28" w15:restartNumberingAfterBreak="0">
+  <w:abstractNum w:abstractNumId="30" w15:restartNumberingAfterBreak="0">
     <w:nsid w:val="52FD7B58"/>
     <w:multiLevelType w:val="hybridMultilevel"/>
     <w:tmpl w:val="4C1AD428"/>
@@ -8771,7 +10485,7 @@
       </w:rPr>
     </w:lvl>
   </w:abstractNum>
-  <w:abstractNum w:abstractNumId="29" w15:restartNumberingAfterBreak="0">
+  <w:abstractNum w:abstractNumId="31" w15:restartNumberingAfterBreak="0">
     <w:nsid w:val="58EB78AF"/>
     <w:multiLevelType w:val="multilevel"/>
     <w:tmpl w:val="6C045640"/>
@@ -8920,7 +10634,7 @@
       </w:rPr>
     </w:lvl>
   </w:abstractNum>
-  <w:abstractNum w:abstractNumId="30" w15:restartNumberingAfterBreak="0">
+  <w:abstractNum w:abstractNumId="32" w15:restartNumberingAfterBreak="0">
     <w:nsid w:val="5C4E7959"/>
     <w:multiLevelType w:val="multilevel"/>
     <w:tmpl w:val="32345EB2"/>
@@ -9069,7 +10783,7 @@
       </w:rPr>
     </w:lvl>
   </w:abstractNum>
-  <w:abstractNum w:abstractNumId="31" w15:restartNumberingAfterBreak="0">
+  <w:abstractNum w:abstractNumId="33" w15:restartNumberingAfterBreak="0">
     <w:nsid w:val="5EBF1786"/>
     <w:multiLevelType w:val="hybridMultilevel"/>
     <w:tmpl w:val="C8307DEA"/>
@@ -9181,7 +10895,7 @@
       </w:rPr>
     </w:lvl>
   </w:abstractNum>
-  <w:abstractNum w:abstractNumId="32" w15:restartNumberingAfterBreak="0">
+  <w:abstractNum w:abstractNumId="34" w15:restartNumberingAfterBreak="0">
     <w:nsid w:val="662A1E04"/>
     <w:multiLevelType w:val="hybridMultilevel"/>
     <w:tmpl w:val="9774DEBC"/>
@@ -9294,7 +11008,7 @@
       </w:rPr>
     </w:lvl>
   </w:abstractNum>
-  <w:abstractNum w:abstractNumId="33" w15:restartNumberingAfterBreak="0">
+  <w:abstractNum w:abstractNumId="35" w15:restartNumberingAfterBreak="0">
     <w:nsid w:val="688A54B9"/>
     <w:multiLevelType w:val="multilevel"/>
     <w:tmpl w:val="8B189CFC"/>
@@ -9416,7 +11130,7 @@
       </w:rPr>
     </w:lvl>
   </w:abstractNum>
-  <w:abstractNum w:abstractNumId="34" w15:restartNumberingAfterBreak="0">
+  <w:abstractNum w:abstractNumId="36" w15:restartNumberingAfterBreak="0">
     <w:nsid w:val="6D9B1C90"/>
     <w:multiLevelType w:val="multilevel"/>
     <w:tmpl w:val="D86069D4"/>
@@ -9565,7 +11279,7 @@
       </w:rPr>
     </w:lvl>
   </w:abstractNum>
-  <w:abstractNum w:abstractNumId="35" w15:restartNumberingAfterBreak="0">
+  <w:abstractNum w:abstractNumId="37" w15:restartNumberingAfterBreak="0">
     <w:nsid w:val="71213FB1"/>
     <w:multiLevelType w:val="multilevel"/>
     <w:tmpl w:val="7B3AC96A"/>
@@ -9714,7 +11428,7 @@
       </w:rPr>
     </w:lvl>
   </w:abstractNum>
-  <w:abstractNum w:abstractNumId="36" w15:restartNumberingAfterBreak="0">
+  <w:abstractNum w:abstractNumId="38" w15:restartNumberingAfterBreak="0">
     <w:nsid w:val="728C4210"/>
     <w:multiLevelType w:val="multilevel"/>
     <w:tmpl w:val="56E89428"/>
@@ -9863,7 +11577,7 @@
       </w:rPr>
     </w:lvl>
   </w:abstractNum>
-  <w:abstractNum w:abstractNumId="37" w15:restartNumberingAfterBreak="0">
+  <w:abstractNum w:abstractNumId="39" w15:restartNumberingAfterBreak="0">
     <w:nsid w:val="75B90A70"/>
     <w:multiLevelType w:val="multilevel"/>
     <w:tmpl w:val="5D18BA76"/>
@@ -10012,7 +11726,7 @@
       </w:rPr>
     </w:lvl>
   </w:abstractNum>
-  <w:abstractNum w:abstractNumId="38" w15:restartNumberingAfterBreak="0">
+  <w:abstractNum w:abstractNumId="40" w15:restartNumberingAfterBreak="0">
     <w:nsid w:val="779435E7"/>
     <w:multiLevelType w:val="hybridMultilevel"/>
     <w:tmpl w:val="181C6764"/>
@@ -10125,7 +11839,7 @@
       </w:rPr>
     </w:lvl>
   </w:abstractNum>
-  <w:abstractNum w:abstractNumId="39" w15:restartNumberingAfterBreak="0">
+  <w:abstractNum w:abstractNumId="41" w15:restartNumberingAfterBreak="0">
     <w:nsid w:val="7CCC6788"/>
     <w:multiLevelType w:val="multilevel"/>
     <w:tmpl w:val="40C4FC8C"/>
@@ -10274,7 +11988,7 @@
       </w:rPr>
     </w:lvl>
   </w:abstractNum>
-  <w:abstractNum w:abstractNumId="40" w15:restartNumberingAfterBreak="0">
+  <w:abstractNum w:abstractNumId="42" w15:restartNumberingAfterBreak="0">
     <w:nsid w:val="7E2E7721"/>
     <w:multiLevelType w:val="multilevel"/>
     <w:tmpl w:val="F528A5AC"/>
@@ -10424,10 +12138,10 @@
     </w:lvl>
   </w:abstractNum>
   <w:num w:numId="1" w16cid:durableId="1809780816">
-    <w:abstractNumId w:val="15"/>
+    <w:abstractNumId w:val="17"/>
   </w:num>
   <w:num w:numId="2" w16cid:durableId="284584729">
-    <w:abstractNumId w:val="33"/>
+    <w:abstractNumId w:val="35"/>
     <w:lvlOverride w:ilvl="1">
       <w:lvl w:ilvl="1">
         <w:start w:val="1"/>
@@ -10462,7 +12176,7 @@
     </w:lvlOverride>
   </w:num>
   <w:num w:numId="3" w16cid:durableId="725839449">
-    <w:abstractNumId w:val="33"/>
+    <w:abstractNumId w:val="35"/>
     <w:lvlOverride w:ilvl="0">
       <w:startOverride w:val="1"/>
     </w:lvlOverride>
@@ -10492,13 +12206,13 @@
     </w:lvlOverride>
   </w:num>
   <w:num w:numId="4" w16cid:durableId="300771649">
-    <w:abstractNumId w:val="31"/>
+    <w:abstractNumId w:val="33"/>
   </w:num>
   <w:num w:numId="5" w16cid:durableId="371852036">
-    <w:abstractNumId w:val="23"/>
+    <w:abstractNumId w:val="25"/>
   </w:num>
   <w:num w:numId="6" w16cid:durableId="815417995">
-    <w:abstractNumId w:val="33"/>
+    <w:abstractNumId w:val="35"/>
     <w:lvlOverride w:ilvl="0">
       <w:startOverride w:val="1"/>
     </w:lvlOverride>
@@ -10528,28 +12242,28 @@
     </w:lvlOverride>
   </w:num>
   <w:num w:numId="7" w16cid:durableId="718090381">
-    <w:abstractNumId w:val="33"/>
+    <w:abstractNumId w:val="35"/>
   </w:num>
   <w:num w:numId="8" w16cid:durableId="1147747865">
-    <w:abstractNumId w:val="12"/>
+    <w:abstractNumId w:val="13"/>
   </w:num>
   <w:num w:numId="9" w16cid:durableId="1751197900">
-    <w:abstractNumId w:val="33"/>
+    <w:abstractNumId w:val="35"/>
   </w:num>
   <w:num w:numId="10" w16cid:durableId="94372026">
-    <w:abstractNumId w:val="33"/>
+    <w:abstractNumId w:val="35"/>
   </w:num>
   <w:num w:numId="11" w16cid:durableId="142310025">
-    <w:abstractNumId w:val="28"/>
+    <w:abstractNumId w:val="30"/>
   </w:num>
   <w:num w:numId="12" w16cid:durableId="670106179">
-    <w:abstractNumId w:val="10"/>
+    <w:abstractNumId w:val="11"/>
   </w:num>
   <w:num w:numId="13" w16cid:durableId="390932076">
-    <w:abstractNumId w:val="20"/>
+    <w:abstractNumId w:val="22"/>
   </w:num>
   <w:num w:numId="14" w16cid:durableId="2109815121">
-    <w:abstractNumId w:val="33"/>
+    <w:abstractNumId w:val="35"/>
     <w:lvlOverride w:ilvl="0">
       <w:startOverride w:val="1"/>
       <w:lvl w:ilvl="0">
@@ -10635,109 +12349,115 @@
     </w:lvlOverride>
   </w:num>
   <w:num w:numId="15" w16cid:durableId="1965844725">
-    <w:abstractNumId w:val="32"/>
+    <w:abstractNumId w:val="34"/>
   </w:num>
   <w:num w:numId="16" w16cid:durableId="1422681268">
-    <w:abstractNumId w:val="11"/>
+    <w:abstractNumId w:val="12"/>
   </w:num>
   <w:num w:numId="17" w16cid:durableId="1721440661">
-    <w:abstractNumId w:val="22"/>
+    <w:abstractNumId w:val="24"/>
   </w:num>
   <w:num w:numId="18" w16cid:durableId="1825975087">
-    <w:abstractNumId w:val="9"/>
+    <w:abstractNumId w:val="10"/>
   </w:num>
   <w:num w:numId="19" w16cid:durableId="825511009">
-    <w:abstractNumId w:val="29"/>
+    <w:abstractNumId w:val="31"/>
   </w:num>
   <w:num w:numId="20" w16cid:durableId="113528485">
-    <w:abstractNumId w:val="39"/>
+    <w:abstractNumId w:val="41"/>
   </w:num>
   <w:num w:numId="21" w16cid:durableId="732894102">
-    <w:abstractNumId w:val="24"/>
+    <w:abstractNumId w:val="26"/>
   </w:num>
   <w:num w:numId="22" w16cid:durableId="698118865">
     <w:abstractNumId w:val="1"/>
   </w:num>
   <w:num w:numId="23" w16cid:durableId="1470318118">
-    <w:abstractNumId w:val="5"/>
+    <w:abstractNumId w:val="6"/>
   </w:num>
   <w:num w:numId="24" w16cid:durableId="879319669">
-    <w:abstractNumId w:val="30"/>
+    <w:abstractNumId w:val="32"/>
   </w:num>
   <w:num w:numId="25" w16cid:durableId="952900115">
-    <w:abstractNumId w:val="35"/>
+    <w:abstractNumId w:val="37"/>
   </w:num>
   <w:num w:numId="26" w16cid:durableId="1191256660">
+    <w:abstractNumId w:val="20"/>
+  </w:num>
+  <w:num w:numId="27" w16cid:durableId="128057820">
+    <w:abstractNumId w:val="40"/>
+  </w:num>
+  <w:num w:numId="28" w16cid:durableId="892354695">
+    <w:abstractNumId w:val="29"/>
+  </w:num>
+  <w:num w:numId="29" w16cid:durableId="118456222">
     <w:abstractNumId w:val="18"/>
   </w:num>
-  <w:num w:numId="27" w16cid:durableId="128057820">
-    <w:abstractNumId w:val="38"/>
-  </w:num>
-  <w:num w:numId="28" w16cid:durableId="892354695">
-    <w:abstractNumId w:val="27"/>
-  </w:num>
-  <w:num w:numId="29" w16cid:durableId="118456222">
-    <w:abstractNumId w:val="16"/>
-  </w:num>
   <w:num w:numId="30" w16cid:durableId="2146266367">
-    <w:abstractNumId w:val="17"/>
+    <w:abstractNumId w:val="19"/>
   </w:num>
   <w:num w:numId="31" w16cid:durableId="726760484">
     <w:abstractNumId w:val="3"/>
   </w:num>
   <w:num w:numId="32" w16cid:durableId="399014886">
-    <w:abstractNumId w:val="19"/>
+    <w:abstractNumId w:val="21"/>
   </w:num>
   <w:num w:numId="33" w16cid:durableId="512645413">
+    <w:abstractNumId w:val="38"/>
+  </w:num>
+  <w:num w:numId="34" w16cid:durableId="1188562980">
+    <w:abstractNumId w:val="16"/>
+  </w:num>
+  <w:num w:numId="35" w16cid:durableId="1075277144">
     <w:abstractNumId w:val="36"/>
   </w:num>
-  <w:num w:numId="34" w16cid:durableId="1188562980">
-    <w:abstractNumId w:val="14"/>
-  </w:num>
-  <w:num w:numId="35" w16cid:durableId="1075277144">
-    <w:abstractNumId w:val="34"/>
-  </w:num>
   <w:num w:numId="36" w16cid:durableId="848064896">
-    <w:abstractNumId w:val="7"/>
+    <w:abstractNumId w:val="8"/>
   </w:num>
   <w:num w:numId="37" w16cid:durableId="394861365">
     <w:abstractNumId w:val="0"/>
   </w:num>
   <w:num w:numId="38" w16cid:durableId="1551724567">
-    <w:abstractNumId w:val="37"/>
+    <w:abstractNumId w:val="39"/>
   </w:num>
   <w:num w:numId="39" w16cid:durableId="179392482">
     <w:abstractNumId w:val="2"/>
   </w:num>
   <w:num w:numId="40" w16cid:durableId="998193706">
-    <w:abstractNumId w:val="6"/>
+    <w:abstractNumId w:val="7"/>
   </w:num>
   <w:num w:numId="41" w16cid:durableId="1875072376">
-    <w:abstractNumId w:val="8"/>
+    <w:abstractNumId w:val="9"/>
   </w:num>
   <w:num w:numId="42" w16cid:durableId="928346210">
-    <w:abstractNumId w:val="21"/>
+    <w:abstractNumId w:val="23"/>
   </w:num>
   <w:num w:numId="43" w16cid:durableId="53823787">
-    <w:abstractNumId w:val="26"/>
+    <w:abstractNumId w:val="28"/>
   </w:num>
   <w:num w:numId="44" w16cid:durableId="318506695">
-    <w:abstractNumId w:val="13"/>
+    <w:abstractNumId w:val="14"/>
   </w:num>
   <w:num w:numId="45" w16cid:durableId="2083940327">
-    <w:abstractNumId w:val="25"/>
+    <w:abstractNumId w:val="27"/>
   </w:num>
   <w:num w:numId="46" w16cid:durableId="1349019421">
     <w:abstractNumId w:val="4"/>
   </w:num>
   <w:num w:numId="47" w16cid:durableId="434596880">
-    <w:abstractNumId w:val="40"/>
+    <w:abstractNumId w:val="42"/>
+  </w:num>
+  <w:num w:numId="48" w16cid:durableId="1736508800">
+    <w:abstractNumId w:val="5"/>
+  </w:num>
+  <w:num w:numId="49" w16cid:durableId="546912248">
+    <w:abstractNumId w:val="15"/>
   </w:num>
 </w:numbering>
 </file>
 
 <file path=word/styles.xml><?xml version="1.0" encoding="utf-8"?>
-<w:styles xmlns:mc="http://schemas.openxmlformats.org/markup-compatibility/2006" xmlns:r="http://schemas.openxmlformats.org/officeDocument/2006/relationships" xmlns:w="http://schemas.openxmlformats.org/wordprocessingml/2006/main" xmlns:w14="http://schemas.microsoft.com/office/word/2010/wordml" xmlns:w15="http://schemas.microsoft.com/office/word/2012/wordml" xmlns:w16cex="http://schemas.microsoft.com/office/word/2018/wordml/cex" xmlns:w16cid="http://schemas.microsoft.com/office/word/2016/wordml/cid" xmlns:w16="http://schemas.microsoft.com/office/word/2018/wordml" xmlns:w16sdtdh="http://schemas.microsoft.com/office/word/2020/wordml/sdtdatahash" xmlns:w16se="http://schemas.microsoft.com/office/word/2015/wordml/symex" mc:Ignorable="w14 w15 w16se w16cid w16 w16cex w16sdtdh">
+<w:styles xmlns:mc="http://schemas.openxmlformats.org/markup-compatibility/2006" xmlns:r="http://schemas.openxmlformats.org/officeDocument/2006/relationships" xmlns:w="http://schemas.openxmlformats.org/wordprocessingml/2006/main" xmlns:w14="http://schemas.microsoft.com/office/word/2010/wordml" xmlns:w15="http://schemas.microsoft.com/office/word/2012/wordml" xmlns:w16cex="http://schemas.microsoft.com/office/word/2018/wordml/cex" xmlns:w16cid="http://schemas.microsoft.com/office/word/2016/wordml/cid" xmlns:w16="http://schemas.microsoft.com/office/word/2018/wordml" xmlns:w16sdtdh="http://schemas.microsoft.com/office/word/2020/wordml/sdtdatahash" xmlns:w16sdtfl="http://schemas.microsoft.com/office/word/2024/wordml/sdtformatlock" xmlns:w16se="http://schemas.microsoft.com/office/word/2015/wordml/symex" xmlns:w16du="http://schemas.microsoft.com/office/word/2023/wordml/word16du" mc:Ignorable="w14 w15 w16se w16cid w16 w16cex w16sdtdh w16sdtfl w16du">
   <w:docDefaults>
     <w:rPrDefault>
       <w:rPr>
@@ -11248,6 +12968,7 @@
   <w:style w:type="character" w:default="1" w:styleId="DefaultParagraphFont">
     <w:name w:val="Default Paragraph Font"/>
     <w:uiPriority w:val="1"/>
+    <w:semiHidden/>
     <w:unhideWhenUsed/>
   </w:style>
   <w:style w:type="table" w:default="1" w:styleId="TableNormal">
@@ -12273,7 +13994,7 @@
 </file>
 
 <file path=word/glossary/document.xml><?xml version="1.0" encoding="utf-8"?>
-<w:glossaryDocument xmlns:wpc="http://schemas.microsoft.com/office/word/2010/wordprocessingCanvas" xmlns:cx="http://schemas.microsoft.com/office/drawing/2014/chartex" xmlns:cx1="http://schemas.microsoft.com/office/drawing/2015/9/8/chartex" xmlns:cx2="http://schemas.microsoft.com/office/drawing/2015/10/21/chartex" xmlns:cx3="http://schemas.microsoft.com/office/drawing/2016/5/9/chartex" xmlns:cx4="http://schemas.microsoft.com/office/drawing/2016/5/10/chartex" xmlns:cx5="http://schemas.microsoft.com/office/drawing/2016/5/11/chartex" xmlns:cx6="http://schemas.microsoft.com/office/drawing/2016/5/12/chartex" xmlns:cx7="http://schemas.microsoft.com/office/drawing/2016/5/13/chartex" xmlns:cx8="http://schemas.microsoft.com/office/drawing/2016/5/14/chartex" xmlns:mc="http://schemas.openxmlformats.org/markup-compatibility/2006" xmlns:aink="http://schemas.microsoft.com/office/drawing/2016/ink" xmlns:am3d="http://schemas.microsoft.com/office/drawing/2017/model3d" xmlns:o="urn:schemas-microsoft-com:office:office" xmlns:oel="http://schemas.microsoft.com/office/2019/extlst" xmlns:r="http://schemas.openxmlformats.org/officeDocument/2006/relationships" xmlns:m="http://schemas.openxmlformats.org/officeDocument/2006/math" xmlns:v="urn:schemas-microsoft-com:vml" xmlns:wp14="http://schemas.microsoft.com/office/word/2010/wordprocessingDrawing" xmlns:wp="http://schemas.openxmlformats.org/drawingml/2006/wordprocessingDrawing" xmlns:w10="urn:schemas-microsoft-com:office:word" xmlns:w="http://schemas.openxmlformats.org/wordprocessingml/2006/main" xmlns:w14="http://schemas.microsoft.com/office/word/2010/wordml" xmlns:w15="http://schemas.microsoft.com/office/word/2012/wordml" xmlns:w16cex="http://schemas.microsoft.com/office/word/2018/wordml/cex" xmlns:w16cid="http://schemas.microsoft.com/office/word/2016/wordml/cid" xmlns:w16="http://schemas.microsoft.com/office/word/2018/wordml" xmlns:w16sdtdh="http://schemas.microsoft.com/office/word/2020/wordml/sdtdatahash" xmlns:w16se="http://schemas.microsoft.com/office/word/2015/wordml/symex" xmlns:wpg="http://schemas.microsoft.com/office/word/2010/wordprocessingGroup" xmlns:wpi="http://schemas.microsoft.com/office/word/2010/wordprocessingInk" xmlns:wne="http://schemas.microsoft.com/office/word/2006/wordml" xmlns:wps="http://schemas.microsoft.com/office/word/2010/wordprocessingShape" mc:Ignorable="w14 w15 w16se w16cid w16 w16cex w16sdtdh wp14">
+<w:glossaryDocument xmlns:wpc="http://schemas.microsoft.com/office/word/2010/wordprocessingCanvas" xmlns:cx="http://schemas.microsoft.com/office/drawing/2014/chartex" xmlns:cx1="http://schemas.microsoft.com/office/drawing/2015/9/8/chartex" xmlns:cx2="http://schemas.microsoft.com/office/drawing/2015/10/21/chartex" xmlns:cx3="http://schemas.microsoft.com/office/drawing/2016/5/9/chartex" xmlns:cx4="http://schemas.microsoft.com/office/drawing/2016/5/10/chartex" xmlns:cx5="http://schemas.microsoft.com/office/drawing/2016/5/11/chartex" xmlns:cx6="http://schemas.microsoft.com/office/drawing/2016/5/12/chartex" xmlns:cx7="http://schemas.microsoft.com/office/drawing/2016/5/13/chartex" xmlns:cx8="http://schemas.microsoft.com/office/drawing/2016/5/14/chartex" xmlns:mc="http://schemas.openxmlformats.org/markup-compatibility/2006" xmlns:m="http://schemas.openxmlformats.org/officeDocument/2006/math" xmlns:aink="http://schemas.microsoft.com/office/drawing/2016/ink" xmlns:am3d="http://schemas.microsoft.com/office/drawing/2017/model3d" xmlns:oel="http://schemas.microsoft.com/office/2019/extlst" xmlns:r="http://schemas.openxmlformats.org/officeDocument/2006/relationships" xmlns:wp14="http://schemas.microsoft.com/office/word/2010/wordprocessingDrawing" xmlns:wp="http://schemas.openxmlformats.org/drawingml/2006/wordprocessingDrawing" xmlns:wpg="http://schemas.microsoft.com/office/word/2010/wordprocessingGroup" xmlns:wpi="http://schemas.microsoft.com/office/word/2010/wordprocessingInk" xmlns:wps="http://schemas.microsoft.com/office/word/2010/wordprocessingShape" xmlns:o="urn:schemas-microsoft-com:office:office" xmlns:v="urn:schemas-microsoft-com:vml" xmlns:w10="urn:schemas-microsoft-com:office:word" xmlns:w="http://schemas.openxmlformats.org/wordprocessingml/2006/main" xmlns:w14="http://schemas.microsoft.com/office/word/2010/wordml" xmlns:w15="http://schemas.microsoft.com/office/word/2012/wordml" xmlns:w16cex="http://schemas.microsoft.com/office/word/2018/wordml/cex" xmlns:w16cid="http://schemas.microsoft.com/office/word/2016/wordml/cid" xmlns:w16="http://schemas.microsoft.com/office/word/2018/wordml" xmlns:w16sdtdh="http://schemas.microsoft.com/office/word/2020/wordml/sdtdatahash" xmlns:w16sdtfl="http://schemas.microsoft.com/office/word/2024/wordml/sdtformatlock" xmlns:w16se="http://schemas.microsoft.com/office/word/2015/wordml/symex" xmlns:w16du="http://schemas.microsoft.com/office/word/2023/wordml/word16du" xmlns:wne="http://schemas.microsoft.com/office/word/2006/wordml" mc:Ignorable="w14 w15 w16se w16cid w16 w16cex w16sdtdh w16sdtfl w16du wp14">
   <w:docParts>
     <w:docPart>
       <w:docPartPr>
@@ -12371,11 +14092,11 @@
 </file>
 
 <file path=word/glossary/fontTable.xml><?xml version="1.0" encoding="utf-8"?>
-<w:fonts xmlns:mc="http://schemas.openxmlformats.org/markup-compatibility/2006" xmlns:r="http://schemas.openxmlformats.org/officeDocument/2006/relationships" xmlns:w="http://schemas.openxmlformats.org/wordprocessingml/2006/main" xmlns:w14="http://schemas.microsoft.com/office/word/2010/wordml" xmlns:w15="http://schemas.microsoft.com/office/word/2012/wordml" xmlns:w16cex="http://schemas.microsoft.com/office/word/2018/wordml/cex" xmlns:w16cid="http://schemas.microsoft.com/office/word/2016/wordml/cid" xmlns:w16="http://schemas.microsoft.com/office/word/2018/wordml" xmlns:w16sdtdh="http://schemas.microsoft.com/office/word/2020/wordml/sdtdatahash" xmlns:w16se="http://schemas.microsoft.com/office/word/2015/wordml/symex" mc:Ignorable="w14 w15 w16se w16cid w16 w16cex w16sdtdh">
+<w:fonts xmlns:mc="http://schemas.openxmlformats.org/markup-compatibility/2006" xmlns:r="http://schemas.openxmlformats.org/officeDocument/2006/relationships" xmlns:w="http://schemas.openxmlformats.org/wordprocessingml/2006/main" xmlns:w14="http://schemas.microsoft.com/office/word/2010/wordml" xmlns:w15="http://schemas.microsoft.com/office/word/2012/wordml" xmlns:w16cex="http://schemas.microsoft.com/office/word/2018/wordml/cex" xmlns:w16cid="http://schemas.microsoft.com/office/word/2016/wordml/cid" xmlns:w16="http://schemas.microsoft.com/office/word/2018/wordml" xmlns:w16sdtdh="http://schemas.microsoft.com/office/word/2020/wordml/sdtdatahash" xmlns:w16sdtfl="http://schemas.microsoft.com/office/word/2024/wordml/sdtformatlock" xmlns:w16se="http://schemas.microsoft.com/office/word/2015/wordml/symex" xmlns:w16du="http://schemas.microsoft.com/office/word/2023/wordml/word16du" mc:Ignorable="w14 w15 w16se w16cid w16 w16cex w16sdtdh w16sdtfl w16du">
   <w:font w:name="Symbol">
     <w:panose1 w:val="05050102010706020507"/>
     <w:charset w:val="02"/>
-    <w:family w:val="roman"/>
+    <w:family w:val="decorative"/>
     <w:pitch w:val="variable"/>
     <w:sig w:usb0="00000000" w:usb1="10000000" w:usb2="00000000" w:usb3="00000000" w:csb0="80000000" w:csb1="00000000"/>
   </w:font>
@@ -12395,10 +14116,10 @@
   </w:font>
   <w:font w:name="Wingdings">
     <w:panose1 w:val="05000000000000000000"/>
-    <w:charset w:val="02"/>
-    <w:family w:val="auto"/>
+    <w:charset w:val="4D"/>
+    <w:family w:val="decorative"/>
     <w:pitch w:val="variable"/>
-    <w:sig w:usb0="00000000" w:usb1="10000000" w:usb2="00000000" w:usb3="00000000" w:csb0="80000000" w:csb1="00000000"/>
+    <w:sig w:usb0="00000003" w:usb1="00000000" w:usb2="00000000" w:usb3="00000000" w:csb0="80000001" w:csb1="00000000"/>
   </w:font>
   <w:font w:name="Cambria">
     <w:panose1 w:val="02040503050406030204"/>
@@ -12415,18 +14136,16 @@
     <w:sig w:usb0="E4002EFF" w:usb1="C200247B" w:usb2="00000009" w:usb3="00000000" w:csb0="000001FF" w:csb1="00000000"/>
   </w:font>
   <w:font w:name="HGｺﾞｼｯｸM">
-    <w:panose1 w:val="00000000000000000000"/>
+    <w:panose1 w:val="020B0604020202020204"/>
     <w:charset w:val="00"/>
     <w:family w:val="roman"/>
-    <w:notTrueType/>
     <w:pitch w:val="default"/>
   </w:font>
   <w:font w:name="HGMinchoB">
     <w:altName w:val="HG明朝B"/>
-    <w:panose1 w:val="00000000000000000000"/>
+    <w:panose1 w:val="020B0604020202020204"/>
     <w:charset w:val="80"/>
     <w:family w:val="roman"/>
-    <w:notTrueType/>
     <w:pitch w:val="default"/>
   </w:font>
   <w:font w:name="Tahoma">
@@ -12441,21 +14160,24 @@
     <w:charset w:val="00"/>
     <w:family w:val="modern"/>
     <w:pitch w:val="fixed"/>
-    <w:sig w:usb0="E00006FF" w:usb1="0000FCFF" w:usb2="00000001" w:usb3="00000000" w:csb0="0000019F" w:csb1="00000000"/>
+    <w:sig w:usb0="E10006FF" w:usb1="4000FCFF" w:usb2="00000009" w:usb3="00000000" w:csb0="0000019F" w:csb1="00000000"/>
   </w:font>
   <w:font w:name="Aptos">
+    <w:panose1 w:val="020B0004020202020204"/>
     <w:charset w:val="00"/>
     <w:family w:val="swiss"/>
     <w:pitch w:val="variable"/>
     <w:sig w:usb0="20000287" w:usb1="00000003" w:usb2="00000000" w:usb3="00000000" w:csb0="0000019F" w:csb1="00000000"/>
   </w:font>
   <w:font w:name="Yu Mincho">
+    <w:panose1 w:val="02020400000000000000"/>
     <w:charset w:val="80"/>
     <w:family w:val="roman"/>
     <w:pitch w:val="variable"/>
     <w:sig w:usb0="800002E7" w:usb1="2AC7FCFF" w:usb2="00000012" w:usb3="00000000" w:csb0="0002009F" w:csb1="00000000"/>
   </w:font>
   <w:font w:name="Aptos Display">
+    <w:panose1 w:val="020B0004020202020204"/>
     <w:charset w:val="00"/>
     <w:family w:val="swiss"/>
     <w:pitch w:val="variable"/>
@@ -12472,7 +14194,7 @@
 </file>
 
 <file path=word/glossary/settings.xml><?xml version="1.0" encoding="utf-8"?>
-<w:settings xmlns:mc="http://schemas.openxmlformats.org/markup-compatibility/2006" xmlns:o="urn:schemas-microsoft-com:office:office" xmlns:r="http://schemas.openxmlformats.org/officeDocument/2006/relationships" xmlns:m="http://schemas.openxmlformats.org/officeDocument/2006/math" xmlns:v="urn:schemas-microsoft-com:vml" xmlns:w10="urn:schemas-microsoft-com:office:word" xmlns:w="http://schemas.openxmlformats.org/wordprocessingml/2006/main" xmlns:w14="http://schemas.microsoft.com/office/word/2010/wordml" xmlns:w15="http://schemas.microsoft.com/office/word/2012/wordml" xmlns:w16cex="http://schemas.microsoft.com/office/word/2018/wordml/cex" xmlns:w16cid="http://schemas.microsoft.com/office/word/2016/wordml/cid" xmlns:w16="http://schemas.microsoft.com/office/word/2018/wordml" xmlns:w16sdtdh="http://schemas.microsoft.com/office/word/2020/wordml/sdtdatahash" xmlns:w16se="http://schemas.microsoft.com/office/word/2015/wordml/symex" xmlns:sl="http://schemas.openxmlformats.org/schemaLibrary/2006/main" mc:Ignorable="w14 w15 w16se w16cid w16 w16cex w16sdtdh">
+<w:settings xmlns:mc="http://schemas.openxmlformats.org/markup-compatibility/2006" xmlns:m="http://schemas.openxmlformats.org/officeDocument/2006/math" xmlns:r="http://schemas.openxmlformats.org/officeDocument/2006/relationships" xmlns:sl="http://schemas.openxmlformats.org/schemaLibrary/2006/main" xmlns:o="urn:schemas-microsoft-com:office:office" xmlns:v="urn:schemas-microsoft-com:vml" xmlns:w10="urn:schemas-microsoft-com:office:word" xmlns:w="http://schemas.openxmlformats.org/wordprocessingml/2006/main" xmlns:w14="http://schemas.microsoft.com/office/word/2010/wordml" xmlns:w15="http://schemas.microsoft.com/office/word/2012/wordml" xmlns:w16cex="http://schemas.microsoft.com/office/word/2018/wordml/cex" xmlns:w16cid="http://schemas.microsoft.com/office/word/2016/wordml/cid" xmlns:w16="http://schemas.microsoft.com/office/word/2018/wordml" xmlns:w16sdtdh="http://schemas.microsoft.com/office/word/2020/wordml/sdtdatahash" xmlns:w16sdtfl="http://schemas.microsoft.com/office/word/2024/wordml/sdtformatlock" xmlns:w16se="http://schemas.microsoft.com/office/word/2015/wordml/symex" xmlns:w16du="http://schemas.microsoft.com/office/word/2023/wordml/word16du" mc:Ignorable="w14 w15 w16se w16cid w16 w16cex w16sdtdh w16sdtfl w16du">
   <w:view w:val="normal"/>
   <w:defaultTabStop w:val="720"/>
   <w:characterSpacingControl w:val="doNotCompress"/>
@@ -12495,6 +14217,7 @@
     <w:rsid w:val="00386242"/>
     <w:rsid w:val="003B7155"/>
     <w:rsid w:val="003D7F14"/>
+    <w:rsid w:val="00413D59"/>
     <w:rsid w:val="00427F76"/>
     <w:rsid w:val="00563128"/>
     <w:rsid w:val="006E2CD5"/>
@@ -12507,10 +14230,13 @@
     <w:rsid w:val="00AE1B17"/>
     <w:rsid w:val="00AE7445"/>
     <w:rsid w:val="00B8324E"/>
+    <w:rsid w:val="00BA1593"/>
     <w:rsid w:val="00C75739"/>
     <w:rsid w:val="00C76122"/>
     <w:rsid w:val="00D37488"/>
     <w:rsid w:val="00D53DC1"/>
+    <w:rsid w:val="00E202D4"/>
+    <w:rsid w:val="00E75B33"/>
     <w:rsid w:val="00F23CD4"/>
     <w:rsid w:val="00FF4C80"/>
   </w:rsids>
@@ -12536,7 +14262,7 @@
 </file>
 
 <file path=word/glossary/styles.xml><?xml version="1.0" encoding="utf-8"?>
-<w:styles xmlns:mc="http://schemas.openxmlformats.org/markup-compatibility/2006" xmlns:r="http://schemas.openxmlformats.org/officeDocument/2006/relationships" xmlns:w="http://schemas.openxmlformats.org/wordprocessingml/2006/main" xmlns:w14="http://schemas.microsoft.com/office/word/2010/wordml" xmlns:w15="http://schemas.microsoft.com/office/word/2012/wordml" xmlns:w16cex="http://schemas.microsoft.com/office/word/2018/wordml/cex" xmlns:w16cid="http://schemas.microsoft.com/office/word/2016/wordml/cid" xmlns:w16="http://schemas.microsoft.com/office/word/2018/wordml" xmlns:w16sdtdh="http://schemas.microsoft.com/office/word/2020/wordml/sdtdatahash" xmlns:w16se="http://schemas.microsoft.com/office/word/2015/wordml/symex" mc:Ignorable="w14 w15 w16se w16cid w16 w16cex w16sdtdh">
+<w:styles xmlns:mc="http://schemas.openxmlformats.org/markup-compatibility/2006" xmlns:r="http://schemas.openxmlformats.org/officeDocument/2006/relationships" xmlns:w="http://schemas.openxmlformats.org/wordprocessingml/2006/main" xmlns:w14="http://schemas.microsoft.com/office/word/2010/wordml" xmlns:w15="http://schemas.microsoft.com/office/word/2012/wordml" xmlns:w16cex="http://schemas.microsoft.com/office/word/2018/wordml/cex" xmlns:w16cid="http://schemas.microsoft.com/office/word/2016/wordml/cid" xmlns:w16="http://schemas.microsoft.com/office/word/2018/wordml" xmlns:w16sdtdh="http://schemas.microsoft.com/office/word/2020/wordml/sdtdatahash" xmlns:w16sdtfl="http://schemas.microsoft.com/office/word/2024/wordml/sdtformatlock" xmlns:w16se="http://schemas.microsoft.com/office/word/2015/wordml/symex" xmlns:w16du="http://schemas.microsoft.com/office/word/2023/wordml/word16du" mc:Ignorable="w14 w15 w16se w16cid w16 w16cex w16sdtdh w16sdtfl w16du">
   <w:docDefaults>
     <w:rPrDefault>
       <w:rPr>
@@ -12987,7 +14713,7 @@
 </file>
 
 <file path=word/glossary/webSettings.xml><?xml version="1.0" encoding="utf-8"?>
-<w:webSettings xmlns:mc="http://schemas.openxmlformats.org/markup-compatibility/2006" xmlns:r="http://schemas.openxmlformats.org/officeDocument/2006/relationships" xmlns:w="http://schemas.openxmlformats.org/wordprocessingml/2006/main" xmlns:w14="http://schemas.microsoft.com/office/word/2010/wordml" xmlns:w15="http://schemas.microsoft.com/office/word/2012/wordml" xmlns:w16cex="http://schemas.microsoft.com/office/word/2018/wordml/cex" xmlns:w16cid="http://schemas.microsoft.com/office/word/2016/wordml/cid" xmlns:w16="http://schemas.microsoft.com/office/word/2018/wordml" xmlns:w16sdtdh="http://schemas.microsoft.com/office/word/2020/wordml/sdtdatahash" xmlns:w16se="http://schemas.microsoft.com/office/word/2015/wordml/symex" mc:Ignorable="w14 w15 w16se w16cid w16 w16cex w16sdtdh">
+<w:webSettings xmlns:mc="http://schemas.openxmlformats.org/markup-compatibility/2006" xmlns:r="http://schemas.openxmlformats.org/officeDocument/2006/relationships" xmlns:w="http://schemas.openxmlformats.org/wordprocessingml/2006/main" xmlns:w14="http://schemas.microsoft.com/office/word/2010/wordml" xmlns:w15="http://schemas.microsoft.com/office/word/2012/wordml" xmlns:w16cex="http://schemas.microsoft.com/office/word/2018/wordml/cex" xmlns:w16cid="http://schemas.microsoft.com/office/word/2016/wordml/cid" xmlns:w16="http://schemas.microsoft.com/office/word/2018/wordml" xmlns:w16sdtdh="http://schemas.microsoft.com/office/word/2020/wordml/sdtdatahash" xmlns:w16sdtfl="http://schemas.microsoft.com/office/word/2024/wordml/sdtformatlock" xmlns:w16se="http://schemas.microsoft.com/office/word/2015/wordml/symex" xmlns:w16du="http://schemas.microsoft.com/office/word/2023/wordml/word16du" mc:Ignorable="w14 w15 w16se w16cid w16 w16cex w16sdtdh w16sdtfl w16du">
   <w:optimizeForBrowser/>
   <w:allowPNG/>
 </w:webSettings>

</xml_diff>

<commit_message>
docs(uci): move palette docs to docs repo
Use the canonical Read the Docs source instead of maintaining DOCX and generated PDF duplicates.

Docs: https://github.com/GideonZ/1541u-documentation/pull/29
</commit_message>
<xml_diff>
--- a/doc/uci_control_target.docx
+++ b/doc/uci_control_target.docx
@@ -1,6 +1,6 @@
 
 <file path=word/document.xml><?xml version="1.0" encoding="utf-8"?>
-<w:document xmlns:wpc="http://schemas.microsoft.com/office/word/2010/wordprocessingCanvas" xmlns:cx="http://schemas.microsoft.com/office/drawing/2014/chartex" xmlns:cx1="http://schemas.microsoft.com/office/drawing/2015/9/8/chartex" xmlns:cx2="http://schemas.microsoft.com/office/drawing/2015/10/21/chartex" xmlns:cx3="http://schemas.microsoft.com/office/drawing/2016/5/9/chartex" xmlns:cx4="http://schemas.microsoft.com/office/drawing/2016/5/10/chartex" xmlns:cx5="http://schemas.microsoft.com/office/drawing/2016/5/11/chartex" xmlns:cx6="http://schemas.microsoft.com/office/drawing/2016/5/12/chartex" xmlns:cx7="http://schemas.microsoft.com/office/drawing/2016/5/13/chartex" xmlns:cx8="http://schemas.microsoft.com/office/drawing/2016/5/14/chartex" xmlns:mc="http://schemas.openxmlformats.org/markup-compatibility/2006" xmlns:m="http://schemas.openxmlformats.org/officeDocument/2006/math" xmlns:aink="http://schemas.microsoft.com/office/drawing/2016/ink" xmlns:am3d="http://schemas.microsoft.com/office/drawing/2017/model3d" xmlns:oel="http://schemas.microsoft.com/office/2019/extlst" xmlns:r="http://schemas.openxmlformats.org/officeDocument/2006/relationships" xmlns:wp14="http://schemas.microsoft.com/office/word/2010/wordprocessingDrawing" xmlns:wp="http://schemas.openxmlformats.org/drawingml/2006/wordprocessingDrawing" xmlns:wpg="http://schemas.microsoft.com/office/word/2010/wordprocessingGroup" xmlns:wpi="http://schemas.microsoft.com/office/word/2010/wordprocessingInk" xmlns:wps="http://schemas.microsoft.com/office/word/2010/wordprocessingShape" xmlns:o="urn:schemas-microsoft-com:office:office" xmlns:v="urn:schemas-microsoft-com:vml" xmlns:w10="urn:schemas-microsoft-com:office:word" xmlns:w="http://schemas.openxmlformats.org/wordprocessingml/2006/main" xmlns:w14="http://schemas.microsoft.com/office/word/2010/wordml" xmlns:w15="http://schemas.microsoft.com/office/word/2012/wordml" xmlns:w16cex="http://schemas.microsoft.com/office/word/2018/wordml/cex" xmlns:w16cid="http://schemas.microsoft.com/office/word/2016/wordml/cid" xmlns:w16="http://schemas.microsoft.com/office/word/2018/wordml" xmlns:w16sdtdh="http://schemas.microsoft.com/office/word/2020/wordml/sdtdatahash" xmlns:w16sdtfl="http://schemas.microsoft.com/office/word/2024/wordml/sdtformatlock" xmlns:w16se="http://schemas.microsoft.com/office/word/2015/wordml/symex" xmlns:w16du="http://schemas.microsoft.com/office/word/2023/wordml/word16du" xmlns:wne="http://schemas.microsoft.com/office/word/2006/wordml" mc:Ignorable="w14 w15 w16se w16cid w16 w16cex w16sdtdh w16sdtfl w16du wp14">
+<w:document xmlns:wpc="http://schemas.microsoft.com/office/word/2010/wordprocessingCanvas" xmlns:cx="http://schemas.microsoft.com/office/drawing/2014/chartex" xmlns:cx1="http://schemas.microsoft.com/office/drawing/2015/9/8/chartex" xmlns:cx2="http://schemas.microsoft.com/office/drawing/2015/10/21/chartex" xmlns:cx3="http://schemas.microsoft.com/office/drawing/2016/5/9/chartex" xmlns:cx4="http://schemas.microsoft.com/office/drawing/2016/5/10/chartex" xmlns:cx5="http://schemas.microsoft.com/office/drawing/2016/5/11/chartex" xmlns:cx6="http://schemas.microsoft.com/office/drawing/2016/5/12/chartex" xmlns:cx7="http://schemas.microsoft.com/office/drawing/2016/5/13/chartex" xmlns:cx8="http://schemas.microsoft.com/office/drawing/2016/5/14/chartex" xmlns:mc="http://schemas.openxmlformats.org/markup-compatibility/2006" xmlns:aink="http://schemas.microsoft.com/office/drawing/2016/ink" xmlns:am3d="http://schemas.microsoft.com/office/drawing/2017/model3d" xmlns:o="urn:schemas-microsoft-com:office:office" xmlns:oel="http://schemas.microsoft.com/office/2019/extlst" xmlns:r="http://schemas.openxmlformats.org/officeDocument/2006/relationships" xmlns:m="http://schemas.openxmlformats.org/officeDocument/2006/math" xmlns:v="urn:schemas-microsoft-com:vml" xmlns:wp14="http://schemas.microsoft.com/office/word/2010/wordprocessingDrawing" xmlns:wp="http://schemas.openxmlformats.org/drawingml/2006/wordprocessingDrawing" xmlns:w10="urn:schemas-microsoft-com:office:word" xmlns:w="http://schemas.openxmlformats.org/wordprocessingml/2006/main" xmlns:w14="http://schemas.microsoft.com/office/word/2010/wordml" xmlns:w15="http://schemas.microsoft.com/office/word/2012/wordml" xmlns:w16cex="http://schemas.microsoft.com/office/word/2018/wordml/cex" xmlns:w16cid="http://schemas.microsoft.com/office/word/2016/wordml/cid" xmlns:w16="http://schemas.microsoft.com/office/word/2018/wordml" xmlns:w16sdtdh="http://schemas.microsoft.com/office/word/2020/wordml/sdtdatahash" xmlns:w16se="http://schemas.microsoft.com/office/word/2015/wordml/symex" xmlns:wpg="http://schemas.microsoft.com/office/word/2010/wordprocessingGroup" xmlns:wpi="http://schemas.microsoft.com/office/word/2010/wordprocessingInk" xmlns:wne="http://schemas.microsoft.com/office/word/2006/wordml" xmlns:wps="http://schemas.microsoft.com/office/word/2010/wordprocessingShape" mc:Ignorable="w14 w15 w16se w16cid w16 w16cex w16sdtdh wp14">
   <w:body>
     <w:tbl>
       <w:tblPr>
@@ -41,7 +41,6 @@
             <w:dataBinding w:prefixMappings="xmlns:ns0='http://schemas.openxmlformats.org/package/2006/metadata/core-properties' xmlns:ns1='http://purl.org/dc/elements/1.1/'" w:xpath="/ns0:coreProperties[1]/ns1:title[1]" w:storeItemID="{6C3C8BC8-F283-45AE-878A-BAB7291924A1}"/>
             <w:text/>
           </w:sdtPr>
-          <w:sdtEndPr/>
           <w:sdtContent>
             <w:tc>
               <w:tcPr>
@@ -105,7 +104,6 @@
             <w:dataBinding w:prefixMappings="xmlns:ns0='http://schemas.openxmlformats.org/package/2006/metadata/core-properties' xmlns:ns1='http://purl.org/dc/elements/1.1/'" w:xpath="/ns0:coreProperties[1]/ns1:subject[1]" w:storeItemID="{6C3C8BC8-F283-45AE-878A-BAB7291924A1}"/>
             <w:text/>
           </w:sdtPr>
-          <w:sdtEndPr/>
           <w:sdtContent>
             <w:tc>
               <w:tcPr>
@@ -168,7 +166,6 @@
                 <w:dataBinding w:prefixMappings="xmlns:ns0='http://schemas.openxmlformats.org/package/2006/metadata/core-properties' xmlns:ns1='http://purl.org/dc/elements/1.1/'" w:xpath="/ns0:coreProperties[1]/ns1:creator[1]" w:storeItemID="{6C3C8BC8-F283-45AE-878A-BAB7291924A1}"/>
                 <w:text w:multiLine="1"/>
               </w:sdtPr>
-              <w:sdtEndPr/>
               <w:sdtContent>
                 <w:r>
                   <w:rPr>
@@ -204,7 +201,6 @@
           <w:docPartUnique/>
         </w:docPartObj>
       </w:sdtPr>
-      <w:sdtEndPr/>
       <w:sdtContent>
         <w:p/>
         <w:p/>
@@ -243,11 +239,38 @@
             </w:r>
             <w:fldSimple w:instr=" DOCPROPERTY &quot;Version&quot; \* MERGEFORMAT ">
               <w:r>
-                <w:t>1.1</w:t>
+                <w:t>1.0</w:t>
               </w:r>
             </w:fldSimple>
             <w:r>
-              <w:t>, August 15, 2026</w:t>
+              <w:rPr>
+                <w:bCs/>
+              </w:rPr>
+              <w:t xml:space="preserve">, </w:t>
+            </w:r>
+            <w:r>
+              <w:t xml:space="preserve"> </w:t>
+            </w:r>
+            <w:r>
+              <w:t>March</w:t>
+            </w:r>
+            <w:r>
+              <w:t xml:space="preserve"> </w:t>
+            </w:r>
+            <w:r>
+              <w:t>1</w:t>
+            </w:r>
+            <w:r>
+              <w:t>4</w:t>
+            </w:r>
+            <w:r>
+              <w:t>,</w:t>
+            </w:r>
+            <w:r>
+              <w:t xml:space="preserve"> 20</w:t>
+            </w:r>
+            <w:r>
+              <w:t>26</w:t>
             </w:r>
           </w:p>
         </w:tc>
@@ -550,7 +573,7 @@
       <w:r>
         <w:fldChar w:fldCharType="separate"/>
       </w:r>
-      <w:hyperlink w:anchor="_Toc237717287" w:history="1">
+      <w:hyperlink w:anchor="_Toc224418803" w:history="1">
         <w:r>
           <w:rPr>
             <w:rStyle w:val="Hyperlink"/>
@@ -577,7 +600,7 @@
             <w:noProof/>
             <w:webHidden/>
           </w:rPr>
-          <w:instrText xml:space="preserve"> PAGEREF _Toc237717287 \h </w:instrText>
+          <w:instrText xml:space="preserve"> PAGEREF _Toc224418803 \h </w:instrText>
         </w:r>
         <w:r>
           <w:rPr>
@@ -623,7 +646,7 @@
           <w14:ligatures w14:val="standardContextual"/>
         </w:rPr>
       </w:pPr>
-      <w:hyperlink w:anchor="_Toc237717288" w:history="1">
+      <w:hyperlink w:anchor="_Toc224418804" w:history="1">
         <w:r>
           <w:rPr>
             <w:rStyle w:val="Hyperlink"/>
@@ -650,7 +673,7 @@
             <w:noProof/>
             <w:webHidden/>
           </w:rPr>
-          <w:instrText xml:space="preserve"> PAGEREF _Toc237717288 \h </w:instrText>
+          <w:instrText xml:space="preserve"> PAGEREF _Toc224418804 \h </w:instrText>
         </w:r>
         <w:r>
           <w:rPr>
@@ -696,7 +719,7 @@
           <w14:ligatures w14:val="standardContextual"/>
         </w:rPr>
       </w:pPr>
-      <w:hyperlink w:anchor="_Toc237717289" w:history="1">
+      <w:hyperlink w:anchor="_Toc224418805" w:history="1">
         <w:r>
           <w:rPr>
             <w:rStyle w:val="Hyperlink"/>
@@ -723,7 +746,7 @@
             <w:noProof/>
             <w:webHidden/>
           </w:rPr>
-          <w:instrText xml:space="preserve"> PAGEREF _Toc237717289 \h </w:instrText>
+          <w:instrText xml:space="preserve"> PAGEREF _Toc224418805 \h </w:instrText>
         </w:r>
         <w:r>
           <w:rPr>
@@ -766,7 +789,7 @@
           <w14:ligatures w14:val="standardContextual"/>
         </w:rPr>
       </w:pPr>
-      <w:hyperlink w:anchor="_Toc237717290" w:history="1">
+      <w:hyperlink w:anchor="_Toc224418806" w:history="1">
         <w:r>
           <w:rPr>
             <w:rStyle w:val="Hyperlink"/>
@@ -793,7 +816,7 @@
             <w:noProof/>
             <w:webHidden/>
           </w:rPr>
-          <w:instrText xml:space="preserve"> PAGEREF _Toc237717290 \h </w:instrText>
+          <w:instrText xml:space="preserve"> PAGEREF _Toc224418806 \h </w:instrText>
         </w:r>
         <w:r>
           <w:rPr>
@@ -839,7 +862,7 @@
           <w14:ligatures w14:val="standardContextual"/>
         </w:rPr>
       </w:pPr>
-      <w:hyperlink w:anchor="_Toc237717291" w:history="1">
+      <w:hyperlink w:anchor="_Toc224418807" w:history="1">
         <w:r>
           <w:rPr>
             <w:rStyle w:val="Hyperlink"/>
@@ -866,7 +889,7 @@
             <w:noProof/>
             <w:webHidden/>
           </w:rPr>
-          <w:instrText xml:space="preserve"> PAGEREF _Toc237717291 \h </w:instrText>
+          <w:instrText xml:space="preserve"> PAGEREF _Toc224418807 \h </w:instrText>
         </w:r>
         <w:r>
           <w:rPr>
@@ -912,7 +935,7 @@
           <w14:ligatures w14:val="standardContextual"/>
         </w:rPr>
       </w:pPr>
-      <w:hyperlink w:anchor="_Toc237717292" w:history="1">
+      <w:hyperlink w:anchor="_Toc224418808" w:history="1">
         <w:r>
           <w:rPr>
             <w:rStyle w:val="Hyperlink"/>
@@ -939,7 +962,7 @@
             <w:noProof/>
             <w:webHidden/>
           </w:rPr>
-          <w:instrText xml:space="preserve"> PAGEREF _Toc237717292 \h </w:instrText>
+          <w:instrText xml:space="preserve"> PAGEREF _Toc224418808 \h </w:instrText>
         </w:r>
         <w:r>
           <w:rPr>
@@ -985,7 +1008,7 @@
           <w14:ligatures w14:val="standardContextual"/>
         </w:rPr>
       </w:pPr>
-      <w:hyperlink w:anchor="_Toc237717293" w:history="1">
+      <w:hyperlink w:anchor="_Toc224418809" w:history="1">
         <w:r>
           <w:rPr>
             <w:rStyle w:val="Hyperlink"/>
@@ -1012,7 +1035,7 @@
             <w:noProof/>
             <w:webHidden/>
           </w:rPr>
-          <w:instrText xml:space="preserve"> PAGEREF _Toc237717293 \h </w:instrText>
+          <w:instrText xml:space="preserve"> PAGEREF _Toc224418809 \h </w:instrText>
         </w:r>
         <w:r>
           <w:rPr>
@@ -1058,7 +1081,7 @@
           <w14:ligatures w14:val="standardContextual"/>
         </w:rPr>
       </w:pPr>
-      <w:hyperlink w:anchor="_Toc237717294" w:history="1">
+      <w:hyperlink w:anchor="_Toc224418810" w:history="1">
         <w:r>
           <w:rPr>
             <w:rStyle w:val="Hyperlink"/>
@@ -1085,7 +1108,7 @@
             <w:noProof/>
             <w:webHidden/>
           </w:rPr>
-          <w:instrText xml:space="preserve"> PAGEREF _Toc237717294 \h </w:instrText>
+          <w:instrText xml:space="preserve"> PAGEREF _Toc224418810 \h </w:instrText>
         </w:r>
         <w:r>
           <w:rPr>
@@ -1131,7 +1154,7 @@
           <w14:ligatures w14:val="standardContextual"/>
         </w:rPr>
       </w:pPr>
-      <w:hyperlink w:anchor="_Toc237717295" w:history="1">
+      <w:hyperlink w:anchor="_Toc224418811" w:history="1">
         <w:r>
           <w:rPr>
             <w:rStyle w:val="Hyperlink"/>
@@ -1158,7 +1181,7 @@
             <w:noProof/>
             <w:webHidden/>
           </w:rPr>
-          <w:instrText xml:space="preserve"> PAGEREF _Toc237717295 \h </w:instrText>
+          <w:instrText xml:space="preserve"> PAGEREF _Toc224418811 \h </w:instrText>
         </w:r>
         <w:r>
           <w:rPr>
@@ -1204,7 +1227,7 @@
           <w14:ligatures w14:val="standardContextual"/>
         </w:rPr>
       </w:pPr>
-      <w:hyperlink w:anchor="_Toc237717296" w:history="1">
+      <w:hyperlink w:anchor="_Toc224418812" w:history="1">
         <w:r>
           <w:rPr>
             <w:rStyle w:val="Hyperlink"/>
@@ -1231,7 +1254,7 @@
             <w:noProof/>
             <w:webHidden/>
           </w:rPr>
-          <w:instrText xml:space="preserve"> PAGEREF _Toc237717296 \h </w:instrText>
+          <w:instrText xml:space="preserve"> PAGEREF _Toc224418812 \h </w:instrText>
         </w:r>
         <w:r>
           <w:rPr>
@@ -1277,7 +1300,7 @@
           <w14:ligatures w14:val="standardContextual"/>
         </w:rPr>
       </w:pPr>
-      <w:hyperlink w:anchor="_Toc237717297" w:history="1">
+      <w:hyperlink w:anchor="_Toc224418813" w:history="1">
         <w:r>
           <w:rPr>
             <w:rStyle w:val="Hyperlink"/>
@@ -1304,7 +1327,7 @@
             <w:noProof/>
             <w:webHidden/>
           </w:rPr>
-          <w:instrText xml:space="preserve"> PAGEREF _Toc237717297 \h </w:instrText>
+          <w:instrText xml:space="preserve"> PAGEREF _Toc224418813 \h </w:instrText>
         </w:r>
         <w:r>
           <w:rPr>
@@ -1350,7 +1373,7 @@
           <w14:ligatures w14:val="standardContextual"/>
         </w:rPr>
       </w:pPr>
-      <w:hyperlink w:anchor="_Toc237717298" w:history="1">
+      <w:hyperlink w:anchor="_Toc224418814" w:history="1">
         <w:r>
           <w:rPr>
             <w:rStyle w:val="Hyperlink"/>
@@ -1377,7 +1400,7 @@
             <w:noProof/>
             <w:webHidden/>
           </w:rPr>
-          <w:instrText xml:space="preserve"> PAGEREF _Toc237717298 \h </w:instrText>
+          <w:instrText xml:space="preserve"> PAGEREF _Toc224418814 \h </w:instrText>
         </w:r>
         <w:r>
           <w:rPr>
@@ -1423,7 +1446,7 @@
           <w14:ligatures w14:val="standardContextual"/>
         </w:rPr>
       </w:pPr>
-      <w:hyperlink w:anchor="_Toc237717299" w:history="1">
+      <w:hyperlink w:anchor="_Toc224418815" w:history="1">
         <w:r>
           <w:rPr>
             <w:rStyle w:val="Hyperlink"/>
@@ -1450,7 +1473,7 @@
             <w:noProof/>
             <w:webHidden/>
           </w:rPr>
-          <w:instrText xml:space="preserve"> PAGEREF _Toc237717299 \h </w:instrText>
+          <w:instrText xml:space="preserve"> PAGEREF _Toc224418815 \h </w:instrText>
         </w:r>
         <w:r>
           <w:rPr>
@@ -1496,7 +1519,7 @@
           <w14:ligatures w14:val="standardContextual"/>
         </w:rPr>
       </w:pPr>
-      <w:hyperlink w:anchor="_Toc237717300" w:history="1">
+      <w:hyperlink w:anchor="_Toc224418816" w:history="1">
         <w:r>
           <w:rPr>
             <w:rStyle w:val="Hyperlink"/>
@@ -1523,7 +1546,7 @@
             <w:noProof/>
             <w:webHidden/>
           </w:rPr>
-          <w:instrText xml:space="preserve"> PAGEREF _Toc237717300 \h </w:instrText>
+          <w:instrText xml:space="preserve"> PAGEREF _Toc224418816 \h </w:instrText>
         </w:r>
         <w:r>
           <w:rPr>
@@ -1569,7 +1592,7 @@
           <w14:ligatures w14:val="standardContextual"/>
         </w:rPr>
       </w:pPr>
-      <w:hyperlink w:anchor="_Toc237717301" w:history="1">
+      <w:hyperlink w:anchor="_Toc224418817" w:history="1">
         <w:r>
           <w:rPr>
             <w:rStyle w:val="Hyperlink"/>
@@ -1596,7 +1619,7 @@
             <w:noProof/>
             <w:webHidden/>
           </w:rPr>
-          <w:instrText xml:space="preserve"> PAGEREF _Toc237717301 \h </w:instrText>
+          <w:instrText xml:space="preserve"> PAGEREF _Toc224418817 \h </w:instrText>
         </w:r>
         <w:r>
           <w:rPr>
@@ -1642,7 +1665,7 @@
           <w14:ligatures w14:val="standardContextual"/>
         </w:rPr>
       </w:pPr>
-      <w:hyperlink w:anchor="_Toc237717302" w:history="1">
+      <w:hyperlink w:anchor="_Toc224418818" w:history="1">
         <w:r>
           <w:rPr>
             <w:rStyle w:val="Hyperlink"/>
@@ -1669,7 +1692,7 @@
             <w:noProof/>
             <w:webHidden/>
           </w:rPr>
-          <w:instrText xml:space="preserve"> PAGEREF _Toc237717302 \h </w:instrText>
+          <w:instrText xml:space="preserve"> PAGEREF _Toc224418818 \h </w:instrText>
         </w:r>
         <w:r>
           <w:rPr>
@@ -1715,7 +1738,7 @@
           <w14:ligatures w14:val="standardContextual"/>
         </w:rPr>
       </w:pPr>
-      <w:hyperlink w:anchor="_Toc237717303" w:history="1">
+      <w:hyperlink w:anchor="_Toc224418819" w:history="1">
         <w:r>
           <w:rPr>
             <w:rStyle w:val="Hyperlink"/>
@@ -1742,7 +1765,7 @@
             <w:noProof/>
             <w:webHidden/>
           </w:rPr>
-          <w:instrText xml:space="preserve"> PAGEREF _Toc237717303 \h </w:instrText>
+          <w:instrText xml:space="preserve"> PAGEREF _Toc224418819 \h </w:instrText>
         </w:r>
         <w:r>
           <w:rPr>
@@ -1788,7 +1811,7 @@
           <w14:ligatures w14:val="standardContextual"/>
         </w:rPr>
       </w:pPr>
-      <w:hyperlink w:anchor="_Toc237717304" w:history="1">
+      <w:hyperlink w:anchor="_Toc224418820" w:history="1">
         <w:r>
           <w:rPr>
             <w:rStyle w:val="Hyperlink"/>
@@ -1815,7 +1838,7 @@
             <w:noProof/>
             <w:webHidden/>
           </w:rPr>
-          <w:instrText xml:space="preserve"> PAGEREF _Toc237717304 \h </w:instrText>
+          <w:instrText xml:space="preserve"> PAGEREF _Toc224418820 \h </w:instrText>
         </w:r>
         <w:r>
           <w:rPr>
@@ -1861,7 +1884,7 @@
           <w14:ligatures w14:val="standardContextual"/>
         </w:rPr>
       </w:pPr>
-      <w:hyperlink w:anchor="_Toc237717305" w:history="1">
+      <w:hyperlink w:anchor="_Toc224418821" w:history="1">
         <w:r>
           <w:rPr>
             <w:rStyle w:val="Hyperlink"/>
@@ -1888,7 +1911,7 @@
             <w:noProof/>
             <w:webHidden/>
           </w:rPr>
-          <w:instrText xml:space="preserve"> PAGEREF _Toc237717305 \h </w:instrText>
+          <w:instrText xml:space="preserve"> PAGEREF _Toc224418821 \h </w:instrText>
         </w:r>
         <w:r>
           <w:rPr>
@@ -1934,7 +1957,7 @@
           <w14:ligatures w14:val="standardContextual"/>
         </w:rPr>
       </w:pPr>
-      <w:hyperlink w:anchor="_Toc237717306" w:history="1">
+      <w:hyperlink w:anchor="_Toc224418822" w:history="1">
         <w:r>
           <w:rPr>
             <w:rStyle w:val="Hyperlink"/>
@@ -1961,7 +1984,7 @@
             <w:noProof/>
             <w:webHidden/>
           </w:rPr>
-          <w:instrText xml:space="preserve"> PAGEREF _Toc237717306 \h </w:instrText>
+          <w:instrText xml:space="preserve"> PAGEREF _Toc224418822 \h </w:instrText>
         </w:r>
         <w:r>
           <w:rPr>
@@ -2007,7 +2030,7 @@
           <w14:ligatures w14:val="standardContextual"/>
         </w:rPr>
       </w:pPr>
-      <w:hyperlink w:anchor="_Toc237717307" w:history="1">
+      <w:hyperlink w:anchor="_Toc224418823" w:history="1">
         <w:r>
           <w:rPr>
             <w:rStyle w:val="Hyperlink"/>
@@ -2034,7 +2057,7 @@
             <w:noProof/>
             <w:webHidden/>
           </w:rPr>
-          <w:instrText xml:space="preserve"> PAGEREF _Toc237717307 \h </w:instrText>
+          <w:instrText xml:space="preserve"> PAGEREF _Toc224418823 \h </w:instrText>
         </w:r>
         <w:r>
           <w:rPr>
@@ -2066,660 +2089,6 @@
       </w:hyperlink>
     </w:p>
     <w:p>
-      <w:pPr>
-        <w:pStyle w:val="TOC2"/>
-        <w:tabs>
-          <w:tab w:val="right" w:leader="dot" w:pos="9629"/>
-        </w:tabs>
-        <w:rPr>
-          <w:rFonts w:eastAsiaTheme="minorEastAsia"/>
-          <w:noProof/>
-          <w:kern w:val="2"/>
-          <w:sz w:val="24"/>
-          <w:szCs w:val="24"/>
-          <w14:ligatures w14:val="standardContextual"/>
-        </w:rPr>
-      </w:pPr>
-      <w:hyperlink w:anchor="_Toc237717308" w:history="1">
-        <w:r>
-          <w:rPr>
-            <w:rStyle w:val="Hyperlink"/>
-            <w:noProof/>
-          </w:rPr>
-          <w:t>2.18. CTRL_CMD_GET_PALETTE (0x51)</w:t>
-        </w:r>
-        <w:r>
-          <w:rPr>
-            <w:noProof/>
-            <w:webHidden/>
-          </w:rPr>
-          <w:tab/>
-        </w:r>
-        <w:r>
-          <w:rPr>
-            <w:noProof/>
-            <w:webHidden/>
-          </w:rPr>
-          <w:fldChar w:fldCharType="begin"/>
-        </w:r>
-        <w:r>
-          <w:rPr>
-            <w:noProof/>
-            <w:webHidden/>
-          </w:rPr>
-          <w:instrText xml:space="preserve"> PAGEREF _Toc237717308 \h </w:instrText>
-        </w:r>
-        <w:r>
-          <w:rPr>
-            <w:noProof/>
-            <w:webHidden/>
-          </w:rPr>
-        </w:r>
-        <w:r>
-          <w:rPr>
-            <w:noProof/>
-            <w:webHidden/>
-          </w:rPr>
-          <w:fldChar w:fldCharType="separate"/>
-        </w:r>
-        <w:r>
-          <w:rPr>
-            <w:noProof/>
-            <w:webHidden/>
-          </w:rPr>
-          <w:t>8</w:t>
-        </w:r>
-        <w:r>
-          <w:rPr>
-            <w:noProof/>
-            <w:webHidden/>
-          </w:rPr>
-          <w:fldChar w:fldCharType="end"/>
-        </w:r>
-      </w:hyperlink>
-    </w:p>
-    <w:p>
-      <w:pPr>
-        <w:pStyle w:val="TOC2"/>
-        <w:tabs>
-          <w:tab w:val="right" w:leader="dot" w:pos="9629"/>
-        </w:tabs>
-        <w:rPr>
-          <w:rFonts w:eastAsiaTheme="minorEastAsia"/>
-          <w:noProof/>
-          <w:kern w:val="2"/>
-          <w:sz w:val="24"/>
-          <w:szCs w:val="24"/>
-          <w14:ligatures w14:val="standardContextual"/>
-        </w:rPr>
-      </w:pPr>
-      <w:hyperlink w:anchor="_Toc237717309" w:history="1">
-        <w:r>
-          <w:rPr>
-            <w:rStyle w:val="Hyperlink"/>
-            <w:noProof/>
-          </w:rPr>
-          <w:t>2.19. CTRL_CMD_SET_PALETTE (0x52)</w:t>
-        </w:r>
-        <w:r>
-          <w:rPr>
-            <w:noProof/>
-            <w:webHidden/>
-          </w:rPr>
-          <w:tab/>
-        </w:r>
-        <w:r>
-          <w:rPr>
-            <w:noProof/>
-            <w:webHidden/>
-          </w:rPr>
-          <w:fldChar w:fldCharType="begin"/>
-        </w:r>
-        <w:r>
-          <w:rPr>
-            <w:noProof/>
-            <w:webHidden/>
-          </w:rPr>
-          <w:instrText xml:space="preserve"> PAGEREF _Toc237717309 \h </w:instrText>
-        </w:r>
-        <w:r>
-          <w:rPr>
-            <w:noProof/>
-            <w:webHidden/>
-          </w:rPr>
-        </w:r>
-        <w:r>
-          <w:rPr>
-            <w:noProof/>
-            <w:webHidden/>
-          </w:rPr>
-          <w:fldChar w:fldCharType="separate"/>
-        </w:r>
-        <w:r>
-          <w:rPr>
-            <w:noProof/>
-            <w:webHidden/>
-          </w:rPr>
-          <w:t>8</w:t>
-        </w:r>
-        <w:r>
-          <w:rPr>
-            <w:noProof/>
-            <w:webHidden/>
-          </w:rPr>
-          <w:fldChar w:fldCharType="end"/>
-        </w:r>
-      </w:hyperlink>
-    </w:p>
-    <w:p>
-      <w:pPr>
-        <w:pStyle w:val="TOC2"/>
-        <w:tabs>
-          <w:tab w:val="right" w:leader="dot" w:pos="9629"/>
-        </w:tabs>
-        <w:rPr>
-          <w:rFonts w:eastAsiaTheme="minorEastAsia"/>
-          <w:noProof/>
-          <w:kern w:val="2"/>
-          <w:sz w:val="24"/>
-          <w:szCs w:val="24"/>
-          <w14:ligatures w14:val="standardContextual"/>
-        </w:rPr>
-      </w:pPr>
-      <w:hyperlink w:anchor="_Toc237717310" w:history="1">
-        <w:r>
-          <w:rPr>
-            <w:rStyle w:val="Hyperlink"/>
-            <w:noProof/>
-          </w:rPr>
-          <w:t>2.20. CTRL_CMD_SET_PALETTE_COLOR (0x53)</w:t>
-        </w:r>
-        <w:r>
-          <w:rPr>
-            <w:noProof/>
-            <w:webHidden/>
-          </w:rPr>
-          <w:tab/>
-        </w:r>
-        <w:r>
-          <w:rPr>
-            <w:noProof/>
-            <w:webHidden/>
-          </w:rPr>
-          <w:fldChar w:fldCharType="begin"/>
-        </w:r>
-        <w:r>
-          <w:rPr>
-            <w:noProof/>
-            <w:webHidden/>
-          </w:rPr>
-          <w:instrText xml:space="preserve"> PAGEREF _Toc237717310 \h </w:instrText>
-        </w:r>
-        <w:r>
-          <w:rPr>
-            <w:noProof/>
-            <w:webHidden/>
-          </w:rPr>
-        </w:r>
-        <w:r>
-          <w:rPr>
-            <w:noProof/>
-            <w:webHidden/>
-          </w:rPr>
-          <w:fldChar w:fldCharType="separate"/>
-        </w:r>
-        <w:r>
-          <w:rPr>
-            <w:noProof/>
-            <w:webHidden/>
-          </w:rPr>
-          <w:t>9</w:t>
-        </w:r>
-        <w:r>
-          <w:rPr>
-            <w:noProof/>
-            <w:webHidden/>
-          </w:rPr>
-          <w:fldChar w:fldCharType="end"/>
-        </w:r>
-      </w:hyperlink>
-    </w:p>
-    <w:p>
-      <w:pPr>
-        <w:pStyle w:val="TOC2"/>
-        <w:tabs>
-          <w:tab w:val="right" w:leader="dot" w:pos="9629"/>
-        </w:tabs>
-        <w:rPr>
-          <w:rFonts w:eastAsiaTheme="minorEastAsia"/>
-          <w:noProof/>
-          <w:kern w:val="2"/>
-          <w:sz w:val="24"/>
-          <w:szCs w:val="24"/>
-          <w14:ligatures w14:val="standardContextual"/>
-        </w:rPr>
-      </w:pPr>
-      <w:hyperlink w:anchor="_Toc237717311" w:history="1">
-        <w:r>
-          <w:rPr>
-            <w:rStyle w:val="Hyperlink"/>
-            <w:noProof/>
-          </w:rPr>
-          <w:t>2.21. CTRL_CMD_RESET_PALETTE (0x54)</w:t>
-        </w:r>
-        <w:r>
-          <w:rPr>
-            <w:noProof/>
-            <w:webHidden/>
-          </w:rPr>
-          <w:tab/>
-        </w:r>
-        <w:r>
-          <w:rPr>
-            <w:noProof/>
-            <w:webHidden/>
-          </w:rPr>
-          <w:fldChar w:fldCharType="begin"/>
-        </w:r>
-        <w:r>
-          <w:rPr>
-            <w:noProof/>
-            <w:webHidden/>
-          </w:rPr>
-          <w:instrText xml:space="preserve"> PAGEREF _Toc237717311 \h </w:instrText>
-        </w:r>
-        <w:r>
-          <w:rPr>
-            <w:noProof/>
-            <w:webHidden/>
-          </w:rPr>
-        </w:r>
-        <w:r>
-          <w:rPr>
-            <w:noProof/>
-            <w:webHidden/>
-          </w:rPr>
-          <w:fldChar w:fldCharType="separate"/>
-        </w:r>
-        <w:r>
-          <w:rPr>
-            <w:noProof/>
-            <w:webHidden/>
-          </w:rPr>
-          <w:t>9</w:t>
-        </w:r>
-        <w:r>
-          <w:rPr>
-            <w:noProof/>
-            <w:webHidden/>
-          </w:rPr>
-          <w:fldChar w:fldCharType="end"/>
-        </w:r>
-      </w:hyperlink>
-    </w:p>
-    <w:p>
-      <w:pPr>
-        <w:pStyle w:val="TOC2"/>
-        <w:tabs>
-          <w:tab w:val="right" w:leader="dot" w:pos="9629"/>
-        </w:tabs>
-        <w:rPr>
-          <w:rFonts w:eastAsiaTheme="minorEastAsia"/>
-          <w:noProof/>
-          <w:kern w:val="2"/>
-          <w:sz w:val="24"/>
-          <w:szCs w:val="24"/>
-          <w14:ligatures w14:val="standardContextual"/>
-        </w:rPr>
-      </w:pPr>
-      <w:hyperlink w:anchor="_Toc237717312" w:history="1">
-        <w:r>
-          <w:rPr>
-            <w:rStyle w:val="Hyperlink"/>
-            <w:noProof/>
-          </w:rPr>
-          <w:t>2.22. Runtime and VPL file behavior</w:t>
-        </w:r>
-        <w:r>
-          <w:rPr>
-            <w:noProof/>
-            <w:webHidden/>
-          </w:rPr>
-          <w:tab/>
-        </w:r>
-        <w:r>
-          <w:rPr>
-            <w:noProof/>
-            <w:webHidden/>
-          </w:rPr>
-          <w:fldChar w:fldCharType="begin"/>
-        </w:r>
-        <w:r>
-          <w:rPr>
-            <w:noProof/>
-            <w:webHidden/>
-          </w:rPr>
-          <w:instrText xml:space="preserve"> PAGEREF _Toc237717312 \h </w:instrText>
-        </w:r>
-        <w:r>
-          <w:rPr>
-            <w:noProof/>
-            <w:webHidden/>
-          </w:rPr>
-        </w:r>
-        <w:r>
-          <w:rPr>
-            <w:noProof/>
-            <w:webHidden/>
-          </w:rPr>
-          <w:fldChar w:fldCharType="separate"/>
-        </w:r>
-        <w:r>
-          <w:rPr>
-            <w:noProof/>
-            <w:webHidden/>
-          </w:rPr>
-          <w:t>9</w:t>
-        </w:r>
-        <w:r>
-          <w:rPr>
-            <w:noProof/>
-            <w:webHidden/>
-          </w:rPr>
-          <w:fldChar w:fldCharType="end"/>
-        </w:r>
-      </w:hyperlink>
-    </w:p>
-    <w:p>
-      <w:pPr>
-        <w:pStyle w:val="TOC1"/>
-        <w:rPr>
-          <w:rFonts w:eastAsiaTheme="minorEastAsia"/>
-          <w:b w:val="0"/>
-          <w:noProof/>
-          <w:kern w:val="2"/>
-          <w:szCs w:val="24"/>
-          <w14:ligatures w14:val="standardContextual"/>
-        </w:rPr>
-      </w:pPr>
-      <w:hyperlink w:anchor="_Toc237717313" w:history="1">
-        <w:r>
-          <w:rPr>
-            <w:rStyle w:val="Hyperlink"/>
-            <w:noProof/>
-          </w:rPr>
-          <w:t>3. Palette programming examples</w:t>
-        </w:r>
-        <w:r>
-          <w:rPr>
-            <w:noProof/>
-            <w:webHidden/>
-          </w:rPr>
-          <w:tab/>
-        </w:r>
-        <w:r>
-          <w:rPr>
-            <w:noProof/>
-            <w:webHidden/>
-          </w:rPr>
-          <w:fldChar w:fldCharType="begin"/>
-        </w:r>
-        <w:r>
-          <w:rPr>
-            <w:noProof/>
-            <w:webHidden/>
-          </w:rPr>
-          <w:instrText xml:space="preserve"> PAGEREF _Toc237717313 \h </w:instrText>
-        </w:r>
-        <w:r>
-          <w:rPr>
-            <w:noProof/>
-            <w:webHidden/>
-          </w:rPr>
-        </w:r>
-        <w:r>
-          <w:rPr>
-            <w:noProof/>
-            <w:webHidden/>
-          </w:rPr>
-          <w:fldChar w:fldCharType="separate"/>
-        </w:r>
-        <w:r>
-          <w:rPr>
-            <w:noProof/>
-            <w:webHidden/>
-          </w:rPr>
-          <w:t>11</w:t>
-        </w:r>
-        <w:r>
-          <w:rPr>
-            <w:noProof/>
-            <w:webHidden/>
-          </w:rPr>
-          <w:fldChar w:fldCharType="end"/>
-        </w:r>
-      </w:hyperlink>
-    </w:p>
-    <w:p>
-      <w:pPr>
-        <w:pStyle w:val="TOC2"/>
-        <w:tabs>
-          <w:tab w:val="right" w:leader="dot" w:pos="9629"/>
-        </w:tabs>
-        <w:rPr>
-          <w:rFonts w:eastAsiaTheme="minorEastAsia"/>
-          <w:noProof/>
-          <w:kern w:val="2"/>
-          <w:sz w:val="24"/>
-          <w:szCs w:val="24"/>
-          <w14:ligatures w14:val="standardContextual"/>
-        </w:rPr>
-      </w:pPr>
-      <w:hyperlink w:anchor="_Toc237717314" w:history="1">
-        <w:r>
-          <w:rPr>
-            <w:rStyle w:val="Hyperlink"/>
-            <w:noProof/>
-          </w:rPr>
-          <w:t>3.1. 6502 assembly: set one color, then reset</w:t>
-        </w:r>
-        <w:r>
-          <w:rPr>
-            <w:noProof/>
-            <w:webHidden/>
-          </w:rPr>
-          <w:tab/>
-        </w:r>
-        <w:r>
-          <w:rPr>
-            <w:noProof/>
-            <w:webHidden/>
-          </w:rPr>
-          <w:fldChar w:fldCharType="begin"/>
-        </w:r>
-        <w:r>
-          <w:rPr>
-            <w:noProof/>
-            <w:webHidden/>
-          </w:rPr>
-          <w:instrText xml:space="preserve"> PAGEREF _Toc237717314 \h </w:instrText>
-        </w:r>
-        <w:r>
-          <w:rPr>
-            <w:noProof/>
-            <w:webHidden/>
-          </w:rPr>
-        </w:r>
-        <w:r>
-          <w:rPr>
-            <w:noProof/>
-            <w:webHidden/>
-          </w:rPr>
-          <w:fldChar w:fldCharType="separate"/>
-        </w:r>
-        <w:r>
-          <w:rPr>
-            <w:noProof/>
-            <w:webHidden/>
-          </w:rPr>
-          <w:t>11</w:t>
-        </w:r>
-        <w:r>
-          <w:rPr>
-            <w:noProof/>
-            <w:webHidden/>
-          </w:rPr>
-          <w:fldChar w:fldCharType="end"/>
-        </w:r>
-      </w:hyperlink>
-    </w:p>
-    <w:p>
-      <w:pPr>
-        <w:pStyle w:val="TOC2"/>
-        <w:tabs>
-          <w:tab w:val="right" w:leader="dot" w:pos="9629"/>
-        </w:tabs>
-        <w:rPr>
-          <w:rFonts w:eastAsiaTheme="minorEastAsia"/>
-          <w:noProof/>
-          <w:kern w:val="2"/>
-          <w:sz w:val="24"/>
-          <w:szCs w:val="24"/>
-          <w14:ligatures w14:val="standardContextual"/>
-        </w:rPr>
-      </w:pPr>
-      <w:hyperlink w:anchor="_Toc237717315" w:history="1">
-        <w:r>
-          <w:rPr>
-            <w:rStyle w:val="Hyperlink"/>
-            <w:noProof/>
-          </w:rPr>
-          <w:t>3.2. 6502 assembly: read all 16 colors</w:t>
-        </w:r>
-        <w:r>
-          <w:rPr>
-            <w:noProof/>
-            <w:webHidden/>
-          </w:rPr>
-          <w:tab/>
-        </w:r>
-        <w:r>
-          <w:rPr>
-            <w:noProof/>
-            <w:webHidden/>
-          </w:rPr>
-          <w:fldChar w:fldCharType="begin"/>
-        </w:r>
-        <w:r>
-          <w:rPr>
-            <w:noProof/>
-            <w:webHidden/>
-          </w:rPr>
-          <w:instrText xml:space="preserve"> PAGEREF _Toc237717315 \h </w:instrText>
-        </w:r>
-        <w:r>
-          <w:rPr>
-            <w:noProof/>
-            <w:webHidden/>
-          </w:rPr>
-        </w:r>
-        <w:r>
-          <w:rPr>
-            <w:noProof/>
-            <w:webHidden/>
-          </w:rPr>
-          <w:fldChar w:fldCharType="separate"/>
-        </w:r>
-        <w:r>
-          <w:rPr>
-            <w:noProof/>
-            <w:webHidden/>
-          </w:rPr>
-          <w:t>12</w:t>
-        </w:r>
-        <w:r>
-          <w:rPr>
-            <w:noProof/>
-            <w:webHidden/>
-          </w:rPr>
-          <w:fldChar w:fldCharType="end"/>
-        </w:r>
-      </w:hyperlink>
-    </w:p>
-    <w:p>
-      <w:pPr>
-        <w:pStyle w:val="TOC2"/>
-        <w:tabs>
-          <w:tab w:val="right" w:leader="dot" w:pos="9629"/>
-        </w:tabs>
-        <w:rPr>
-          <w:rFonts w:eastAsiaTheme="minorEastAsia"/>
-          <w:noProof/>
-          <w:kern w:val="2"/>
-          <w:sz w:val="24"/>
-          <w:szCs w:val="24"/>
-          <w14:ligatures w14:val="standardContextual"/>
-        </w:rPr>
-      </w:pPr>
-      <w:hyperlink w:anchor="_Toc237717316" w:history="1">
-        <w:r>
-          <w:rPr>
-            <w:rStyle w:val="Hyperlink"/>
-            <w:noProof/>
-          </w:rPr>
-          <w:t>3.3. Commodore BASIC V2: set one color, then reset</w:t>
-        </w:r>
-        <w:r>
-          <w:rPr>
-            <w:noProof/>
-            <w:webHidden/>
-          </w:rPr>
-          <w:tab/>
-        </w:r>
-        <w:r>
-          <w:rPr>
-            <w:noProof/>
-            <w:webHidden/>
-          </w:rPr>
-          <w:fldChar w:fldCharType="begin"/>
-        </w:r>
-        <w:r>
-          <w:rPr>
-            <w:noProof/>
-            <w:webHidden/>
-          </w:rPr>
-          <w:instrText xml:space="preserve"> PAGEREF _Toc237717316 \h </w:instrText>
-        </w:r>
-        <w:r>
-          <w:rPr>
-            <w:noProof/>
-            <w:webHidden/>
-          </w:rPr>
-        </w:r>
-        <w:r>
-          <w:rPr>
-            <w:noProof/>
-            <w:webHidden/>
-          </w:rPr>
-          <w:fldChar w:fldCharType="separate"/>
-        </w:r>
-        <w:r>
-          <w:rPr>
-            <w:noProof/>
-            <w:webHidden/>
-          </w:rPr>
-          <w:t>13</w:t>
-        </w:r>
-        <w:r>
-          <w:rPr>
-            <w:noProof/>
-            <w:webHidden/>
-          </w:rPr>
-          <w:fldChar w:fldCharType="end"/>
-        </w:r>
-      </w:hyperlink>
-    </w:p>
-    <w:p>
       <w:r>
         <w:fldChar w:fldCharType="end"/>
       </w:r>
@@ -2728,7 +2097,7 @@
       <w:pPr>
         <w:pStyle w:val="Heading1"/>
       </w:pPr>
-      <w:bookmarkStart w:id="0" w:name="_Toc237717287"/>
+      <w:bookmarkStart w:id="0" w:name="_Toc224418803"/>
       <w:r>
         <w:lastRenderedPageBreak/>
         <w:t>Introduction</w:t>
@@ -2739,7 +2108,7 @@
       <w:pPr>
         <w:pStyle w:val="Heading2"/>
       </w:pPr>
-      <w:bookmarkStart w:id="1" w:name="_Toc237717288"/>
+      <w:bookmarkStart w:id="1" w:name="_Toc224418804"/>
       <w:r>
         <w:t>Context</w:t>
       </w:r>
@@ -2822,7 +2191,7 @@
       <w:pPr>
         <w:pStyle w:val="Heading2"/>
       </w:pPr>
-      <w:bookmarkStart w:id="2" w:name="_Toc237717289"/>
+      <w:bookmarkStart w:id="2" w:name="_Toc224418805"/>
       <w:r>
         <w:t>Purpose of this document</w:t>
       </w:r>
@@ -2843,7 +2212,7 @@
       <w:pPr>
         <w:pStyle w:val="Heading1"/>
       </w:pPr>
-      <w:bookmarkStart w:id="3" w:name="_Toc237717290"/>
+      <w:bookmarkStart w:id="3" w:name="_Toc224418806"/>
       <w:r>
         <w:lastRenderedPageBreak/>
         <w:t>Commands</w:t>
@@ -2890,7 +2259,10 @@
         <w:t>The following paragraphs describe each of the commands of “</w:t>
       </w:r>
       <w:r>
-        <w:t>Control T</w:t>
+        <w:t xml:space="preserve">Control </w:t>
+      </w:r>
+      <w:r>
+        <w:t>T</w:t>
       </w:r>
       <w:r>
         <w:t>arget</w:t>
@@ -2903,7 +2275,7 @@
       <w:pPr>
         <w:pStyle w:val="Heading2"/>
       </w:pPr>
-      <w:bookmarkStart w:id="4" w:name="_Toc237717291"/>
+      <w:bookmarkStart w:id="4" w:name="_Toc224418807"/>
       <w:r>
         <w:t>CTRL</w:t>
       </w:r>
@@ -3017,7 +2389,7 @@
       <w:pPr>
         <w:pStyle w:val="Heading2"/>
       </w:pPr>
-      <w:bookmarkStart w:id="5" w:name="_Toc237717292"/>
+      <w:bookmarkStart w:id="5" w:name="_Toc224418808"/>
       <w:r>
         <w:t>CTRL_CMD_FINISH_CAPTURE (</w:t>
       </w:r>
@@ -3084,7 +2456,7 @@
       <w:pPr>
         <w:pStyle w:val="Heading2"/>
       </w:pPr>
-      <w:bookmarkStart w:id="6" w:name="_Toc237717293"/>
+      <w:bookmarkStart w:id="6" w:name="_Toc224418809"/>
       <w:r>
         <w:t>CTRL_CMD_FREEZE (</w:t>
       </w:r>
@@ -3169,7 +2541,7 @@
       <w:pPr>
         <w:pStyle w:val="Heading2"/>
       </w:pPr>
-      <w:bookmarkStart w:id="7" w:name="_Toc237717294"/>
+      <w:bookmarkStart w:id="7" w:name="_Toc224418810"/>
       <w:r>
         <w:t>CTRL_CMD_REBOOT (</w:t>
       </w:r>
@@ -3262,7 +2634,7 @@
       <w:pPr>
         <w:pStyle w:val="Heading2"/>
       </w:pPr>
-      <w:bookmarkStart w:id="8" w:name="_Toc237717295"/>
+      <w:bookmarkStart w:id="8" w:name="_Toc224418811"/>
       <w:r>
         <w:lastRenderedPageBreak/>
         <w:t>CTRL_CMD_LOAD_REU (</w:t>
@@ -3389,7 +2761,13 @@
         <w:rPr>
           <w:rStyle w:val="CodeChar"/>
         </w:rPr>
-        <w:t xml:space="preserve">81,INVALID PARAMS </w:t>
+        <w:t>81,INVALID PARAMS</w:t>
+      </w:r>
+      <w:r>
+        <w:rPr>
+          <w:rStyle w:val="CodeChar"/>
+        </w:rPr>
+        <w:t xml:space="preserve"> </w:t>
       </w:r>
     </w:p>
     <w:p>
@@ -3432,7 +2810,7 @@
       <w:pPr>
         <w:pStyle w:val="Heading2"/>
       </w:pPr>
-      <w:bookmarkStart w:id="9" w:name="_Toc237717296"/>
+      <w:bookmarkStart w:id="9" w:name="_Toc224418812"/>
       <w:r>
         <w:t>CTRL_CMD_U64_SAVEMEM</w:t>
       </w:r>
@@ -3499,7 +2877,13 @@
         <w:rPr>
           <w:rStyle w:val="CodeChar"/>
         </w:rPr>
-        <w:t>/temp/c64_memory.bin</w:t>
+        <w:t>/temp/</w:t>
+      </w:r>
+      <w:r>
+        <w:rPr>
+          <w:rStyle w:val="CodeChar"/>
+        </w:rPr>
+        <w:t>c64_memory.bin</w:t>
       </w:r>
       <w:r>
         <w:t>”</w:t>
@@ -3549,7 +2933,7 @@
       <w:pPr>
         <w:pStyle w:val="Heading2"/>
       </w:pPr>
-      <w:bookmarkStart w:id="10" w:name="_Toc237717297"/>
+      <w:bookmarkStart w:id="10" w:name="_Toc224418813"/>
       <w:r>
         <w:t>CTRL_CMD_DECODE_TRACK (</w:t>
       </w:r>
@@ -3742,7 +3126,7 @@
       <w:pPr>
         <w:pStyle w:val="Heading2"/>
       </w:pPr>
-      <w:bookmarkStart w:id="11" w:name="_Toc237717298"/>
+      <w:bookmarkStart w:id="11" w:name="_Toc224418814"/>
       <w:r>
         <w:lastRenderedPageBreak/>
         <w:t>CTRL_CMD_EASYFLASH</w:t>
@@ -3782,10 +3166,26 @@
         <w:t xml:space="preserve"> </w:t>
       </w:r>
       <w:r>
-        <w:t>The EasyFlash Erase command e</w:t>
-      </w:r>
-      <w:r>
-        <w:t>mulates the sector-erase function of an EasyFlash cartridge. This command erases a 64 KiB sector of the emulated 1 MiB Flash chip.</w:t>
+        <w:t xml:space="preserve">The </w:t>
+      </w:r>
+      <w:proofErr w:type="spellStart"/>
+      <w:r>
+        <w:t>EasyFlash</w:t>
+      </w:r>
+      <w:proofErr w:type="spellEnd"/>
+      <w:r>
+        <w:t xml:space="preserve"> Erase command e</w:t>
+      </w:r>
+      <w:r>
+        <w:t xml:space="preserve">mulates the sector-erase function of an </w:t>
+      </w:r>
+      <w:proofErr w:type="spellStart"/>
+      <w:r>
+        <w:t>EasyFlash</w:t>
+      </w:r>
+      <w:proofErr w:type="spellEnd"/>
+      <w:r>
+        <w:t xml:space="preserve"> cartridge. This command erases a 64 KiB sector of the emulated 1 MiB Flash chip.</w:t>
       </w:r>
     </w:p>
     <w:p>
@@ -3896,7 +3296,7 @@
       <w:pPr>
         <w:pStyle w:val="Heading2"/>
       </w:pPr>
-      <w:bookmarkStart w:id="12" w:name="_Toc237717299"/>
+      <w:bookmarkStart w:id="12" w:name="_Toc224418815"/>
       <w:r>
         <w:t>CTRL_CMD_GET_HWINFO (</w:t>
       </w:r>
@@ -4088,7 +3488,7 @@
       <w:pPr>
         <w:pStyle w:val="Heading2"/>
       </w:pPr>
-      <w:bookmarkStart w:id="13" w:name="_Toc237717300"/>
+      <w:bookmarkStart w:id="13" w:name="_Toc224418816"/>
       <w:r>
         <w:lastRenderedPageBreak/>
         <w:t>CTRL_CMD_GET_DRVINFO ($29)</w:t>
@@ -4389,7 +3789,10 @@
               <w:cnfStyle w:val="000000100000" w:firstRow="0" w:lastRow="0" w:firstColumn="0" w:lastColumn="0" w:oddVBand="0" w:evenVBand="0" w:oddHBand="1" w:evenHBand="0" w:firstRowFirstColumn="0" w:firstRowLastColumn="0" w:lastRowFirstColumn="0" w:lastRowLastColumn="0"/>
             </w:pPr>
             <w:r>
-              <w:t>$0F</w:t>
+              <w:t>$0</w:t>
+            </w:r>
+            <w:r>
+              <w:t>F</w:t>
             </w:r>
           </w:p>
         </w:tc>
@@ -4418,7 +3821,10 @@
               <w:cnfStyle w:val="000000010000" w:firstRow="0" w:lastRow="0" w:firstColumn="0" w:lastColumn="0" w:oddVBand="0" w:evenVBand="0" w:oddHBand="0" w:evenHBand="1" w:firstRowFirstColumn="0" w:firstRowLastColumn="0" w:lastRowFirstColumn="0" w:lastRowLastColumn="0"/>
             </w:pPr>
             <w:r>
-              <w:t>$50</w:t>
+              <w:t>$</w:t>
+            </w:r>
+            <w:r>
+              <w:t>50</w:t>
             </w:r>
           </w:p>
         </w:tc>
@@ -4470,7 +3876,7 @@
       <w:pPr>
         <w:pStyle w:val="Heading2"/>
       </w:pPr>
-      <w:bookmarkStart w:id="14" w:name="_Toc237717301"/>
+      <w:bookmarkStart w:id="14" w:name="_Toc224418817"/>
       <w:r>
         <w:t>CTRL_CMD_ENABLE_</w:t>
       </w:r>
@@ -4564,7 +3970,7 @@
       <w:pPr>
         <w:pStyle w:val="Heading2"/>
       </w:pPr>
-      <w:bookmarkStart w:id="15" w:name="_Toc237717302"/>
+      <w:bookmarkStart w:id="15" w:name="_Toc224418818"/>
       <w:r>
         <w:t>CTRL_CMD_</w:t>
       </w:r>
@@ -4636,7 +4042,13 @@
         <w:t>ontrols the power state of emulated drive A</w:t>
       </w:r>
       <w:r>
-        <w:t>: This command turns the drive OFF.</w:t>
+        <w:t>: This command turns the drive O</w:t>
+      </w:r>
+      <w:r>
+        <w:t>FF</w:t>
+      </w:r>
+      <w:r>
+        <w:t>.</w:t>
       </w:r>
     </w:p>
     <w:p>
@@ -4661,7 +4073,7 @@
       <w:pPr>
         <w:pStyle w:val="Heading2"/>
       </w:pPr>
-      <w:bookmarkStart w:id="16" w:name="_Toc237717303"/>
+      <w:bookmarkStart w:id="16" w:name="_Toc224418819"/>
       <w:r>
         <w:t>CTRL_CMD_ENABLE_</w:t>
       </w:r>
@@ -4672,13 +4084,22 @@
         <w:t>_</w:t>
       </w:r>
       <w:r>
-        <w:t xml:space="preserve">B </w:t>
+        <w:t>B</w:t>
+      </w:r>
+      <w:r>
+        <w:t xml:space="preserve"> </w:t>
       </w:r>
       <w:r>
         <w:t>(</w:t>
       </w:r>
       <w:r>
-        <w:t>0x32)</w:t>
+        <w:t>0x3</w:t>
+      </w:r>
+      <w:r>
+        <w:t>2</w:t>
+      </w:r>
+      <w:r>
+        <w:t>)</w:t>
       </w:r>
       <w:bookmarkEnd w:id="16"/>
     </w:p>
@@ -4730,7 +4151,10 @@
         <w:t xml:space="preserve">ontrols the power state of emulated drive </w:t>
       </w:r>
       <w:r>
-        <w:t>B: This command turns the drive ON.</w:t>
+        <w:t>B</w:t>
+      </w:r>
+      <w:r>
+        <w:t>: This command turns the drive ON.</w:t>
       </w:r>
     </w:p>
     <w:p>
@@ -4755,7 +4179,7 @@
       <w:pPr>
         <w:pStyle w:val="Heading2"/>
       </w:pPr>
-      <w:bookmarkStart w:id="17" w:name="_Toc237717304"/>
+      <w:bookmarkStart w:id="17" w:name="_Toc224418820"/>
       <w:r>
         <w:t>CTRL_CMD_</w:t>
       </w:r>
@@ -4781,7 +4205,10 @@
         <w:t>3</w:t>
       </w:r>
       <w:r>
-        <w:t>3)</w:t>
+        <w:t>3</w:t>
+      </w:r>
+      <w:r>
+        <w:t>)</w:t>
       </w:r>
       <w:bookmarkEnd w:id="17"/>
     </w:p>
@@ -4833,7 +4260,16 @@
         <w:t xml:space="preserve">ontrols the power state of emulated drive </w:t>
       </w:r>
       <w:r>
-        <w:t>B: This command turns the drive OFF.</w:t>
+        <w:t>B</w:t>
+      </w:r>
+      <w:r>
+        <w:t>: This command turns the drive O</w:t>
+      </w:r>
+      <w:r>
+        <w:t>FF</w:t>
+      </w:r>
+      <w:r>
+        <w:t>.</w:t>
       </w:r>
     </w:p>
     <w:p>
@@ -4878,7 +4314,7 @@
           <w:bCs/>
         </w:rPr>
       </w:pPr>
-      <w:bookmarkStart w:id="18" w:name="_Toc237717305"/>
+      <w:bookmarkStart w:id="18" w:name="_Toc224418821"/>
       <w:r>
         <w:rPr>
           <w:rStyle w:val="Heading2Char"/>
@@ -5020,150 +4456,22 @@
           <w:bCs/>
         </w:rPr>
       </w:pPr>
-      <w:bookmarkStart w:id="19" w:name="_Toc237717306"/>
+      <w:bookmarkStart w:id="19" w:name="_Toc224418822"/>
       <w:r>
         <w:rPr>
           <w:rStyle w:val="Heading2Char"/>
           <w:b/>
           <w:bCs/>
         </w:rPr>
-        <w:t>CTRL_CMD_GET_DRIVE_B_POWER (0x35)</w:t>
-      </w:r>
-      <w:bookmarkEnd w:id="19"/>
-    </w:p>
-    <w:p>
-      <w:r>
-        <w:rPr>
-          <w:b/>
-          <w:bCs/>
-        </w:rPr>
-        <w:t>Command format</w:t>
-      </w:r>
-      <w:r>
-        <w:t xml:space="preserve">: </w:t>
-      </w:r>
-      <w:r>
-        <w:rPr>
-          <w:rStyle w:val="CodeChar"/>
-        </w:rPr>
-        <w:t>$04 $</w:t>
-      </w:r>
-      <w:r>
-        <w:rPr>
-          <w:rStyle w:val="CodeChar"/>
-        </w:rPr>
-        <w:t>3</w:t>
-      </w:r>
-      <w:r>
-        <w:rPr>
-          <w:rStyle w:val="CodeChar"/>
-        </w:rPr>
-        <w:t>5</w:t>
-      </w:r>
-    </w:p>
-    <w:p>
-      <w:r>
-        <w:rPr>
-          <w:b/>
-          <w:bCs/>
-        </w:rPr>
-        <w:t>Description</w:t>
-      </w:r>
-      <w:r>
-        <w:t xml:space="preserve">: </w:t>
-      </w:r>
-      <w:r>
-        <w:t>With this command the power state of drive B can be queried.</w:t>
-      </w:r>
-    </w:p>
-    <w:p>
-      <w:pPr>
-        <w:rPr>
-          <w:b/>
-          <w:bCs/>
-        </w:rPr>
-      </w:pPr>
-      <w:r>
-        <w:rPr>
-          <w:b/>
-          <w:bCs/>
-        </w:rPr>
-        <w:t>Response:</w:t>
-      </w:r>
-      <w:r>
-        <w:rPr>
-          <w:b/>
-          <w:bCs/>
-        </w:rPr>
-        <w:t xml:space="preserve"> “</w:t>
-      </w:r>
-      <w:r>
-        <w:rPr>
-          <w:rStyle w:val="CodeChar"/>
-        </w:rPr>
-        <w:t>off</w:t>
-      </w:r>
-      <w:r>
-        <w:rPr>
-          <w:b/>
-          <w:bCs/>
-        </w:rPr>
-        <w:t>” or “</w:t>
-      </w:r>
-      <w:r>
-        <w:rPr>
-          <w:rStyle w:val="CodeChar"/>
-        </w:rPr>
-        <w:t xml:space="preserve">on </w:t>
-      </w:r>
-      <w:r>
-        <w:rPr>
-          <w:b/>
-          <w:bCs/>
-        </w:rPr>
-        <w:t>”</w:t>
-      </w:r>
-    </w:p>
-    <w:p>
-      <w:pPr>
-        <w:rPr>
-          <w:b/>
-          <w:bCs/>
-        </w:rPr>
-      </w:pPr>
-      <w:r>
-        <w:rPr>
-          <w:b/>
-          <w:bCs/>
-        </w:rPr>
-        <w:t>Status:</w:t>
-      </w:r>
-      <w:r>
-        <w:rPr>
-          <w:b/>
-          <w:bCs/>
-        </w:rPr>
-        <w:t xml:space="preserve"> </w:t>
-      </w:r>
-      <w:r>
-        <w:rPr>
-          <w:rStyle w:val="CodeChar"/>
-        </w:rPr>
-        <w:t>00,OK</w:t>
-      </w:r>
-    </w:p>
-    <w:p>
-      <w:pPr>
-        <w:pStyle w:val="Heading2"/>
-      </w:pPr>
-      <w:bookmarkStart w:id="20" w:name="_Toc237717307"/>
+        <w:t>CTRL_CMD_GET_DRIVE_</w:t>
+      </w:r>
       <w:r>
         <w:rPr>
           <w:rStyle w:val="Heading2Char"/>
           <w:b/>
           <w:bCs/>
         </w:rPr>
-        <w:t>CTRL_CMD_GET_</w:t>
+        <w:t>B</w:t>
       </w:r>
       <w:r>
         <w:rPr>
@@ -5171,7 +4479,7 @@
           <w:b/>
           <w:bCs/>
         </w:rPr>
-        <w:t>MP3_</w:t>
+        <w:t>_POWER (0x3</w:t>
       </w:r>
       <w:r>
         <w:rPr>
@@ -5179,15 +4487,149 @@
           <w:b/>
           <w:bCs/>
         </w:rPr>
-        <w:t>RAMDISKINFO (</w:t>
-      </w:r>
+        <w:t>5)</w:t>
+      </w:r>
+      <w:bookmarkEnd w:id="19"/>
+    </w:p>
+    <w:p>
+      <w:r>
+        <w:rPr>
+          <w:b/>
+          <w:bCs/>
+        </w:rPr>
+        <w:t>Command format</w:t>
+      </w:r>
+      <w:r>
+        <w:t xml:space="preserve">: </w:t>
+      </w:r>
+      <w:r>
+        <w:rPr>
+          <w:rStyle w:val="CodeChar"/>
+        </w:rPr>
+        <w:t>$04 $</w:t>
+      </w:r>
+      <w:r>
+        <w:rPr>
+          <w:rStyle w:val="CodeChar"/>
+        </w:rPr>
+        <w:t>3</w:t>
+      </w:r>
+      <w:r>
+        <w:rPr>
+          <w:rStyle w:val="CodeChar"/>
+        </w:rPr>
+        <w:t>5</w:t>
+      </w:r>
+    </w:p>
+    <w:p>
+      <w:r>
+        <w:rPr>
+          <w:b/>
+          <w:bCs/>
+        </w:rPr>
+        <w:t>Description</w:t>
+      </w:r>
+      <w:r>
+        <w:t xml:space="preserve">: </w:t>
+      </w:r>
+      <w:r>
+        <w:t xml:space="preserve">With this command the power state </w:t>
+      </w:r>
+      <w:r>
+        <w:t xml:space="preserve">of drive B </w:t>
+      </w:r>
+      <w:r>
+        <w:t>can be queried.</w:t>
+      </w:r>
+    </w:p>
+    <w:p>
+      <w:pPr>
+        <w:rPr>
+          <w:b/>
+          <w:bCs/>
+        </w:rPr>
+      </w:pPr>
+      <w:r>
+        <w:rPr>
+          <w:b/>
+          <w:bCs/>
+        </w:rPr>
+        <w:t>Response:</w:t>
+      </w:r>
+      <w:r>
+        <w:rPr>
+          <w:b/>
+          <w:bCs/>
+        </w:rPr>
+        <w:t xml:space="preserve"> “</w:t>
+      </w:r>
+      <w:r>
+        <w:rPr>
+          <w:rStyle w:val="CodeChar"/>
+        </w:rPr>
+        <w:t>off</w:t>
+      </w:r>
+      <w:r>
+        <w:rPr>
+          <w:b/>
+          <w:bCs/>
+        </w:rPr>
+        <w:t>” or “</w:t>
+      </w:r>
+      <w:r>
+        <w:rPr>
+          <w:rStyle w:val="CodeChar"/>
+        </w:rPr>
+        <w:t xml:space="preserve">on </w:t>
+      </w:r>
+      <w:r>
+        <w:rPr>
+          <w:b/>
+          <w:bCs/>
+        </w:rPr>
+        <w:t>”</w:t>
+      </w:r>
+    </w:p>
+    <w:p>
+      <w:pPr>
+        <w:rPr>
+          <w:b/>
+          <w:bCs/>
+        </w:rPr>
+      </w:pPr>
+      <w:r>
+        <w:rPr>
+          <w:b/>
+          <w:bCs/>
+        </w:rPr>
+        <w:t>Status:</w:t>
+      </w:r>
+      <w:r>
+        <w:rPr>
+          <w:b/>
+          <w:bCs/>
+        </w:rPr>
+        <w:t xml:space="preserve"> </w:t>
+      </w:r>
+      <w:r>
+        <w:rPr>
+          <w:rStyle w:val="CodeChar"/>
+        </w:rPr>
+        <w:t>00,OK</w:t>
+      </w:r>
+    </w:p>
+    <w:p>
+      <w:pPr>
+        <w:pStyle w:val="Heading2"/>
+      </w:pPr>
+      <w:bookmarkStart w:id="20" w:name="_Toc224418823"/>
       <w:r>
         <w:rPr>
           <w:rStyle w:val="Heading2Char"/>
           <w:b/>
           <w:bCs/>
         </w:rPr>
-        <w:t>0x</w:t>
+        <w:t>CTRL_CMD_GET_</w:t>
       </w:r>
       <w:r>
         <w:rPr>
@@ -5195,83 +4637,115 @@
           <w:b/>
           <w:bCs/>
         </w:rPr>
-        <w:t>40)</w:t>
-      </w:r>
-      <w:bookmarkEnd w:id="20"/>
-    </w:p>
-    <w:p>
-      <w:r>
-        <w:rPr>
+        <w:t>MP3_</w:t>
+      </w:r>
+      <w:r>
+        <w:rPr>
+          <w:rStyle w:val="Heading2Char"/>
           <w:b/>
           <w:bCs/>
         </w:rPr>
-        <w:t>Command format</w:t>
-      </w:r>
-      <w:r>
-        <w:t xml:space="preserve">: </w:t>
-      </w:r>
-      <w:r>
-        <w:rPr>
-          <w:rStyle w:val="CodeChar"/>
-        </w:rPr>
-        <w:t>$04 $40</w:t>
-      </w:r>
-    </w:p>
-    <w:p>
-      <w:r>
-        <w:rPr>
+        <w:t>RAMDISKINFO (</w:t>
+      </w:r>
+      <w:r>
+        <w:rPr>
+          <w:rStyle w:val="Heading2Char"/>
           <w:b/>
           <w:bCs/>
         </w:rPr>
-        <w:t>Description</w:t>
-      </w:r>
-      <w:r>
-        <w:t xml:space="preserve">: </w:t>
-      </w:r>
-      <w:r>
-        <w:t>This is a command specifically made for Geos MegaPatch 3. It returns the configuration of the RAM disks found in the REU image.</w:t>
-      </w:r>
-    </w:p>
-    <w:p>
-      <w:r>
-        <w:rPr>
+        <w:t>0x</w:t>
+      </w:r>
+      <w:r>
+        <w:rPr>
+          <w:rStyle w:val="Heading2Char"/>
           <w:b/>
           <w:bCs/>
         </w:rPr>
-        <w:t xml:space="preserve">Response: </w:t>
-      </w:r>
-      <w:r>
-        <w:t xml:space="preserve">An </w:t>
-      </w:r>
-      <w:r>
-        <w:t>8-byte status block (2 bytes per drive) indicating RAM disk types (1541, 1571, 1581, or Native) and their sizes.</w:t>
-      </w:r>
-      <w:r>
-        <w:t xml:space="preserve"> The first of the two bytes indicates the type (0x41, 0x71, 0x81 or 0xDD)</w:t>
-      </w:r>
-      <w:r>
-        <w:t>. For native partitions, the second byte indicates the size expressed in blocks of 64 KiB, otherwise it’s zero.</w:t>
-      </w:r>
-    </w:p>
-    <w:p>
-      <w:pPr>
+        <w:t>40)</w:t>
+      </w:r>
+      <w:bookmarkEnd w:id="20"/>
+    </w:p>
+    <w:p>
+      <w:r>
         <w:rPr>
           <w:b/>
           <w:bCs/>
         </w:rPr>
-      </w:pPr>
+        <w:t>Command format</w:t>
+      </w:r>
+      <w:r>
+        <w:t xml:space="preserve">: </w:t>
+      </w:r>
+      <w:r>
+        <w:rPr>
+          <w:rStyle w:val="CodeChar"/>
+        </w:rPr>
+        <w:t>$04 $40</w:t>
+      </w:r>
+    </w:p>
+    <w:p>
       <w:r>
         <w:rPr>
           <w:b/>
           <w:bCs/>
         </w:rPr>
-        <w:t>Status:</w:t>
-      </w:r>
+        <w:t>Description</w:t>
+      </w:r>
+      <w:r>
+        <w:t xml:space="preserve">: </w:t>
+      </w:r>
+      <w:r>
+        <w:t xml:space="preserve">This is a command specifically made for Geos </w:t>
+      </w:r>
+      <w:proofErr w:type="spellStart"/>
+      <w:r>
+        <w:t>MegaPatch</w:t>
+      </w:r>
+      <w:proofErr w:type="spellEnd"/>
+      <w:r>
+        <w:t xml:space="preserve"> 3. It returns the configuration of the RAM disks found in the REU image.</w:t>
+      </w:r>
+    </w:p>
+    <w:p>
       <w:r>
         <w:rPr>
           <w:b/>
           <w:bCs/>
         </w:rPr>
+        <w:t xml:space="preserve">Response: </w:t>
+      </w:r>
+      <w:r>
+        <w:t xml:space="preserve">An </w:t>
+      </w:r>
+      <w:r>
+        <w:t>8-byte status block (2 bytes per drive) indicating RAM disk types (1541, 1571, 1581, or Native) and their sizes.</w:t>
+      </w:r>
+      <w:r>
+        <w:t xml:space="preserve"> The first of the two bytes indicates the type (0x41, 0x71, 0x81 or 0xDD)</w:t>
+      </w:r>
+      <w:r>
+        <w:t>. For native partitions, the second byte indicates the size expressed in blocks of 64 KiB, otherwise it’s zero.</w:t>
+      </w:r>
+    </w:p>
+    <w:p>
+      <w:pPr>
+        <w:rPr>
+          <w:b/>
+          <w:bCs/>
+        </w:rPr>
+      </w:pPr>
+      <w:r>
+        <w:rPr>
+          <w:b/>
+          <w:bCs/>
+        </w:rPr>
+        <w:t>Status:</w:t>
+      </w:r>
+      <w:r>
+        <w:rPr>
+          <w:b/>
+          <w:bCs/>
+        </w:rPr>
         <w:t xml:space="preserve"> </w:t>
       </w:r>
       <w:r>
@@ -5283,990 +4757,6 @@
     </w:p>
     <w:p/>
     <w:p/>
-    <w:p>
-      <w:pPr>
-        <w:pStyle w:val="Heading2"/>
-      </w:pPr>
-      <w:bookmarkStart w:id="21" w:name="ctrl_cmd_get_palette-0x51"/>
-      <w:bookmarkStart w:id="22" w:name="_Toc237717308"/>
-      <w:r>
-        <w:t>CTRL_CMD_GET_PALETTE (0x51)</w:t>
-      </w:r>
-      <w:bookmarkEnd w:id="22"/>
-    </w:p>
-    <w:p>
-      <w:r>
-        <w:rPr>
-          <w:b/>
-          <w:bCs/>
-        </w:rPr>
-        <w:t>Command format:</w:t>
-      </w:r>
-      <w:r>
-        <w:t xml:space="preserve"> $04 $51</w:t>
-      </w:r>
-    </w:p>
-    <w:p>
-      <w:r>
-        <w:rPr>
-          <w:b/>
-          <w:bCs/>
-        </w:rPr>
-        <w:t>Availability:</w:t>
-      </w:r>
-      <w:r>
-        <w:t xml:space="preserve"> Ultimate 64, Ultimate 64 Elite, Ultimate 64-II, Ultimate 64 Elite-II, and Commodore 64 Ultimate.</w:t>
-      </w:r>
-    </w:p>
-    <w:p>
-      <w:r>
-        <w:rPr>
-          <w:b/>
-          <w:bCs/>
-        </w:rPr>
-        <w:t>Description:</w:t>
-      </w:r>
-      <w:r>
-        <w:t xml:space="preserve"> </w:t>
-      </w:r>
-      <w:r>
-        <w:t>Returns the currently applied runtime palette. The response is 48 bytes: 16 consecutive RGB triples in C64 color-number order (0 through 15). Each component is an unsigned 8-bit value. For example, response bytes 45, 46, and 47 are the red, green, and blue components of color 15.</w:t>
-      </w:r>
-    </w:p>
-    <w:p>
-      <w:r>
-        <w:rPr>
-          <w:b/>
-          <w:bCs/>
-        </w:rPr>
-        <w:t>Response:</w:t>
-      </w:r>
-      <w:r>
-        <w:t xml:space="preserve"> [R0 G0 B0] ... [R15 G15 B15]</w:t>
-      </w:r>
-    </w:p>
-    <w:p>
-      <w:r>
-        <w:rPr>
-          <w:b/>
-          <w:bCs/>
-        </w:rPr>
-        <w:t>Status:</w:t>
-      </w:r>
-      <w:r>
-        <w:t xml:space="preserve"> 00,OK. A payload or any command length other than two bytes returns 81,INVALID PARAMS.</w:t>
-      </w:r>
-    </w:p>
-    <w:p>
-      <w:r>
-        <w:t>On other Ultimate products this command is not implemented and returns 21,UNKNOWN COMMAND.</w:t>
-      </w:r>
-    </w:p>
-    <w:p>
-      <w:pPr>
-        <w:pStyle w:val="Heading2"/>
-      </w:pPr>
-      <w:bookmarkStart w:id="23" w:name="ctrl_cmd_set_palette-0x52"/>
-      <w:bookmarkStart w:id="24" w:name="_Toc237717309"/>
-      <w:bookmarkEnd w:id="21"/>
-      <w:r>
-        <w:t>CTRL_CMD_SET_PALETTE (0x52)</w:t>
-      </w:r>
-      <w:bookmarkEnd w:id="24"/>
-    </w:p>
-    <w:p>
-      <w:r>
-        <w:rPr>
-          <w:b/>
-          <w:bCs/>
-        </w:rPr>
-        <w:t>Command format:</w:t>
-      </w:r>
-      <w:r>
-        <w:t xml:space="preserve"> $04 $52 [R0 G0 B0] ... [R15 G15 B15]</w:t>
-      </w:r>
-    </w:p>
-    <w:p>
-      <w:r>
-        <w:rPr>
-          <w:b/>
-          <w:bCs/>
-        </w:rPr>
-        <w:lastRenderedPageBreak/>
-        <w:t>Availability:</w:t>
-      </w:r>
-      <w:r>
-        <w:t xml:space="preserve"> Ultimate 64 family only, as listed for GET_PALETTE.</w:t>
-      </w:r>
-    </w:p>
-    <w:p>
-      <w:r>
-        <w:rPr>
-          <w:b/>
-          <w:bCs/>
-        </w:rPr>
-        <w:t>Description:</w:t>
-      </w:r>
-      <w:r>
-        <w:t xml:space="preserve"> Replaces all 16 colors of the runtime palette. The command must contain exactly 48 RGB bytes after the target and command bytes, for a total command length of 50 bytes.</w:t>
-      </w:r>
-    </w:p>
-    <w:p>
-      <w:r>
-        <w:rPr>
-          <w:b/>
-          <w:bCs/>
-        </w:rPr>
-        <w:t>Response:</w:t>
-      </w:r>
-      <w:r>
-        <w:t xml:space="preserve"> None.</w:t>
-      </w:r>
-    </w:p>
-    <w:p>
-      <w:r>
-        <w:rPr>
-          <w:b/>
-          <w:bCs/>
-        </w:rPr>
-        <w:t>Status:</w:t>
-      </w:r>
-      <w:r>
-        <w:t xml:space="preserve"> 00,OK, or 81,INVALID PARAMS when the command length is not exactly 50 bytes. Invalid commands do not change the palette.</w:t>
-      </w:r>
-    </w:p>
-    <w:p>
-      <w:pPr>
-        <w:pStyle w:val="Heading2"/>
-      </w:pPr>
-      <w:bookmarkStart w:id="25" w:name="ctrl_cmd_set_palette_color-0x53"/>
-      <w:bookmarkStart w:id="26" w:name="_Toc237717310"/>
-      <w:bookmarkEnd w:id="23"/>
-      <w:r>
-        <w:t>CTRL_CMD_SET_PALETTE_COLOR (0x53)</w:t>
-      </w:r>
-      <w:bookmarkEnd w:id="26"/>
-    </w:p>
-    <w:p>
-      <w:r>
-        <w:rPr>
-          <w:b/>
-          <w:bCs/>
-        </w:rPr>
-        <w:t>Command format:</w:t>
-      </w:r>
-      <w:r>
-        <w:t xml:space="preserve"> $04 $53 [INDEX] [R] [G] [B]</w:t>
-      </w:r>
-    </w:p>
-    <w:p>
-      <w:r>
-        <w:rPr>
-          <w:b/>
-          <w:bCs/>
-        </w:rPr>
-        <w:t>Availability:</w:t>
-      </w:r>
-      <w:r>
-        <w:t xml:space="preserve"> Ultimate 64 family only, as listed for GET_PALETTE.</w:t>
-      </w:r>
-    </w:p>
-    <w:p>
-      <w:r>
-        <w:rPr>
-          <w:b/>
-          <w:bCs/>
-        </w:rPr>
-        <w:t>Description:</w:t>
-      </w:r>
-      <w:r>
-        <w:t xml:space="preserve"> Replaces one runtime color without rewriting the other 15 colors. INDEX is the C64 color number and must be in the range 0 through 15. The command must be exactly six bytes long.</w:t>
-      </w:r>
-    </w:p>
-    <w:p>
-      <w:r>
-        <w:rPr>
-          <w:b/>
-          <w:bCs/>
-        </w:rPr>
-        <w:t>Response:</w:t>
-      </w:r>
-      <w:r>
-        <w:t xml:space="preserve"> None.</w:t>
-      </w:r>
-    </w:p>
-    <w:p>
-      <w:r>
-        <w:rPr>
-          <w:b/>
-          <w:bCs/>
-        </w:rPr>
-        <w:t>Status:</w:t>
-      </w:r>
-      <w:r>
-        <w:t xml:space="preserve"> 00,OK, or 81,INVALID PARAMS for an invalid index or command length. Invalid commands do not change the palette.</w:t>
-      </w:r>
-    </w:p>
-    <w:p>
-      <w:pPr>
-        <w:pStyle w:val="Heading2"/>
-      </w:pPr>
-      <w:bookmarkStart w:id="27" w:name="ctrl_cmd_reset_palette-0x54"/>
-      <w:bookmarkStart w:id="28" w:name="_Toc237717311"/>
-      <w:bookmarkEnd w:id="25"/>
-      <w:r>
-        <w:t>CTRL_CMD_RESET_PALETTE (0x54)</w:t>
-      </w:r>
-      <w:bookmarkEnd w:id="28"/>
-    </w:p>
-    <w:p>
-      <w:r>
-        <w:rPr>
-          <w:b/>
-          <w:bCs/>
-        </w:rPr>
-        <w:t>Command format:</w:t>
-      </w:r>
-      <w:r>
-        <w:t xml:space="preserve"> $04 $54</w:t>
-      </w:r>
-    </w:p>
-    <w:p>
-      <w:r>
-        <w:rPr>
-          <w:b/>
-          <w:bCs/>
-        </w:rPr>
-        <w:t>Availability:</w:t>
-      </w:r>
-      <w:r>
-        <w:t xml:space="preserve"> </w:t>
-      </w:r>
-      <w:r>
-        <w:t>Ultimate 64 family only, as listed for GET_PALETTE.</w:t>
-      </w:r>
-    </w:p>
-    <w:p>
-      <w:r>
-        <w:rPr>
-          <w:b/>
-          <w:bCs/>
-        </w:rPr>
-        <w:t>Description:</w:t>
-      </w:r>
-      <w:r>
-        <w:t xml:space="preserve"> Restores the runtime palette to the firmware’s built-in C64 default colors. No RGB payload is required.</w:t>
-      </w:r>
-    </w:p>
-    <w:p>
-      <w:r>
-        <w:rPr>
-          <w:b/>
-          <w:bCs/>
-        </w:rPr>
-        <w:t>Response:</w:t>
-      </w:r>
-      <w:r>
-        <w:t xml:space="preserve"> None.</w:t>
-      </w:r>
-    </w:p>
-    <w:p>
-      <w:r>
-        <w:rPr>
-          <w:b/>
-          <w:bCs/>
-        </w:rPr>
-        <w:t>Status:</w:t>
-      </w:r>
-      <w:r>
-        <w:t xml:space="preserve"> 00,OK. A payload or any command length other than two bytes returns 81,INVALID PARAMS without changing the palette.</w:t>
-      </w:r>
-    </w:p>
-    <w:p>
-      <w:pPr>
-        <w:pStyle w:val="Heading2"/>
-      </w:pPr>
-      <w:bookmarkStart w:id="29" w:name="runtime-and-vpl-file-behavior"/>
-      <w:bookmarkStart w:id="30" w:name="_Toc237717312"/>
-      <w:bookmarkEnd w:id="27"/>
-      <w:r>
-        <w:t>Runtime and VPL file behavior</w:t>
-      </w:r>
-      <w:bookmarkEnd w:id="30"/>
-    </w:p>
-    <w:p>
-      <w:r>
-        <w:t>The four palette commands change runtime video output only. They do not write flash configuration and do not select, create, or overwrite a VPL file. A later palette change from the configuration UI, applying a VPL file, or rebooting the Ultimate may replace the runtime palette.</w:t>
-      </w:r>
-    </w:p>
-    <w:p>
-      <w:r>
-        <w:t>A C64 program can load and save VPL files through the existing Ultimate-DOS UCI target ($01 or $02):</w:t>
-      </w:r>
-    </w:p>
-    <w:p>
-      <w:pPr>
-        <w:numPr>
-          <w:ilvl w:val="0"/>
-          <w:numId w:val="49"/>
-        </w:numPr>
-      </w:pPr>
-      <w:r>
-        <w:t>To load: DOS_CMD_OPEN_FILE ($02) with attribute $01, DOS_CMD_READ_DATA ($04), then DOS_CMD_CLOSE_FILE ($03)</w:t>
-      </w:r>
-      <w:r>
-        <w:t>. Parse 16 RGB lines and send them with SET_PALETTE.</w:t>
-      </w:r>
-    </w:p>
-    <w:p>
-      <w:pPr>
-        <w:numPr>
-          <w:ilvl w:val="0"/>
-          <w:numId w:val="49"/>
-        </w:numPr>
-      </w:pPr>
-      <w:r>
-        <w:t>To save or overwrite: DOS_CMD_OPEN_FILE ($02) with attribute $0E, one or more DOS_CMD_WRITE_DATA ($05) commands, then DOS_CMD_CLOSE_FILE ($03).</w:t>
-      </w:r>
-    </w:p>
-    <w:p>
-      <w:r>
-        <w:t>A VPL file contains 16 non-empty RGB lines in C64 color-number order. Components are hexadecimal. Blank lines and text after # are ignored. This is the built-in default palette in VPL form:</w:t>
-      </w:r>
-    </w:p>
-    <w:p>
-      <w:r>
-        <w:lastRenderedPageBreak/>
-        <w:t>00 00 00 # 0 black</w:t>
-      </w:r>
-      <w:r>
-        <w:br/>
-        <w:t>F7 F7 F7 # 1 white</w:t>
-      </w:r>
-      <w:r>
-        <w:br/>
-        <w:t>8D 2F 34 # 2 red</w:t>
-      </w:r>
-      <w:r>
-        <w:br/>
-        <w:t>6A D4 CD # 3 cyan</w:t>
-      </w:r>
-      <w:r>
-        <w:br/>
-        <w:t>98 35 A4 # 4 purple</w:t>
-      </w:r>
-      <w:r>
-        <w:br/>
-        <w:t>4C B4 42 # 5 green</w:t>
-      </w:r>
-      <w:r>
-        <w:br/>
-      </w:r>
-      <w:r>
-        <w:t>2C 29 B1 # 6 blue</w:t>
-      </w:r>
-      <w:r>
-        <w:br/>
-        <w:t>EF EF 5D # 7 yellow</w:t>
-      </w:r>
-      <w:r>
-        <w:br/>
-        <w:t>98 4E 20 # 8 orange</w:t>
-      </w:r>
-      <w:r>
-        <w:br/>
-        <w:t>5B 38 00 # 9 brown</w:t>
-      </w:r>
-      <w:r>
-        <w:br/>
-        <w:t>D1 67 6D # 10 light red</w:t>
-      </w:r>
-      <w:r>
-        <w:br/>
-        <w:t>4A 4A 4A # 11 dark gray</w:t>
-      </w:r>
-      <w:r>
-        <w:br/>
-        <w:t>7B 7B 7B # 12 gray</w:t>
-      </w:r>
-      <w:r>
-        <w:br/>
-        <w:t>9F EF 93 # 13 light green</w:t>
-      </w:r>
-      <w:r>
-        <w:br/>
-        <w:t>6D 6A EF # 14 light blue</w:t>
-      </w:r>
-      <w:r>
-        <w:br/>
-        <w:t>B2 B2 B2 # 15 light gray</w:t>
-      </w:r>
-    </w:p>
-    <w:p>
-      <w:pPr>
-        <w:pStyle w:val="Heading1"/>
-      </w:pPr>
-      <w:bookmarkStart w:id="31" w:name="palette-programming-examples"/>
-      <w:bookmarkStart w:id="32" w:name="_Toc237717313"/>
-      <w:bookmarkEnd w:id="29"/>
-      <w:r>
-        <w:lastRenderedPageBreak/>
-        <w:t>Palette programming examples</w:t>
-      </w:r>
-      <w:bookmarkEnd w:id="32"/>
-    </w:p>
-    <w:p>
-      <w:r>
-        <w:t xml:space="preserve">The Command Interface setting must be enabled before these examples run. The transport and register meanings are defined in </w:t>
-      </w:r>
-      <w:r>
-        <w:rPr>
-          <w:i/>
-          <w:iCs/>
-        </w:rPr>
-        <w:t>Ultimate Command Interface - Register API</w:t>
-      </w:r>
-      <w:r>
-        <w:t>.</w:t>
-      </w:r>
-    </w:p>
-    <w:p>
-      <w:pPr>
-        <w:pStyle w:val="Heading2"/>
-      </w:pPr>
-      <w:bookmarkStart w:id="33" w:name="assembly-set-one-color-then-reset"/>
-      <w:bookmarkStart w:id="34" w:name="_Toc237717314"/>
-      <w:r>
-        <w:t>6502 assembly: set one color, then reset</w:t>
-      </w:r>
-      <w:bookmarkEnd w:id="34"/>
-    </w:p>
-    <w:p>
-      <w:r>
-        <w:t>This complete example prints a banner using color 15, changes that color from light gray to red, waits for a key, and restores the built-in palette. Assemble it at $C000 and start it with SYS 49152. Production code should also read and check the status bytes at $DF1F; successful commands return the ASCII string 00,OK.</w:t>
-      </w:r>
-    </w:p>
-    <w:p>
-      <w:r>
-        <w:t>* = $C000</w:t>
-      </w:r>
-      <w:r>
-        <w:br/>
-      </w:r>
-      <w:r>
-        <w:br/>
-        <w:t>UCI_CONTROL  = $DF1C</w:t>
-      </w:r>
-      <w:r>
-        <w:br/>
-        <w:t>UCI_COMMAND  = $DF1D</w:t>
-      </w:r>
-      <w:r>
-        <w:br/>
-      </w:r>
-      <w:r>
-        <w:br/>
-        <w:t>PUSH_CMD     = $01</w:t>
-      </w:r>
-      <w:r>
-        <w:br/>
-        <w:t>DATA_ACCEPT  = $02</w:t>
-      </w:r>
-      <w:r>
-        <w:br/>
-        <w:t>STATE_MASK   = $30</w:t>
-      </w:r>
-      <w:r>
-        <w:br/>
-        <w:t>STATE_BUSY   = $10</w:t>
-      </w:r>
-      <w:r>
-        <w:br/>
-        <w:t>STATE_LAST   = $20</w:t>
-      </w:r>
-      <w:r>
-        <w:br/>
-      </w:r>
-      <w:r>
-        <w:br/>
-        <w:t>start:</w:t>
-      </w:r>
-      <w:r>
-        <w:br/>
-        <w:t xml:space="preserve">        lda #$93              </w:t>
-      </w:r>
-      <w:r>
-        <w:t>; clear screen</w:t>
-      </w:r>
-      <w:r>
-        <w:br/>
-        <w:t xml:space="preserve">        jsr $FFD2             ; KERNAL CHROUT</w:t>
-      </w:r>
-      <w:r>
-        <w:br/>
-        <w:t xml:space="preserve">        lda #$0f</w:t>
-      </w:r>
-      <w:r>
-        <w:br/>
-        <w:t xml:space="preserve">        sta $0286             ; current text color = color 15</w:t>
-      </w:r>
-      <w:r>
-        <w:br/>
-        <w:t xml:space="preserve">        ldx #$00</w:t>
-      </w:r>
-      <w:r>
-        <w:br/>
-        <w:t>show:   lda banner,x</w:t>
-      </w:r>
-      <w:r>
-        <w:br/>
-        <w:t xml:space="preserve">        beq change</w:t>
-      </w:r>
-      <w:r>
-        <w:br/>
-        <w:t xml:space="preserve">        jsr $FFD2</w:t>
-      </w:r>
-      <w:r>
-        <w:br/>
-        <w:t xml:space="preserve">        inx</w:t>
-      </w:r>
-      <w:r>
-        <w:br/>
-        <w:t xml:space="preserve">        bne show</w:t>
-      </w:r>
-      <w:r>
-        <w:br/>
-        <w:t>change: jsr set_light_gray_red</w:t>
-      </w:r>
-      <w:r>
-        <w:br/>
-        <w:t>key:    jsr $FFE4             ; KERNAL GETIN</w:t>
-      </w:r>
-      <w:r>
-        <w:br/>
-        <w:t xml:space="preserve">        beq key</w:t>
-      </w:r>
-      <w:r>
-        <w:br/>
-        <w:t xml:space="preserve">        jsr reset_palette</w:t>
-      </w:r>
-      <w:r>
-        <w:br/>
-        <w:t xml:space="preserve">        rts</w:t>
-      </w:r>
-      <w:r>
-        <w:br/>
-      </w:r>
-      <w:r>
-        <w:br/>
-        <w:t>banner: .text "COLOR 15: RED - PRESS A KEY", 0</w:t>
-      </w:r>
-      <w:r>
-        <w:br/>
-      </w:r>
-      <w:r>
-        <w:br/>
-        <w:t>set_light_gray_red:</w:t>
-      </w:r>
-      <w:r>
-        <w:br/>
-        <w:t xml:space="preserve">        lda #$04              ; Control target</w:t>
-      </w:r>
-      <w:r>
-        <w:br/>
-      </w:r>
-      <w:r>
-        <w:t xml:space="preserve">        sta UCI_COMMAND</w:t>
-      </w:r>
-      <w:r>
-        <w:br/>
-        <w:t xml:space="preserve">        lda #$53              ; SET_PALETTE_COLOR</w:t>
-      </w:r>
-      <w:r>
-        <w:br/>
-        <w:t xml:space="preserve">        sta UCI_COMMAND</w:t>
-      </w:r>
-      <w:r>
-        <w:br/>
-        <w:t xml:space="preserve">        lda #$0f              ; color 15</w:t>
-      </w:r>
-      <w:r>
-        <w:br/>
-        <w:t xml:space="preserve">        sta UCI_COMMAND</w:t>
-      </w:r>
-      <w:r>
-        <w:br/>
-      </w:r>
-      <w:r>
-        <w:lastRenderedPageBreak/>
-        <w:t xml:space="preserve">        lda #$ff              ; red</w:t>
-      </w:r>
-      <w:r>
-        <w:br/>
-        <w:t xml:space="preserve">        sta UCI_COMMAND</w:t>
-      </w:r>
-      <w:r>
-        <w:br/>
-        <w:t xml:space="preserve">        lda #$00              ; green, blue</w:t>
-      </w:r>
-      <w:r>
-        <w:br/>
-        <w:t xml:space="preserve">        sta UCI_COMMAND</w:t>
-      </w:r>
-      <w:r>
-        <w:br/>
-        <w:t xml:space="preserve">        sta UCI_COMMAND</w:t>
-      </w:r>
-      <w:r>
-        <w:br/>
-        <w:t xml:space="preserve">        jsr send_and_accept</w:t>
-      </w:r>
-      <w:r>
-        <w:br/>
-        <w:t xml:space="preserve">        rts</w:t>
-      </w:r>
-      <w:r>
-        <w:br/>
-      </w:r>
-      <w:r>
-        <w:br/>
-        <w:t>reset_palette:</w:t>
-      </w:r>
-      <w:r>
-        <w:br/>
-        <w:t xml:space="preserve">        lda #$04              ; Control target</w:t>
-      </w:r>
-      <w:r>
-        <w:br/>
-        <w:t xml:space="preserve">        sta UCI_COMMAND</w:t>
-      </w:r>
-      <w:r>
-        <w:br/>
-        <w:t xml:space="preserve">        lda #$54              ; RESET_PALETTE</w:t>
-      </w:r>
-      <w:r>
-        <w:br/>
-        <w:t xml:space="preserve">        sta UCI_COMMAND</w:t>
-      </w:r>
-      <w:r>
-        <w:br/>
-      </w:r>
-      <w:r>
-        <w:t xml:space="preserve">        jsr send_and_accept</w:t>
-      </w:r>
-      <w:r>
-        <w:br/>
-        <w:t xml:space="preserve">        rts</w:t>
-      </w:r>
-      <w:r>
-        <w:br/>
-      </w:r>
-      <w:r>
-        <w:br/>
-        <w:t>send_and_accept:</w:t>
-      </w:r>
-      <w:r>
-        <w:br/>
-        <w:t xml:space="preserve">        lda #PUSH_CMD</w:t>
-      </w:r>
-      <w:r>
-        <w:br/>
-        <w:t xml:space="preserve">        sta UCI_CONTROL</w:t>
-      </w:r>
-      <w:r>
-        <w:br/>
-        <w:t>wait:  lda UCI_CONTROL</w:t>
-      </w:r>
-      <w:r>
-        <w:br/>
-        <w:t xml:space="preserve">        and #STATE_MASK</w:t>
-      </w:r>
-      <w:r>
-        <w:br/>
-        <w:t xml:space="preserve">        cmp #STATE_BUSY</w:t>
-      </w:r>
-      <w:r>
-        <w:br/>
-        <w:t xml:space="preserve">        beq wait</w:t>
-      </w:r>
-      <w:r>
-        <w:br/>
-        <w:t xml:space="preserve">        cmp #STATE_LAST</w:t>
-      </w:r>
-      <w:r>
-        <w:br/>
-        <w:t xml:space="preserve">        bne protocol_error</w:t>
-      </w:r>
-      <w:r>
-        <w:br/>
-        <w:t xml:space="preserve">        lda #DATA_ACCEPT</w:t>
-      </w:r>
-      <w:r>
-        <w:br/>
-        <w:t xml:space="preserve">        sta UCI_CONTROL</w:t>
-      </w:r>
-      <w:r>
-        <w:br/>
-        <w:t xml:space="preserve">        rts</w:t>
-      </w:r>
-      <w:r>
-        <w:br/>
-      </w:r>
-      <w:r>
-        <w:br/>
-        <w:t>protocol_error:</w:t>
-      </w:r>
-      <w:r>
-        <w:br/>
-        <w:t xml:space="preserve">        ; Application-specific error handling goes here.</w:t>
-      </w:r>
-      <w:r>
-        <w:br/>
-        <w:t xml:space="preserve">        rts</w:t>
-      </w:r>
-    </w:p>
-    <w:p>
-      <w:pPr>
-        <w:pStyle w:val="Heading2"/>
-      </w:pPr>
-      <w:bookmarkStart w:id="35" w:name="assembly-read-all-16-colors"/>
-      <w:bookmarkStart w:id="36" w:name="_Toc237717315"/>
-      <w:bookmarkEnd w:id="33"/>
-      <w:r>
-        <w:t>6502 assembly: read all 16 colors</w:t>
-      </w:r>
-      <w:bookmarkEnd w:id="36"/>
-    </w:p>
-    <w:p>
-      <w:r>
-        <w:t xml:space="preserve">After STATE_LAST is reached, bit 7 of $DF1C </w:t>
-      </w:r>
-      <w:r>
-        <w:t>indicates that another response byte is available at $DF1E.</w:t>
-      </w:r>
-    </w:p>
-    <w:p>
-      <w:r>
-        <w:t>UCI_RESPONSE = $DF1E</w:t>
-      </w:r>
-      <w:r>
-        <w:br/>
-        <w:t>palette      = $C000          ; 48-byte application buffer</w:t>
-      </w:r>
-      <w:r>
-        <w:br/>
-      </w:r>
-      <w:r>
-        <w:br/>
-        <w:t>get_palette:</w:t>
-      </w:r>
-      <w:r>
-        <w:br/>
-        <w:t xml:space="preserve">        lda #$04</w:t>
-      </w:r>
-      <w:r>
-        <w:br/>
-        <w:t xml:space="preserve">        sta UCI_COMMAND</w:t>
-      </w:r>
-      <w:r>
-        <w:br/>
-        <w:t xml:space="preserve">        lda #$51              ; GET_PALETTE</w:t>
-      </w:r>
-      <w:r>
-        <w:br/>
-        <w:t xml:space="preserve">        sta UCI_COMMAND</w:t>
-      </w:r>
-      <w:r>
-        <w:br/>
-        <w:t xml:space="preserve">        lda #PUSH_CMD</w:t>
-      </w:r>
-      <w:r>
-        <w:br/>
-        <w:t xml:space="preserve">        sta UCI_CONTROL</w:t>
-      </w:r>
-      <w:r>
-        <w:br/>
-        <w:t>wait2: lda UCI_CONTROL</w:t>
-      </w:r>
-      <w:r>
-        <w:br/>
-      </w:r>
-      <w:r>
-        <w:lastRenderedPageBreak/>
-        <w:t xml:space="preserve">        and #STATE_MASK</w:t>
-      </w:r>
-      <w:r>
-        <w:br/>
-        <w:t xml:space="preserve">        cmp #STATE_BUSY</w:t>
-      </w:r>
-      <w:r>
-        <w:br/>
-        <w:t xml:space="preserve">        beq wait2</w:t>
-      </w:r>
-      <w:r>
-        <w:br/>
-        <w:t xml:space="preserve">        cmp #STATE_LAST</w:t>
-      </w:r>
-      <w:r>
-        <w:br/>
-        <w:t xml:space="preserve">        bne protocol_error</w:t>
-      </w:r>
-      <w:r>
-        <w:br/>
-        <w:t xml:space="preserve">        ldx #$00</w:t>
-      </w:r>
-      <w:r>
-        <w:br/>
-        <w:t>read:  lda UCI_CONTROL</w:t>
-      </w:r>
-      <w:r>
-        <w:br/>
-      </w:r>
-      <w:r>
-        <w:t xml:space="preserve">        bpl done              ; bit 7 clear: response queue empty</w:t>
-      </w:r>
-      <w:r>
-        <w:br/>
-        <w:t xml:space="preserve">        lda UCI_RESPONSE</w:t>
-      </w:r>
-      <w:r>
-        <w:br/>
-        <w:t xml:space="preserve">        sta palette,x</w:t>
-      </w:r>
-      <w:r>
-        <w:br/>
-        <w:t xml:space="preserve">        inx</w:t>
-      </w:r>
-      <w:r>
-        <w:br/>
-        <w:t xml:space="preserve">        bne read</w:t>
-      </w:r>
-      <w:r>
-        <w:br/>
-        <w:t>done:  cpx #48</w:t>
-      </w:r>
-      <w:r>
-        <w:br/>
-        <w:t xml:space="preserve">        bne protocol_error</w:t>
-      </w:r>
-      <w:r>
-        <w:br/>
-        <w:t xml:space="preserve">        lda #DATA_ACCEPT</w:t>
-      </w:r>
-      <w:r>
-        <w:br/>
-        <w:t xml:space="preserve">        sta UCI_CONTROL</w:t>
-      </w:r>
-      <w:r>
-        <w:br/>
-        <w:t xml:space="preserve">        rts</w:t>
-      </w:r>
-    </w:p>
-    <w:p>
-      <w:pPr>
-        <w:pStyle w:val="Heading2"/>
-      </w:pPr>
-      <w:bookmarkStart w:id="37" w:name="Xf9cbbc4790aa07470d7a908e110b501ef5efa3c"/>
-      <w:bookmarkStart w:id="38" w:name="_Toc237717316"/>
-      <w:bookmarkEnd w:id="35"/>
-      <w:r>
-        <w:t>Commodore BASIC V2: set one color, then reset</w:t>
-      </w:r>
-      <w:bookmarkEnd w:id="38"/>
-    </w:p>
-    <w:p>
-      <w:r>
-        <w:t xml:space="preserve">Stock BASIC has no built-in UCI statement, but it can access the UCI registers with POKE and PEEK. This complete example prints a banner in color 15, changes it to red, waits for a key, and then uses RESET_PALETTE </w:t>
-      </w:r>
-      <w:r>
-        <w:t>to return it to light gray.</w:t>
-      </w:r>
-    </w:p>
-    <w:p>
-      <w:r>
-        <w:t>10 C=57116:D=57117:T=57119</w:t>
-      </w:r>
-      <w:r>
-        <w:br/>
-        <w:t>20 IF PEEK(D)&lt;&gt;201 THEN PRINT "UCI NOT AVAILABLE":END</w:t>
-      </w:r>
-      <w:r>
-        <w:br/>
-        <w:t>25 PRINT CHR$(147):POKE 646,15:PRINT "COLOR 15: RED - PRESS A KEY"</w:t>
-      </w:r>
-      <w:r>
-        <w:br/>
-        <w:t>30 N=6:GOSUB 200</w:t>
-      </w:r>
-      <w:r>
-        <w:br/>
-        <w:t>50 GET K$:IF K$="" THEN 50</w:t>
-      </w:r>
-      <w:r>
-        <w:br/>
-        <w:t>60 N=0:GOSUB 200</w:t>
-      </w:r>
-      <w:r>
-        <w:br/>
-        <w:t>70 PRINT "DEFAULT PALETTE RESTORED":END</w:t>
-      </w:r>
-      <w:r>
-        <w:br/>
-        <w:t>100 DATA 4,83,15,255,0,0</w:t>
-      </w:r>
-      <w:r>
-        <w:br/>
-        <w:t>200 IF (PEEK(C) AND 48)&lt;&gt;0 THEN PRINT "UCI BUSY":END</w:t>
-      </w:r>
-      <w:r>
-        <w:br/>
-        <w:t>210 IF N=0 THEN POKE D,4:POKE D,84:GOTO 230</w:t>
-      </w:r>
-      <w:r>
-        <w:br/>
-        <w:t>220 FOR I=1 TO N:READ B:POKE D,B:NEXT</w:t>
-      </w:r>
-      <w:r>
-        <w:br/>
-        <w:t>230 POKE C,1</w:t>
-      </w:r>
-      <w:r>
-        <w:br/>
-        <w:t>240 S=PEEK(C) AND 48:IF S=16 THEN 240</w:t>
-      </w:r>
-      <w:r>
-        <w:br/>
-      </w:r>
-      <w:r>
-        <w:t>250 IF S&lt;&gt;32 THEN PRINT "UCI PROTOCOL ERROR":END</w:t>
-      </w:r>
-      <w:r>
-        <w:br/>
-        <w:t>260 A$=""</w:t>
-      </w:r>
-      <w:r>
-        <w:br/>
-        <w:t>270 IF (PEEK(C) AND 64)=0 THEN 290</w:t>
-      </w:r>
-      <w:r>
-        <w:br/>
-        <w:t>280 A$=A$+CHR$(PEEK(T)):GOTO 270</w:t>
-      </w:r>
-      <w:r>
-        <w:br/>
-        <w:t>290 POKE C,2:PRINT A$:RETURN</w:t>
-      </w:r>
-    </w:p>
-    <w:p>
-      <w:r>
-        <w:t xml:space="preserve">The repository also contains software/6502/cmd_test_rom.tas, an old test cartridge that installs an @ BASIC statement. With that test ROM active, the single-color command can be written as @ "$04$53$0F$FF$00$00". The @ </w:t>
-      </w:r>
-      <w:r>
-        <w:t>extension is not installed at the normal production BASIC prompt, so portable programs should use the register protocol above or install their own wedge.</w:t>
-      </w:r>
-      <w:bookmarkEnd w:id="31"/>
-      <w:bookmarkEnd w:id="37"/>
-    </w:p>
     <w:sectPr>
       <w:headerReference w:type="default" r:id="rId8"/>
       <w:footerReference w:type="default" r:id="rId9"/>
@@ -6288,7 +4778,7 @@
 </file>
 
 <file path=word/endnotes.xml><?xml version="1.0" encoding="utf-8"?>
-<w:endnotes xmlns:wpc="http://schemas.microsoft.com/office/word/2010/wordprocessingCanvas" xmlns:cx="http://schemas.microsoft.com/office/drawing/2014/chartex" xmlns:cx1="http://schemas.microsoft.com/office/drawing/2015/9/8/chartex" xmlns:cx2="http://schemas.microsoft.com/office/drawing/2015/10/21/chartex" xmlns:cx3="http://schemas.microsoft.com/office/drawing/2016/5/9/chartex" xmlns:cx4="http://schemas.microsoft.com/office/drawing/2016/5/10/chartex" xmlns:cx5="http://schemas.microsoft.com/office/drawing/2016/5/11/chartex" xmlns:cx6="http://schemas.microsoft.com/office/drawing/2016/5/12/chartex" xmlns:cx7="http://schemas.microsoft.com/office/drawing/2016/5/13/chartex" xmlns:cx8="http://schemas.microsoft.com/office/drawing/2016/5/14/chartex" xmlns:mc="http://schemas.openxmlformats.org/markup-compatibility/2006" xmlns:m="http://schemas.openxmlformats.org/officeDocument/2006/math" xmlns:aink="http://schemas.microsoft.com/office/drawing/2016/ink" xmlns:am3d="http://schemas.microsoft.com/office/drawing/2017/model3d" xmlns:oel="http://schemas.microsoft.com/office/2019/extlst" xmlns:r="http://schemas.openxmlformats.org/officeDocument/2006/relationships" xmlns:wp14="http://schemas.microsoft.com/office/word/2010/wordprocessingDrawing" xmlns:wp="http://schemas.openxmlformats.org/drawingml/2006/wordprocessingDrawing" xmlns:wpg="http://schemas.microsoft.com/office/word/2010/wordprocessingGroup" xmlns:wpi="http://schemas.microsoft.com/office/word/2010/wordprocessingInk" xmlns:wps="http://schemas.microsoft.com/office/word/2010/wordprocessingShape" xmlns:o="urn:schemas-microsoft-com:office:office" xmlns:v="urn:schemas-microsoft-com:vml" xmlns:w10="urn:schemas-microsoft-com:office:word" xmlns:w="http://schemas.openxmlformats.org/wordprocessingml/2006/main" xmlns:w14="http://schemas.microsoft.com/office/word/2010/wordml" xmlns:w15="http://schemas.microsoft.com/office/word/2012/wordml" xmlns:w16cex="http://schemas.microsoft.com/office/word/2018/wordml/cex" xmlns:w16cid="http://schemas.microsoft.com/office/word/2016/wordml/cid" xmlns:w16="http://schemas.microsoft.com/office/word/2018/wordml" xmlns:w16sdtdh="http://schemas.microsoft.com/office/word/2020/wordml/sdtdatahash" xmlns:w16sdtfl="http://schemas.microsoft.com/office/word/2024/wordml/sdtformatlock" xmlns:w16se="http://schemas.microsoft.com/office/word/2015/wordml/symex" xmlns:w16du="http://schemas.microsoft.com/office/word/2023/wordml/word16du" xmlns:wne="http://schemas.microsoft.com/office/word/2006/wordml" mc:Ignorable="w14 w15 w16se w16cid w16 w16cex w16sdtdh w16sdtfl w16du wp14">
+<w:endnotes xmlns:wpc="http://schemas.microsoft.com/office/word/2010/wordprocessingCanvas" xmlns:cx="http://schemas.microsoft.com/office/drawing/2014/chartex" xmlns:cx1="http://schemas.microsoft.com/office/drawing/2015/9/8/chartex" xmlns:cx2="http://schemas.microsoft.com/office/drawing/2015/10/21/chartex" xmlns:cx3="http://schemas.microsoft.com/office/drawing/2016/5/9/chartex" xmlns:cx4="http://schemas.microsoft.com/office/drawing/2016/5/10/chartex" xmlns:cx5="http://schemas.microsoft.com/office/drawing/2016/5/11/chartex" xmlns:cx6="http://schemas.microsoft.com/office/drawing/2016/5/12/chartex" xmlns:cx7="http://schemas.microsoft.com/office/drawing/2016/5/13/chartex" xmlns:cx8="http://schemas.microsoft.com/office/drawing/2016/5/14/chartex" xmlns:mc="http://schemas.openxmlformats.org/markup-compatibility/2006" xmlns:aink="http://schemas.microsoft.com/office/drawing/2016/ink" xmlns:am3d="http://schemas.microsoft.com/office/drawing/2017/model3d" xmlns:o="urn:schemas-microsoft-com:office:office" xmlns:oel="http://schemas.microsoft.com/office/2019/extlst" xmlns:r="http://schemas.openxmlformats.org/officeDocument/2006/relationships" xmlns:m="http://schemas.openxmlformats.org/officeDocument/2006/math" xmlns:v="urn:schemas-microsoft-com:vml" xmlns:wp14="http://schemas.microsoft.com/office/word/2010/wordprocessingDrawing" xmlns:wp="http://schemas.openxmlformats.org/drawingml/2006/wordprocessingDrawing" xmlns:w10="urn:schemas-microsoft-com:office:word" xmlns:w="http://schemas.openxmlformats.org/wordprocessingml/2006/main" xmlns:w14="http://schemas.microsoft.com/office/word/2010/wordml" xmlns:w15="http://schemas.microsoft.com/office/word/2012/wordml" xmlns:w16cex="http://schemas.microsoft.com/office/word/2018/wordml/cex" xmlns:w16cid="http://schemas.microsoft.com/office/word/2016/wordml/cid" xmlns:w16="http://schemas.microsoft.com/office/word/2018/wordml" xmlns:w16sdtdh="http://schemas.microsoft.com/office/word/2020/wordml/sdtdatahash" xmlns:w16se="http://schemas.microsoft.com/office/word/2015/wordml/symex" xmlns:wpg="http://schemas.microsoft.com/office/word/2010/wordprocessingGroup" xmlns:wpi="http://schemas.microsoft.com/office/word/2010/wordprocessingInk" xmlns:wne="http://schemas.microsoft.com/office/word/2006/wordml" xmlns:wps="http://schemas.microsoft.com/office/word/2010/wordprocessingShape" mc:Ignorable="w14 w15 w16se w16cid w16 w16cex w16sdtdh wp14">
   <w:endnote w:type="separator" w:id="-1">
     <w:p>
       <w:pPr>
@@ -6313,7 +4803,7 @@
 </file>
 
 <file path=word/footer1.xml><?xml version="1.0" encoding="utf-8"?>
-<w:ftr xmlns:wpc="http://schemas.microsoft.com/office/word/2010/wordprocessingCanvas" xmlns:cx="http://schemas.microsoft.com/office/drawing/2014/chartex" xmlns:cx1="http://schemas.microsoft.com/office/drawing/2015/9/8/chartex" xmlns:cx2="http://schemas.microsoft.com/office/drawing/2015/10/21/chartex" xmlns:cx3="http://schemas.microsoft.com/office/drawing/2016/5/9/chartex" xmlns:cx4="http://schemas.microsoft.com/office/drawing/2016/5/10/chartex" xmlns:cx5="http://schemas.microsoft.com/office/drawing/2016/5/11/chartex" xmlns:cx6="http://schemas.microsoft.com/office/drawing/2016/5/12/chartex" xmlns:cx7="http://schemas.microsoft.com/office/drawing/2016/5/13/chartex" xmlns:cx8="http://schemas.microsoft.com/office/drawing/2016/5/14/chartex" xmlns:mc="http://schemas.openxmlformats.org/markup-compatibility/2006" xmlns:m="http://schemas.openxmlformats.org/officeDocument/2006/math" xmlns:aink="http://schemas.microsoft.com/office/drawing/2016/ink" xmlns:am3d="http://schemas.microsoft.com/office/drawing/2017/model3d" xmlns:oel="http://schemas.microsoft.com/office/2019/extlst" xmlns:r="http://schemas.openxmlformats.org/officeDocument/2006/relationships" xmlns:wp14="http://schemas.microsoft.com/office/word/2010/wordprocessingDrawing" xmlns:wp="http://schemas.openxmlformats.org/drawingml/2006/wordprocessingDrawing" xmlns:wpg="http://schemas.microsoft.com/office/word/2010/wordprocessingGroup" xmlns:wpi="http://schemas.microsoft.com/office/word/2010/wordprocessingInk" xmlns:wps="http://schemas.microsoft.com/office/word/2010/wordprocessingShape" xmlns:o="urn:schemas-microsoft-com:office:office" xmlns:v="urn:schemas-microsoft-com:vml" xmlns:w10="urn:schemas-microsoft-com:office:word" xmlns:w="http://schemas.openxmlformats.org/wordprocessingml/2006/main" xmlns:w14="http://schemas.microsoft.com/office/word/2010/wordml" xmlns:w15="http://schemas.microsoft.com/office/word/2012/wordml" xmlns:w16cex="http://schemas.microsoft.com/office/word/2018/wordml/cex" xmlns:w16cid="http://schemas.microsoft.com/office/word/2016/wordml/cid" xmlns:w16="http://schemas.microsoft.com/office/word/2018/wordml" xmlns:w16sdtdh="http://schemas.microsoft.com/office/word/2020/wordml/sdtdatahash" xmlns:w16sdtfl="http://schemas.microsoft.com/office/word/2024/wordml/sdtformatlock" xmlns:w16se="http://schemas.microsoft.com/office/word/2015/wordml/symex" xmlns:w16du="http://schemas.microsoft.com/office/word/2023/wordml/word16du" xmlns:wne="http://schemas.microsoft.com/office/word/2006/wordml" mc:Ignorable="w14 w15 w16se w16cid w16 w16cex w16sdtdh w16sdtfl w16du wp14">
+<w:ftr xmlns:wpc="http://schemas.microsoft.com/office/word/2010/wordprocessingCanvas" xmlns:cx="http://schemas.microsoft.com/office/drawing/2014/chartex" xmlns:cx1="http://schemas.microsoft.com/office/drawing/2015/9/8/chartex" xmlns:cx2="http://schemas.microsoft.com/office/drawing/2015/10/21/chartex" xmlns:cx3="http://schemas.microsoft.com/office/drawing/2016/5/9/chartex" xmlns:cx4="http://schemas.microsoft.com/office/drawing/2016/5/10/chartex" xmlns:cx5="http://schemas.microsoft.com/office/drawing/2016/5/11/chartex" xmlns:cx6="http://schemas.microsoft.com/office/drawing/2016/5/12/chartex" xmlns:cx7="http://schemas.microsoft.com/office/drawing/2016/5/13/chartex" xmlns:cx8="http://schemas.microsoft.com/office/drawing/2016/5/14/chartex" xmlns:mc="http://schemas.openxmlformats.org/markup-compatibility/2006" xmlns:aink="http://schemas.microsoft.com/office/drawing/2016/ink" xmlns:am3d="http://schemas.microsoft.com/office/drawing/2017/model3d" xmlns:o="urn:schemas-microsoft-com:office:office" xmlns:oel="http://schemas.microsoft.com/office/2019/extlst" xmlns:r="http://schemas.openxmlformats.org/officeDocument/2006/relationships" xmlns:m="http://schemas.openxmlformats.org/officeDocument/2006/math" xmlns:v="urn:schemas-microsoft-com:vml" xmlns:wp14="http://schemas.microsoft.com/office/word/2010/wordprocessingDrawing" xmlns:wp="http://schemas.openxmlformats.org/drawingml/2006/wordprocessingDrawing" xmlns:w10="urn:schemas-microsoft-com:office:word" xmlns:w="http://schemas.openxmlformats.org/wordprocessingml/2006/main" xmlns:w14="http://schemas.microsoft.com/office/word/2010/wordml" xmlns:w15="http://schemas.microsoft.com/office/word/2012/wordml" xmlns:w16cex="http://schemas.microsoft.com/office/word/2018/wordml/cex" xmlns:w16cid="http://schemas.microsoft.com/office/word/2016/wordml/cid" xmlns:w16="http://schemas.microsoft.com/office/word/2018/wordml" xmlns:w16sdtdh="http://schemas.microsoft.com/office/word/2020/wordml/sdtdatahash" xmlns:w16se="http://schemas.microsoft.com/office/word/2015/wordml/symex" xmlns:wpg="http://schemas.microsoft.com/office/word/2010/wordprocessingGroup" xmlns:wpi="http://schemas.microsoft.com/office/word/2010/wordprocessingInk" xmlns:wne="http://schemas.microsoft.com/office/word/2006/wordml" xmlns:wps="http://schemas.microsoft.com/office/word/2010/wordprocessingShape" mc:Ignorable="w14 w15 w16se w16cid w16 w16cex w16sdtdh wp14">
   <w:p>
     <w:pPr>
       <w:pStyle w:val="Footer"/>
@@ -6353,7 +4843,31 @@
             </w:r>
           </w:fldSimple>
           <w:r>
-            <w:t>, August 15, 2026</w:t>
+            <w:rPr>
+              <w:bCs/>
+            </w:rPr>
+            <w:t xml:space="preserve">, </w:t>
+          </w:r>
+          <w:r>
+            <w:t xml:space="preserve"> </w:t>
+          </w:r>
+          <w:r>
+            <w:t xml:space="preserve">March </w:t>
+          </w:r>
+          <w:r>
+            <w:t>1</w:t>
+          </w:r>
+          <w:r>
+            <w:t>4</w:t>
+          </w:r>
+          <w:r>
+            <w:t>,</w:t>
+          </w:r>
+          <w:r>
+            <w:t xml:space="preserve"> 20</w:t>
+          </w:r>
+          <w:r>
+            <w:t>26</w:t>
           </w:r>
         </w:p>
       </w:tc>
@@ -6422,7 +4936,7 @@
 </file>
 
 <file path=word/footnotes.xml><?xml version="1.0" encoding="utf-8"?>
-<w:footnotes xmlns:wpc="http://schemas.microsoft.com/office/word/2010/wordprocessingCanvas" xmlns:cx="http://schemas.microsoft.com/office/drawing/2014/chartex" xmlns:cx1="http://schemas.microsoft.com/office/drawing/2015/9/8/chartex" xmlns:cx2="http://schemas.microsoft.com/office/drawing/2015/10/21/chartex" xmlns:cx3="http://schemas.microsoft.com/office/drawing/2016/5/9/chartex" xmlns:cx4="http://schemas.microsoft.com/office/drawing/2016/5/10/chartex" xmlns:cx5="http://schemas.microsoft.com/office/drawing/2016/5/11/chartex" xmlns:cx6="http://schemas.microsoft.com/office/drawing/2016/5/12/chartex" xmlns:cx7="http://schemas.microsoft.com/office/drawing/2016/5/13/chartex" xmlns:cx8="http://schemas.microsoft.com/office/drawing/2016/5/14/chartex" xmlns:mc="http://schemas.openxmlformats.org/markup-compatibility/2006" xmlns:m="http://schemas.openxmlformats.org/officeDocument/2006/math" xmlns:aink="http://schemas.microsoft.com/office/drawing/2016/ink" xmlns:am3d="http://schemas.microsoft.com/office/drawing/2017/model3d" xmlns:oel="http://schemas.microsoft.com/office/2019/extlst" xmlns:r="http://schemas.openxmlformats.org/officeDocument/2006/relationships" xmlns:wp14="http://schemas.microsoft.com/office/word/2010/wordprocessingDrawing" xmlns:wp="http://schemas.openxmlformats.org/drawingml/2006/wordprocessingDrawing" xmlns:wpg="http://schemas.microsoft.com/office/word/2010/wordprocessingGroup" xmlns:wpi="http://schemas.microsoft.com/office/word/2010/wordprocessingInk" xmlns:wps="http://schemas.microsoft.com/office/word/2010/wordprocessingShape" xmlns:o="urn:schemas-microsoft-com:office:office" xmlns:v="urn:schemas-microsoft-com:vml" xmlns:w10="urn:schemas-microsoft-com:office:word" xmlns:w="http://schemas.openxmlformats.org/wordprocessingml/2006/main" xmlns:w14="http://schemas.microsoft.com/office/word/2010/wordml" xmlns:w15="http://schemas.microsoft.com/office/word/2012/wordml" xmlns:w16cex="http://schemas.microsoft.com/office/word/2018/wordml/cex" xmlns:w16cid="http://schemas.microsoft.com/office/word/2016/wordml/cid" xmlns:w16="http://schemas.microsoft.com/office/word/2018/wordml" xmlns:w16sdtdh="http://schemas.microsoft.com/office/word/2020/wordml/sdtdatahash" xmlns:w16sdtfl="http://schemas.microsoft.com/office/word/2024/wordml/sdtformatlock" xmlns:w16se="http://schemas.microsoft.com/office/word/2015/wordml/symex" xmlns:w16du="http://schemas.microsoft.com/office/word/2023/wordml/word16du" xmlns:wne="http://schemas.microsoft.com/office/word/2006/wordml" mc:Ignorable="w14 w15 w16se w16cid w16 w16cex w16sdtdh w16sdtfl w16du wp14">
+<w:footnotes xmlns:wpc="http://schemas.microsoft.com/office/word/2010/wordprocessingCanvas" xmlns:cx="http://schemas.microsoft.com/office/drawing/2014/chartex" xmlns:cx1="http://schemas.microsoft.com/office/drawing/2015/9/8/chartex" xmlns:cx2="http://schemas.microsoft.com/office/drawing/2015/10/21/chartex" xmlns:cx3="http://schemas.microsoft.com/office/drawing/2016/5/9/chartex" xmlns:cx4="http://schemas.microsoft.com/office/drawing/2016/5/10/chartex" xmlns:cx5="http://schemas.microsoft.com/office/drawing/2016/5/11/chartex" xmlns:cx6="http://schemas.microsoft.com/office/drawing/2016/5/12/chartex" xmlns:cx7="http://schemas.microsoft.com/office/drawing/2016/5/13/chartex" xmlns:cx8="http://schemas.microsoft.com/office/drawing/2016/5/14/chartex" xmlns:mc="http://schemas.openxmlformats.org/markup-compatibility/2006" xmlns:aink="http://schemas.microsoft.com/office/drawing/2016/ink" xmlns:am3d="http://schemas.microsoft.com/office/drawing/2017/model3d" xmlns:o="urn:schemas-microsoft-com:office:office" xmlns:oel="http://schemas.microsoft.com/office/2019/extlst" xmlns:r="http://schemas.openxmlformats.org/officeDocument/2006/relationships" xmlns:m="http://schemas.openxmlformats.org/officeDocument/2006/math" xmlns:v="urn:schemas-microsoft-com:vml" xmlns:wp14="http://schemas.microsoft.com/office/word/2010/wordprocessingDrawing" xmlns:wp="http://schemas.openxmlformats.org/drawingml/2006/wordprocessingDrawing" xmlns:w10="urn:schemas-microsoft-com:office:word" xmlns:w="http://schemas.openxmlformats.org/wordprocessingml/2006/main" xmlns:w14="http://schemas.microsoft.com/office/word/2010/wordml" xmlns:w15="http://schemas.microsoft.com/office/word/2012/wordml" xmlns:w16cex="http://schemas.microsoft.com/office/word/2018/wordml/cex" xmlns:w16cid="http://schemas.microsoft.com/office/word/2016/wordml/cid" xmlns:w16="http://schemas.microsoft.com/office/word/2018/wordml" xmlns:w16sdtdh="http://schemas.microsoft.com/office/word/2020/wordml/sdtdatahash" xmlns:w16se="http://schemas.microsoft.com/office/word/2015/wordml/symex" xmlns:wpg="http://schemas.microsoft.com/office/word/2010/wordprocessingGroup" xmlns:wpi="http://schemas.microsoft.com/office/word/2010/wordprocessingInk" xmlns:wne="http://schemas.microsoft.com/office/word/2006/wordml" xmlns:wps="http://schemas.microsoft.com/office/word/2010/wordprocessingShape" mc:Ignorable="w14 w15 w16se w16cid w16 w16cex w16sdtdh wp14">
   <w:footnote w:type="separator" w:id="-1">
     <w:p>
       <w:pPr>
@@ -6447,7 +4961,7 @@
 </file>
 
 <file path=word/header1.xml><?xml version="1.0" encoding="utf-8"?>
-<w:hdr xmlns:wpc="http://schemas.microsoft.com/office/word/2010/wordprocessingCanvas" xmlns:cx="http://schemas.microsoft.com/office/drawing/2014/chartex" xmlns:cx1="http://schemas.microsoft.com/office/drawing/2015/9/8/chartex" xmlns:cx2="http://schemas.microsoft.com/office/drawing/2015/10/21/chartex" xmlns:cx3="http://schemas.microsoft.com/office/drawing/2016/5/9/chartex" xmlns:cx4="http://schemas.microsoft.com/office/drawing/2016/5/10/chartex" xmlns:cx5="http://schemas.microsoft.com/office/drawing/2016/5/11/chartex" xmlns:cx6="http://schemas.microsoft.com/office/drawing/2016/5/12/chartex" xmlns:cx7="http://schemas.microsoft.com/office/drawing/2016/5/13/chartex" xmlns:cx8="http://schemas.microsoft.com/office/drawing/2016/5/14/chartex" xmlns:mc="http://schemas.openxmlformats.org/markup-compatibility/2006" xmlns:m="http://schemas.openxmlformats.org/officeDocument/2006/math" xmlns:aink="http://schemas.microsoft.com/office/drawing/2016/ink" xmlns:am3d="http://schemas.microsoft.com/office/drawing/2017/model3d" xmlns:oel="http://schemas.microsoft.com/office/2019/extlst" xmlns:r="http://schemas.openxmlformats.org/officeDocument/2006/relationships" xmlns:wp14="http://schemas.microsoft.com/office/word/2010/wordprocessingDrawing" xmlns:wp="http://schemas.openxmlformats.org/drawingml/2006/wordprocessingDrawing" xmlns:wpg="http://schemas.microsoft.com/office/word/2010/wordprocessingGroup" xmlns:wpi="http://schemas.microsoft.com/office/word/2010/wordprocessingInk" xmlns:wps="http://schemas.microsoft.com/office/word/2010/wordprocessingShape" xmlns:o="urn:schemas-microsoft-com:office:office" xmlns:v="urn:schemas-microsoft-com:vml" xmlns:w10="urn:schemas-microsoft-com:office:word" xmlns:w="http://schemas.openxmlformats.org/wordprocessingml/2006/main" xmlns:w14="http://schemas.microsoft.com/office/word/2010/wordml" xmlns:w15="http://schemas.microsoft.com/office/word/2012/wordml" xmlns:w16cex="http://schemas.microsoft.com/office/word/2018/wordml/cex" xmlns:w16cid="http://schemas.microsoft.com/office/word/2016/wordml/cid" xmlns:w16="http://schemas.microsoft.com/office/word/2018/wordml" xmlns:w16sdtdh="http://schemas.microsoft.com/office/word/2020/wordml/sdtdatahash" xmlns:w16sdtfl="http://schemas.microsoft.com/office/word/2024/wordml/sdtformatlock" xmlns:w16se="http://schemas.microsoft.com/office/word/2015/wordml/symex" xmlns:w16du="http://schemas.microsoft.com/office/word/2023/wordml/word16du" xmlns:wne="http://schemas.microsoft.com/office/word/2006/wordml" mc:Ignorable="w14 w15 w16se w16cid w16 w16cex w16sdtdh w16sdtfl w16du wp14">
+<w:hdr xmlns:wpc="http://schemas.microsoft.com/office/word/2010/wordprocessingCanvas" xmlns:cx="http://schemas.microsoft.com/office/drawing/2014/chartex" xmlns:cx1="http://schemas.microsoft.com/office/drawing/2015/9/8/chartex" xmlns:cx2="http://schemas.microsoft.com/office/drawing/2015/10/21/chartex" xmlns:cx3="http://schemas.microsoft.com/office/drawing/2016/5/9/chartex" xmlns:cx4="http://schemas.microsoft.com/office/drawing/2016/5/10/chartex" xmlns:cx5="http://schemas.microsoft.com/office/drawing/2016/5/11/chartex" xmlns:cx6="http://schemas.microsoft.com/office/drawing/2016/5/12/chartex" xmlns:cx7="http://schemas.microsoft.com/office/drawing/2016/5/13/chartex" xmlns:cx8="http://schemas.microsoft.com/office/drawing/2016/5/14/chartex" xmlns:mc="http://schemas.openxmlformats.org/markup-compatibility/2006" xmlns:aink="http://schemas.microsoft.com/office/drawing/2016/ink" xmlns:am3d="http://schemas.microsoft.com/office/drawing/2017/model3d" xmlns:o="urn:schemas-microsoft-com:office:office" xmlns:oel="http://schemas.microsoft.com/office/2019/extlst" xmlns:r="http://schemas.openxmlformats.org/officeDocument/2006/relationships" xmlns:m="http://schemas.openxmlformats.org/officeDocument/2006/math" xmlns:v="urn:schemas-microsoft-com:vml" xmlns:wp14="http://schemas.microsoft.com/office/word/2010/wordprocessingDrawing" xmlns:wp="http://schemas.openxmlformats.org/drawingml/2006/wordprocessingDrawing" xmlns:w10="urn:schemas-microsoft-com:office:word" xmlns:w="http://schemas.openxmlformats.org/wordprocessingml/2006/main" xmlns:w14="http://schemas.microsoft.com/office/word/2010/wordml" xmlns:w15="http://schemas.microsoft.com/office/word/2012/wordml" xmlns:w16cex="http://schemas.microsoft.com/office/word/2018/wordml/cex" xmlns:w16cid="http://schemas.microsoft.com/office/word/2016/wordml/cid" xmlns:w16="http://schemas.microsoft.com/office/word/2018/wordml" xmlns:w16sdtdh="http://schemas.microsoft.com/office/word/2020/wordml/sdtdatahash" xmlns:w16se="http://schemas.microsoft.com/office/word/2015/wordml/symex" xmlns:wpg="http://schemas.microsoft.com/office/word/2010/wordprocessingGroup" xmlns:wpi="http://schemas.microsoft.com/office/word/2010/wordprocessingInk" xmlns:wne="http://schemas.microsoft.com/office/word/2006/wordml" xmlns:wps="http://schemas.microsoft.com/office/word/2010/wordprocessingShape" mc:Ignorable="w14 w15 w16se w16cid w16 w16cex w16sdtdh wp14">
   <w:tbl>
     <w:tblPr>
       <w:tblStyle w:val="TableGrid"/>
@@ -6480,7 +4994,6 @@
               <w:dataBinding w:prefixMappings="xmlns:ns0='http://schemas.openxmlformats.org/package/2006/metadata/core-properties' xmlns:ns1='http://purl.org/dc/elements/1.1/'" w:xpath="/ns0:coreProperties[1]/ns1:title[1]" w:storeItemID="{6C3C8BC8-F283-45AE-878A-BAB7291924A1}"/>
               <w:text/>
             </w:sdtPr>
-            <w:sdtEndPr/>
             <w:sdtContent>
               <w:r>
                 <w:t>UCI Control Target</w:t>
@@ -6510,7 +5023,6 @@
               <w:dataBinding w:prefixMappings="xmlns:ns0='http://schemas.openxmlformats.org/package/2006/metadata/core-properties' xmlns:ns1='http://purl.org/dc/elements/1.1/'" w:xpath="/ns0:coreProperties[1]/ns1:subject[1]" w:storeItemID="{6C3C8BC8-F283-45AE-878A-BAB7291924A1}"/>
               <w:text/>
             </w:sdtPr>
-            <w:sdtEndPr/>
             <w:sdtContent>
               <w:r>
                 <w:t>Command Summary</w:t>
@@ -6530,7 +5042,7 @@
 </file>
 
 <file path=word/numbering.xml><?xml version="1.0" encoding="utf-8"?>
-<w:numbering xmlns:wpc="http://schemas.microsoft.com/office/word/2010/wordprocessingCanvas" xmlns:cx="http://schemas.microsoft.com/office/drawing/2014/chartex" xmlns:cx1="http://schemas.microsoft.com/office/drawing/2015/9/8/chartex" xmlns:cx2="http://schemas.microsoft.com/office/drawing/2015/10/21/chartex" xmlns:cx3="http://schemas.microsoft.com/office/drawing/2016/5/9/chartex" xmlns:cx4="http://schemas.microsoft.com/office/drawing/2016/5/10/chartex" xmlns:cx5="http://schemas.microsoft.com/office/drawing/2016/5/11/chartex" xmlns:cx6="http://schemas.microsoft.com/office/drawing/2016/5/12/chartex" xmlns:cx7="http://schemas.microsoft.com/office/drawing/2016/5/13/chartex" xmlns:cx8="http://schemas.microsoft.com/office/drawing/2016/5/14/chartex" xmlns:mc="http://schemas.openxmlformats.org/markup-compatibility/2006" xmlns:m="http://schemas.openxmlformats.org/officeDocument/2006/math" xmlns:aink="http://schemas.microsoft.com/office/drawing/2016/ink" xmlns:am3d="http://schemas.microsoft.com/office/drawing/2017/model3d" xmlns:oel="http://schemas.microsoft.com/office/2019/extlst" xmlns:r="http://schemas.openxmlformats.org/officeDocument/2006/relationships" xmlns:wp14="http://schemas.microsoft.com/office/word/2010/wordprocessingDrawing" xmlns:wp="http://schemas.openxmlformats.org/drawingml/2006/wordprocessingDrawing" xmlns:wpg="http://schemas.microsoft.com/office/word/2010/wordprocessingGroup" xmlns:wpi="http://schemas.microsoft.com/office/word/2010/wordprocessingInk" xmlns:wps="http://schemas.microsoft.com/office/word/2010/wordprocessingShape" xmlns:o="urn:schemas-microsoft-com:office:office" xmlns:v="urn:schemas-microsoft-com:vml" xmlns:w10="urn:schemas-microsoft-com:office:word" xmlns:w="http://schemas.openxmlformats.org/wordprocessingml/2006/main" xmlns:w14="http://schemas.microsoft.com/office/word/2010/wordml" xmlns:w15="http://schemas.microsoft.com/office/word/2012/wordml" xmlns:w16cex="http://schemas.microsoft.com/office/word/2018/wordml/cex" xmlns:w16cid="http://schemas.microsoft.com/office/word/2016/wordml/cid" xmlns:w16="http://schemas.microsoft.com/office/word/2018/wordml" xmlns:w16sdtdh="http://schemas.microsoft.com/office/word/2020/wordml/sdtdatahash" xmlns:w16sdtfl="http://schemas.microsoft.com/office/word/2024/wordml/sdtformatlock" xmlns:w16se="http://schemas.microsoft.com/office/word/2015/wordml/symex" xmlns:w16du="http://schemas.microsoft.com/office/word/2023/wordml/word16du" xmlns:wne="http://schemas.microsoft.com/office/word/2006/wordml" mc:Ignorable="w14 w15 w16se w16cid w16 w16cex w16sdtdh w16sdtfl w16du wp14">
+<w:numbering xmlns:wpc="http://schemas.microsoft.com/office/word/2010/wordprocessingCanvas" xmlns:cx="http://schemas.microsoft.com/office/drawing/2014/chartex" xmlns:cx1="http://schemas.microsoft.com/office/drawing/2015/9/8/chartex" xmlns:cx2="http://schemas.microsoft.com/office/drawing/2015/10/21/chartex" xmlns:cx3="http://schemas.microsoft.com/office/drawing/2016/5/9/chartex" xmlns:cx4="http://schemas.microsoft.com/office/drawing/2016/5/10/chartex" xmlns:cx5="http://schemas.microsoft.com/office/drawing/2016/5/11/chartex" xmlns:cx6="http://schemas.microsoft.com/office/drawing/2016/5/12/chartex" xmlns:cx7="http://schemas.microsoft.com/office/drawing/2016/5/13/chartex" xmlns:cx8="http://schemas.microsoft.com/office/drawing/2016/5/14/chartex" xmlns:mc="http://schemas.openxmlformats.org/markup-compatibility/2006" xmlns:aink="http://schemas.microsoft.com/office/drawing/2016/ink" xmlns:am3d="http://schemas.microsoft.com/office/drawing/2017/model3d" xmlns:o="urn:schemas-microsoft-com:office:office" xmlns:oel="http://schemas.microsoft.com/office/2019/extlst" xmlns:r="http://schemas.openxmlformats.org/officeDocument/2006/relationships" xmlns:m="http://schemas.openxmlformats.org/officeDocument/2006/math" xmlns:v="urn:schemas-microsoft-com:vml" xmlns:wp14="http://schemas.microsoft.com/office/word/2010/wordprocessingDrawing" xmlns:wp="http://schemas.openxmlformats.org/drawingml/2006/wordprocessingDrawing" xmlns:w10="urn:schemas-microsoft-com:office:word" xmlns:w="http://schemas.openxmlformats.org/wordprocessingml/2006/main" xmlns:w14="http://schemas.microsoft.com/office/word/2010/wordml" xmlns:w15="http://schemas.microsoft.com/office/word/2012/wordml" xmlns:w16cex="http://schemas.microsoft.com/office/word/2018/wordml/cex" xmlns:w16cid="http://schemas.microsoft.com/office/word/2016/wordml/cid" xmlns:w16="http://schemas.microsoft.com/office/word/2018/wordml" xmlns:w16sdtdh="http://schemas.microsoft.com/office/word/2020/wordml/sdtdatahash" xmlns:w16se="http://schemas.microsoft.com/office/word/2015/wordml/symex" xmlns:wpg="http://schemas.microsoft.com/office/word/2010/wordprocessingGroup" xmlns:wpi="http://schemas.microsoft.com/office/word/2010/wordprocessingInk" xmlns:wne="http://schemas.microsoft.com/office/word/2006/wordml" xmlns:wps="http://schemas.microsoft.com/office/word/2010/wordprocessingShape" mc:Ignorable="w14 w15 w16se w16cid w16 w16cex w16sdtdh wp14">
   <w:abstractNum w:abstractNumId="0" w15:restartNumberingAfterBreak="0">
     <w:nsid w:val="028E418D"/>
     <w:multiLevelType w:val="multilevel"/>
@@ -7241,119 +5753,6 @@
     </w:lvl>
   </w:abstractNum>
   <w:abstractNum w:abstractNumId="5" w15:restartNumberingAfterBreak="0">
-    <w:nsid w:val="0E0F7FD4"/>
-    <w:multiLevelType w:val="multilevel"/>
-    <w:tmpl w:val="655263FA"/>
-    <w:lvl w:ilvl="0">
-      <w:start w:val="1"/>
-      <w:numFmt w:val="decimal"/>
-      <w:lvlText w:val="%1."/>
-      <w:lvlJc w:val="left"/>
-      <w:pPr>
-        <w:tabs>
-          <w:tab w:val="num" w:pos="720"/>
-        </w:tabs>
-        <w:ind w:left="720" w:hanging="720"/>
-      </w:pPr>
-    </w:lvl>
-    <w:lvl w:ilvl="1">
-      <w:start w:val="1"/>
-      <w:numFmt w:val="decimal"/>
-      <w:lvlText w:val="%2."/>
-      <w:lvlJc w:val="left"/>
-      <w:pPr>
-        <w:tabs>
-          <w:tab w:val="num" w:pos="1440"/>
-        </w:tabs>
-        <w:ind w:left="1440" w:hanging="720"/>
-      </w:pPr>
-    </w:lvl>
-    <w:lvl w:ilvl="2">
-      <w:start w:val="1"/>
-      <w:numFmt w:val="decimal"/>
-      <w:lvlText w:val="%3."/>
-      <w:lvlJc w:val="left"/>
-      <w:pPr>
-        <w:tabs>
-          <w:tab w:val="num" w:pos="2160"/>
-        </w:tabs>
-        <w:ind w:left="2160" w:hanging="720"/>
-      </w:pPr>
-    </w:lvl>
-    <w:lvl w:ilvl="3">
-      <w:start w:val="1"/>
-      <w:numFmt w:val="decimal"/>
-      <w:lvlText w:val="%4."/>
-      <w:lvlJc w:val="left"/>
-      <w:pPr>
-        <w:tabs>
-          <w:tab w:val="num" w:pos="2880"/>
-        </w:tabs>
-        <w:ind w:left="2880" w:hanging="720"/>
-      </w:pPr>
-    </w:lvl>
-    <w:lvl w:ilvl="4">
-      <w:start w:val="1"/>
-      <w:numFmt w:val="decimal"/>
-      <w:lvlText w:val="%5."/>
-      <w:lvlJc w:val="left"/>
-      <w:pPr>
-        <w:tabs>
-          <w:tab w:val="num" w:pos="3600"/>
-        </w:tabs>
-        <w:ind w:left="3600" w:hanging="720"/>
-      </w:pPr>
-    </w:lvl>
-    <w:lvl w:ilvl="5">
-      <w:start w:val="1"/>
-      <w:numFmt w:val="decimal"/>
-      <w:lvlText w:val="%6."/>
-      <w:lvlJc w:val="left"/>
-      <w:pPr>
-        <w:tabs>
-          <w:tab w:val="num" w:pos="4320"/>
-        </w:tabs>
-        <w:ind w:left="4320" w:hanging="720"/>
-      </w:pPr>
-    </w:lvl>
-    <w:lvl w:ilvl="6">
-      <w:start w:val="1"/>
-      <w:numFmt w:val="decimal"/>
-      <w:lvlText w:val="%7."/>
-      <w:lvlJc w:val="left"/>
-      <w:pPr>
-        <w:tabs>
-          <w:tab w:val="num" w:pos="5040"/>
-        </w:tabs>
-        <w:ind w:left="5040" w:hanging="720"/>
-      </w:pPr>
-    </w:lvl>
-    <w:lvl w:ilvl="7">
-      <w:start w:val="1"/>
-      <w:numFmt w:val="decimal"/>
-      <w:lvlText w:val="%8."/>
-      <w:lvlJc w:val="left"/>
-      <w:pPr>
-        <w:tabs>
-          <w:tab w:val="num" w:pos="5760"/>
-        </w:tabs>
-        <w:ind w:left="5760" w:hanging="720"/>
-      </w:pPr>
-    </w:lvl>
-    <w:lvl w:ilvl="8">
-      <w:start w:val="1"/>
-      <w:numFmt w:val="decimal"/>
-      <w:lvlText w:val="%9."/>
-      <w:lvlJc w:val="left"/>
-      <w:pPr>
-        <w:tabs>
-          <w:tab w:val="num" w:pos="6480"/>
-        </w:tabs>
-        <w:ind w:left="6480" w:hanging="720"/>
-      </w:pPr>
-    </w:lvl>
-  </w:abstractNum>
-  <w:abstractNum w:abstractNumId="6" w15:restartNumberingAfterBreak="0">
     <w:nsid w:val="104B48DA"/>
     <w:multiLevelType w:val="multilevel"/>
     <w:tmpl w:val="4586ACB8"/>
@@ -7502,7 +5901,7 @@
       </w:rPr>
     </w:lvl>
   </w:abstractNum>
-  <w:abstractNum w:abstractNumId="7" w15:restartNumberingAfterBreak="0">
+  <w:abstractNum w:abstractNumId="6" w15:restartNumberingAfterBreak="0">
     <w:nsid w:val="10A070FA"/>
     <w:multiLevelType w:val="hybridMultilevel"/>
     <w:tmpl w:val="F7A8763C"/>
@@ -7615,7 +6014,7 @@
       </w:rPr>
     </w:lvl>
   </w:abstractNum>
-  <w:abstractNum w:abstractNumId="8" w15:restartNumberingAfterBreak="0">
+  <w:abstractNum w:abstractNumId="7" w15:restartNumberingAfterBreak="0">
     <w:nsid w:val="17536D8F"/>
     <w:multiLevelType w:val="multilevel"/>
     <w:tmpl w:val="CED2061A"/>
@@ -7764,7 +6163,7 @@
       </w:rPr>
     </w:lvl>
   </w:abstractNum>
-  <w:abstractNum w:abstractNumId="9" w15:restartNumberingAfterBreak="0">
+  <w:abstractNum w:abstractNumId="8" w15:restartNumberingAfterBreak="0">
     <w:nsid w:val="1EBB18AC"/>
     <w:multiLevelType w:val="hybridMultilevel"/>
     <w:tmpl w:val="8064E77C"/>
@@ -7877,7 +6276,7 @@
       </w:rPr>
     </w:lvl>
   </w:abstractNum>
-  <w:abstractNum w:abstractNumId="10" w15:restartNumberingAfterBreak="0">
+  <w:abstractNum w:abstractNumId="9" w15:restartNumberingAfterBreak="0">
     <w:nsid w:val="1EE456D7"/>
     <w:multiLevelType w:val="multilevel"/>
     <w:tmpl w:val="7E4A6352"/>
@@ -8026,7 +6425,7 @@
       </w:rPr>
     </w:lvl>
   </w:abstractNum>
-  <w:abstractNum w:abstractNumId="11" w15:restartNumberingAfterBreak="0">
+  <w:abstractNum w:abstractNumId="10" w15:restartNumberingAfterBreak="0">
     <w:nsid w:val="219D4E00"/>
     <w:multiLevelType w:val="hybridMultilevel"/>
     <w:tmpl w:val="53845F66"/>
@@ -8139,7 +6538,7 @@
       </w:rPr>
     </w:lvl>
   </w:abstractNum>
-  <w:abstractNum w:abstractNumId="12" w15:restartNumberingAfterBreak="0">
+  <w:abstractNum w:abstractNumId="11" w15:restartNumberingAfterBreak="0">
     <w:nsid w:val="22653A1A"/>
     <w:multiLevelType w:val="hybridMultilevel"/>
     <w:tmpl w:val="1E4A6208"/>
@@ -8228,7 +6627,7 @@
       </w:pPr>
     </w:lvl>
   </w:abstractNum>
-  <w:abstractNum w:abstractNumId="13" w15:restartNumberingAfterBreak="0">
+  <w:abstractNum w:abstractNumId="12" w15:restartNumberingAfterBreak="0">
     <w:nsid w:val="231F051F"/>
     <w:multiLevelType w:val="hybridMultilevel"/>
     <w:tmpl w:val="265031FC"/>
@@ -8341,7 +6740,7 @@
       </w:rPr>
     </w:lvl>
   </w:abstractNum>
-  <w:abstractNum w:abstractNumId="14" w15:restartNumberingAfterBreak="0">
+  <w:abstractNum w:abstractNumId="13" w15:restartNumberingAfterBreak="0">
     <w:nsid w:val="27EC373C"/>
     <w:multiLevelType w:val="hybridMultilevel"/>
     <w:tmpl w:val="8084D50C"/>
@@ -8454,120 +6853,7 @@
       </w:rPr>
     </w:lvl>
   </w:abstractNum>
-  <w:abstractNum w:abstractNumId="15" w15:restartNumberingAfterBreak="0">
-    <w:nsid w:val="2B7727AB"/>
-    <w:multiLevelType w:val="multilevel"/>
-    <w:tmpl w:val="F9F0FE38"/>
-    <w:lvl w:ilvl="0">
-      <w:start w:val="1"/>
-      <w:numFmt w:val="decimal"/>
-      <w:lvlText w:val="%1."/>
-      <w:lvlJc w:val="left"/>
-      <w:pPr>
-        <w:tabs>
-          <w:tab w:val="num" w:pos="720"/>
-        </w:tabs>
-        <w:ind w:left="720" w:hanging="720"/>
-      </w:pPr>
-    </w:lvl>
-    <w:lvl w:ilvl="1">
-      <w:start w:val="1"/>
-      <w:numFmt w:val="decimal"/>
-      <w:lvlText w:val="%2."/>
-      <w:lvlJc w:val="left"/>
-      <w:pPr>
-        <w:tabs>
-          <w:tab w:val="num" w:pos="1440"/>
-        </w:tabs>
-        <w:ind w:left="1440" w:hanging="720"/>
-      </w:pPr>
-    </w:lvl>
-    <w:lvl w:ilvl="2">
-      <w:start w:val="1"/>
-      <w:numFmt w:val="decimal"/>
-      <w:lvlText w:val="%3."/>
-      <w:lvlJc w:val="left"/>
-      <w:pPr>
-        <w:tabs>
-          <w:tab w:val="num" w:pos="2160"/>
-        </w:tabs>
-        <w:ind w:left="2160" w:hanging="720"/>
-      </w:pPr>
-    </w:lvl>
-    <w:lvl w:ilvl="3">
-      <w:start w:val="1"/>
-      <w:numFmt w:val="decimal"/>
-      <w:lvlText w:val="%4."/>
-      <w:lvlJc w:val="left"/>
-      <w:pPr>
-        <w:tabs>
-          <w:tab w:val="num" w:pos="2880"/>
-        </w:tabs>
-        <w:ind w:left="2880" w:hanging="720"/>
-      </w:pPr>
-    </w:lvl>
-    <w:lvl w:ilvl="4">
-      <w:start w:val="1"/>
-      <w:numFmt w:val="decimal"/>
-      <w:lvlText w:val="%5."/>
-      <w:lvlJc w:val="left"/>
-      <w:pPr>
-        <w:tabs>
-          <w:tab w:val="num" w:pos="3600"/>
-        </w:tabs>
-        <w:ind w:left="3600" w:hanging="720"/>
-      </w:pPr>
-    </w:lvl>
-    <w:lvl w:ilvl="5">
-      <w:start w:val="1"/>
-      <w:numFmt w:val="decimal"/>
-      <w:lvlText w:val="%6."/>
-      <w:lvlJc w:val="left"/>
-      <w:pPr>
-        <w:tabs>
-          <w:tab w:val="num" w:pos="4320"/>
-        </w:tabs>
-        <w:ind w:left="4320" w:hanging="720"/>
-      </w:pPr>
-    </w:lvl>
-    <w:lvl w:ilvl="6">
-      <w:start w:val="1"/>
-      <w:numFmt w:val="decimal"/>
-      <w:lvlText w:val="%7."/>
-      <w:lvlJc w:val="left"/>
-      <w:pPr>
-        <w:tabs>
-          <w:tab w:val="num" w:pos="5040"/>
-        </w:tabs>
-        <w:ind w:left="5040" w:hanging="720"/>
-      </w:pPr>
-    </w:lvl>
-    <w:lvl w:ilvl="7">
-      <w:start w:val="1"/>
-      <w:numFmt w:val="decimal"/>
-      <w:lvlText w:val="%8."/>
-      <w:lvlJc w:val="left"/>
-      <w:pPr>
-        <w:tabs>
-          <w:tab w:val="num" w:pos="5760"/>
-        </w:tabs>
-        <w:ind w:left="5760" w:hanging="720"/>
-      </w:pPr>
-    </w:lvl>
-    <w:lvl w:ilvl="8">
-      <w:start w:val="1"/>
-      <w:numFmt w:val="decimal"/>
-      <w:lvlText w:val="%9."/>
-      <w:lvlJc w:val="left"/>
-      <w:pPr>
-        <w:tabs>
-          <w:tab w:val="num" w:pos="6480"/>
-        </w:tabs>
-        <w:ind w:left="6480" w:hanging="720"/>
-      </w:pPr>
-    </w:lvl>
-  </w:abstractNum>
-  <w:abstractNum w:abstractNumId="16" w15:restartNumberingAfterBreak="0">
+  <w:abstractNum w:abstractNumId="14" w15:restartNumberingAfterBreak="0">
     <w:nsid w:val="2C404A9B"/>
     <w:multiLevelType w:val="multilevel"/>
     <w:tmpl w:val="B8CE60B6"/>
@@ -8716,7 +7002,7 @@
       </w:rPr>
     </w:lvl>
   </w:abstractNum>
-  <w:abstractNum w:abstractNumId="17" w15:restartNumberingAfterBreak="0">
+  <w:abstractNum w:abstractNumId="15" w15:restartNumberingAfterBreak="0">
     <w:nsid w:val="2D2C2B30"/>
     <w:multiLevelType w:val="hybridMultilevel"/>
     <w:tmpl w:val="1DBCFB62"/>
@@ -8802,7 +7088,7 @@
       </w:pPr>
     </w:lvl>
   </w:abstractNum>
-  <w:abstractNum w:abstractNumId="18" w15:restartNumberingAfterBreak="0">
+  <w:abstractNum w:abstractNumId="16" w15:restartNumberingAfterBreak="0">
     <w:nsid w:val="323D0CA0"/>
     <w:multiLevelType w:val="multilevel"/>
     <w:tmpl w:val="7E4A6352"/>
@@ -8951,7 +7237,7 @@
       </w:rPr>
     </w:lvl>
   </w:abstractNum>
-  <w:abstractNum w:abstractNumId="19" w15:restartNumberingAfterBreak="0">
+  <w:abstractNum w:abstractNumId="17" w15:restartNumberingAfterBreak="0">
     <w:nsid w:val="324B2E5D"/>
     <w:multiLevelType w:val="multilevel"/>
     <w:tmpl w:val="7E4A6352"/>
@@ -9100,7 +7386,7 @@
       </w:rPr>
     </w:lvl>
   </w:abstractNum>
-  <w:abstractNum w:abstractNumId="20" w15:restartNumberingAfterBreak="0">
+  <w:abstractNum w:abstractNumId="18" w15:restartNumberingAfterBreak="0">
     <w:nsid w:val="39CF033A"/>
     <w:multiLevelType w:val="hybridMultilevel"/>
     <w:tmpl w:val="E012ADAA"/>
@@ -9213,7 +7499,7 @@
       </w:rPr>
     </w:lvl>
   </w:abstractNum>
-  <w:abstractNum w:abstractNumId="21" w15:restartNumberingAfterBreak="0">
+  <w:abstractNum w:abstractNumId="19" w15:restartNumberingAfterBreak="0">
     <w:nsid w:val="3A8549DF"/>
     <w:multiLevelType w:val="multilevel"/>
     <w:tmpl w:val="60F0303E"/>
@@ -9362,7 +7648,7 @@
       </w:rPr>
     </w:lvl>
   </w:abstractNum>
-  <w:abstractNum w:abstractNumId="22" w15:restartNumberingAfterBreak="0">
+  <w:abstractNum w:abstractNumId="20" w15:restartNumberingAfterBreak="0">
     <w:nsid w:val="3AFB673A"/>
     <w:multiLevelType w:val="hybridMultilevel"/>
     <w:tmpl w:val="B60ED516"/>
@@ -9474,7 +7760,7 @@
       </w:rPr>
     </w:lvl>
   </w:abstractNum>
-  <w:abstractNum w:abstractNumId="23" w15:restartNumberingAfterBreak="0">
+  <w:abstractNum w:abstractNumId="21" w15:restartNumberingAfterBreak="0">
     <w:nsid w:val="3AFD3BEC"/>
     <w:multiLevelType w:val="hybridMultilevel"/>
     <w:tmpl w:val="03E6C9DE"/>
@@ -9587,7 +7873,7 @@
       </w:rPr>
     </w:lvl>
   </w:abstractNum>
-  <w:abstractNum w:abstractNumId="24" w15:restartNumberingAfterBreak="0">
+  <w:abstractNum w:abstractNumId="22" w15:restartNumberingAfterBreak="0">
     <w:nsid w:val="44EE1DE3"/>
     <w:multiLevelType w:val="multilevel"/>
     <w:tmpl w:val="693CC074"/>
@@ -9736,7 +8022,7 @@
       </w:rPr>
     </w:lvl>
   </w:abstractNum>
-  <w:abstractNum w:abstractNumId="25" w15:restartNumberingAfterBreak="0">
+  <w:abstractNum w:abstractNumId="23" w15:restartNumberingAfterBreak="0">
     <w:nsid w:val="452D2107"/>
     <w:multiLevelType w:val="hybridMultilevel"/>
     <w:tmpl w:val="DC2872D8"/>
@@ -9848,7 +8134,7 @@
       </w:rPr>
     </w:lvl>
   </w:abstractNum>
-  <w:abstractNum w:abstractNumId="26" w15:restartNumberingAfterBreak="0">
+  <w:abstractNum w:abstractNumId="24" w15:restartNumberingAfterBreak="0">
     <w:nsid w:val="45B27887"/>
     <w:multiLevelType w:val="multilevel"/>
     <w:tmpl w:val="47C8419C"/>
@@ -9997,7 +8283,7 @@
       </w:rPr>
     </w:lvl>
   </w:abstractNum>
-  <w:abstractNum w:abstractNumId="27" w15:restartNumberingAfterBreak="0">
+  <w:abstractNum w:abstractNumId="25" w15:restartNumberingAfterBreak="0">
     <w:nsid w:val="45E10E38"/>
     <w:multiLevelType w:val="hybridMultilevel"/>
     <w:tmpl w:val="6B1EBCA0"/>
@@ -10110,7 +8396,7 @@
       </w:rPr>
     </w:lvl>
   </w:abstractNum>
-  <w:abstractNum w:abstractNumId="28" w15:restartNumberingAfterBreak="0">
+  <w:abstractNum w:abstractNumId="26" w15:restartNumberingAfterBreak="0">
     <w:nsid w:val="47055198"/>
     <w:multiLevelType w:val="hybridMultilevel"/>
     <w:tmpl w:val="0D3056CA"/>
@@ -10223,7 +8509,7 @@
       </w:rPr>
     </w:lvl>
   </w:abstractNum>
-  <w:abstractNum w:abstractNumId="29" w15:restartNumberingAfterBreak="0">
+  <w:abstractNum w:abstractNumId="27" w15:restartNumberingAfterBreak="0">
     <w:nsid w:val="48496D19"/>
     <w:multiLevelType w:val="multilevel"/>
     <w:tmpl w:val="7E4A6352"/>
@@ -10372,7 +8658,7 @@
       </w:rPr>
     </w:lvl>
   </w:abstractNum>
-  <w:abstractNum w:abstractNumId="30" w15:restartNumberingAfterBreak="0">
+  <w:abstractNum w:abstractNumId="28" w15:restartNumberingAfterBreak="0">
     <w:nsid w:val="52FD7B58"/>
     <w:multiLevelType w:val="hybridMultilevel"/>
     <w:tmpl w:val="4C1AD428"/>
@@ -10485,7 +8771,7 @@
       </w:rPr>
     </w:lvl>
   </w:abstractNum>
-  <w:abstractNum w:abstractNumId="31" w15:restartNumberingAfterBreak="0">
+  <w:abstractNum w:abstractNumId="29" w15:restartNumberingAfterBreak="0">
     <w:nsid w:val="58EB78AF"/>
     <w:multiLevelType w:val="multilevel"/>
     <w:tmpl w:val="6C045640"/>
@@ -10634,7 +8920,7 @@
       </w:rPr>
     </w:lvl>
   </w:abstractNum>
-  <w:abstractNum w:abstractNumId="32" w15:restartNumberingAfterBreak="0">
+  <w:abstractNum w:abstractNumId="30" w15:restartNumberingAfterBreak="0">
     <w:nsid w:val="5C4E7959"/>
     <w:multiLevelType w:val="multilevel"/>
     <w:tmpl w:val="32345EB2"/>
@@ -10783,7 +9069,7 @@
       </w:rPr>
     </w:lvl>
   </w:abstractNum>
-  <w:abstractNum w:abstractNumId="33" w15:restartNumberingAfterBreak="0">
+  <w:abstractNum w:abstractNumId="31" w15:restartNumberingAfterBreak="0">
     <w:nsid w:val="5EBF1786"/>
     <w:multiLevelType w:val="hybridMultilevel"/>
     <w:tmpl w:val="C8307DEA"/>
@@ -10895,7 +9181,7 @@
       </w:rPr>
     </w:lvl>
   </w:abstractNum>
-  <w:abstractNum w:abstractNumId="34" w15:restartNumberingAfterBreak="0">
+  <w:abstractNum w:abstractNumId="32" w15:restartNumberingAfterBreak="0">
     <w:nsid w:val="662A1E04"/>
     <w:multiLevelType w:val="hybridMultilevel"/>
     <w:tmpl w:val="9774DEBC"/>
@@ -11008,7 +9294,7 @@
       </w:rPr>
     </w:lvl>
   </w:abstractNum>
-  <w:abstractNum w:abstractNumId="35" w15:restartNumberingAfterBreak="0">
+  <w:abstractNum w:abstractNumId="33" w15:restartNumberingAfterBreak="0">
     <w:nsid w:val="688A54B9"/>
     <w:multiLevelType w:val="multilevel"/>
     <w:tmpl w:val="8B189CFC"/>
@@ -11130,7 +9416,7 @@
       </w:rPr>
     </w:lvl>
   </w:abstractNum>
-  <w:abstractNum w:abstractNumId="36" w15:restartNumberingAfterBreak="0">
+  <w:abstractNum w:abstractNumId="34" w15:restartNumberingAfterBreak="0">
     <w:nsid w:val="6D9B1C90"/>
     <w:multiLevelType w:val="multilevel"/>
     <w:tmpl w:val="D86069D4"/>
@@ -11279,7 +9565,7 @@
       </w:rPr>
     </w:lvl>
   </w:abstractNum>
-  <w:abstractNum w:abstractNumId="37" w15:restartNumberingAfterBreak="0">
+  <w:abstractNum w:abstractNumId="35" w15:restartNumberingAfterBreak="0">
     <w:nsid w:val="71213FB1"/>
     <w:multiLevelType w:val="multilevel"/>
     <w:tmpl w:val="7B3AC96A"/>
@@ -11428,7 +9714,7 @@
       </w:rPr>
     </w:lvl>
   </w:abstractNum>
-  <w:abstractNum w:abstractNumId="38" w15:restartNumberingAfterBreak="0">
+  <w:abstractNum w:abstractNumId="36" w15:restartNumberingAfterBreak="0">
     <w:nsid w:val="728C4210"/>
     <w:multiLevelType w:val="multilevel"/>
     <w:tmpl w:val="56E89428"/>
@@ -11577,7 +9863,7 @@
       </w:rPr>
     </w:lvl>
   </w:abstractNum>
-  <w:abstractNum w:abstractNumId="39" w15:restartNumberingAfterBreak="0">
+  <w:abstractNum w:abstractNumId="37" w15:restartNumberingAfterBreak="0">
     <w:nsid w:val="75B90A70"/>
     <w:multiLevelType w:val="multilevel"/>
     <w:tmpl w:val="5D18BA76"/>
@@ -11726,7 +10012,7 @@
       </w:rPr>
     </w:lvl>
   </w:abstractNum>
-  <w:abstractNum w:abstractNumId="40" w15:restartNumberingAfterBreak="0">
+  <w:abstractNum w:abstractNumId="38" w15:restartNumberingAfterBreak="0">
     <w:nsid w:val="779435E7"/>
     <w:multiLevelType w:val="hybridMultilevel"/>
     <w:tmpl w:val="181C6764"/>
@@ -11839,7 +10125,7 @@
       </w:rPr>
     </w:lvl>
   </w:abstractNum>
-  <w:abstractNum w:abstractNumId="41" w15:restartNumberingAfterBreak="0">
+  <w:abstractNum w:abstractNumId="39" w15:restartNumberingAfterBreak="0">
     <w:nsid w:val="7CCC6788"/>
     <w:multiLevelType w:val="multilevel"/>
     <w:tmpl w:val="40C4FC8C"/>
@@ -11988,7 +10274,7 @@
       </w:rPr>
     </w:lvl>
   </w:abstractNum>
-  <w:abstractNum w:abstractNumId="42" w15:restartNumberingAfterBreak="0">
+  <w:abstractNum w:abstractNumId="40" w15:restartNumberingAfterBreak="0">
     <w:nsid w:val="7E2E7721"/>
     <w:multiLevelType w:val="multilevel"/>
     <w:tmpl w:val="F528A5AC"/>
@@ -12138,10 +10424,10 @@
     </w:lvl>
   </w:abstractNum>
   <w:num w:numId="1" w16cid:durableId="1809780816">
-    <w:abstractNumId w:val="17"/>
+    <w:abstractNumId w:val="15"/>
   </w:num>
   <w:num w:numId="2" w16cid:durableId="284584729">
-    <w:abstractNumId w:val="35"/>
+    <w:abstractNumId w:val="33"/>
     <w:lvlOverride w:ilvl="1">
       <w:lvl w:ilvl="1">
         <w:start w:val="1"/>
@@ -12176,7 +10462,7 @@
     </w:lvlOverride>
   </w:num>
   <w:num w:numId="3" w16cid:durableId="725839449">
-    <w:abstractNumId w:val="35"/>
+    <w:abstractNumId w:val="33"/>
     <w:lvlOverride w:ilvl="0">
       <w:startOverride w:val="1"/>
     </w:lvlOverride>
@@ -12206,13 +10492,13 @@
     </w:lvlOverride>
   </w:num>
   <w:num w:numId="4" w16cid:durableId="300771649">
-    <w:abstractNumId w:val="33"/>
+    <w:abstractNumId w:val="31"/>
   </w:num>
   <w:num w:numId="5" w16cid:durableId="371852036">
-    <w:abstractNumId w:val="25"/>
+    <w:abstractNumId w:val="23"/>
   </w:num>
   <w:num w:numId="6" w16cid:durableId="815417995">
-    <w:abstractNumId w:val="35"/>
+    <w:abstractNumId w:val="33"/>
     <w:lvlOverride w:ilvl="0">
       <w:startOverride w:val="1"/>
     </w:lvlOverride>
@@ -12242,28 +10528,28 @@
     </w:lvlOverride>
   </w:num>
   <w:num w:numId="7" w16cid:durableId="718090381">
-    <w:abstractNumId w:val="35"/>
+    <w:abstractNumId w:val="33"/>
   </w:num>
   <w:num w:numId="8" w16cid:durableId="1147747865">
-    <w:abstractNumId w:val="13"/>
+    <w:abstractNumId w:val="12"/>
   </w:num>
   <w:num w:numId="9" w16cid:durableId="1751197900">
-    <w:abstractNumId w:val="35"/>
+    <w:abstractNumId w:val="33"/>
   </w:num>
   <w:num w:numId="10" w16cid:durableId="94372026">
-    <w:abstractNumId w:val="35"/>
+    <w:abstractNumId w:val="33"/>
   </w:num>
   <w:num w:numId="11" w16cid:durableId="142310025">
-    <w:abstractNumId w:val="30"/>
+    <w:abstractNumId w:val="28"/>
   </w:num>
   <w:num w:numId="12" w16cid:durableId="670106179">
-    <w:abstractNumId w:val="11"/>
+    <w:abstractNumId w:val="10"/>
   </w:num>
   <w:num w:numId="13" w16cid:durableId="390932076">
-    <w:abstractNumId w:val="22"/>
+    <w:abstractNumId w:val="20"/>
   </w:num>
   <w:num w:numId="14" w16cid:durableId="2109815121">
-    <w:abstractNumId w:val="35"/>
+    <w:abstractNumId w:val="33"/>
     <w:lvlOverride w:ilvl="0">
       <w:startOverride w:val="1"/>
       <w:lvl w:ilvl="0">
@@ -12349,115 +10635,109 @@
     </w:lvlOverride>
   </w:num>
   <w:num w:numId="15" w16cid:durableId="1965844725">
-    <w:abstractNumId w:val="34"/>
+    <w:abstractNumId w:val="32"/>
   </w:num>
   <w:num w:numId="16" w16cid:durableId="1422681268">
-    <w:abstractNumId w:val="12"/>
+    <w:abstractNumId w:val="11"/>
   </w:num>
   <w:num w:numId="17" w16cid:durableId="1721440661">
-    <w:abstractNumId w:val="24"/>
+    <w:abstractNumId w:val="22"/>
   </w:num>
   <w:num w:numId="18" w16cid:durableId="1825975087">
-    <w:abstractNumId w:val="10"/>
+    <w:abstractNumId w:val="9"/>
   </w:num>
   <w:num w:numId="19" w16cid:durableId="825511009">
-    <w:abstractNumId w:val="31"/>
+    <w:abstractNumId w:val="29"/>
   </w:num>
   <w:num w:numId="20" w16cid:durableId="113528485">
-    <w:abstractNumId w:val="41"/>
+    <w:abstractNumId w:val="39"/>
   </w:num>
   <w:num w:numId="21" w16cid:durableId="732894102">
-    <w:abstractNumId w:val="26"/>
+    <w:abstractNumId w:val="24"/>
   </w:num>
   <w:num w:numId="22" w16cid:durableId="698118865">
     <w:abstractNumId w:val="1"/>
   </w:num>
   <w:num w:numId="23" w16cid:durableId="1470318118">
-    <w:abstractNumId w:val="6"/>
+    <w:abstractNumId w:val="5"/>
   </w:num>
   <w:num w:numId="24" w16cid:durableId="879319669">
-    <w:abstractNumId w:val="32"/>
+    <w:abstractNumId w:val="30"/>
   </w:num>
   <w:num w:numId="25" w16cid:durableId="952900115">
-    <w:abstractNumId w:val="37"/>
+    <w:abstractNumId w:val="35"/>
   </w:num>
   <w:num w:numId="26" w16cid:durableId="1191256660">
-    <w:abstractNumId w:val="20"/>
+    <w:abstractNumId w:val="18"/>
   </w:num>
   <w:num w:numId="27" w16cid:durableId="128057820">
-    <w:abstractNumId w:val="40"/>
+    <w:abstractNumId w:val="38"/>
   </w:num>
   <w:num w:numId="28" w16cid:durableId="892354695">
-    <w:abstractNumId w:val="29"/>
+    <w:abstractNumId w:val="27"/>
   </w:num>
   <w:num w:numId="29" w16cid:durableId="118456222">
-    <w:abstractNumId w:val="18"/>
+    <w:abstractNumId w:val="16"/>
   </w:num>
   <w:num w:numId="30" w16cid:durableId="2146266367">
-    <w:abstractNumId w:val="19"/>
+    <w:abstractNumId w:val="17"/>
   </w:num>
   <w:num w:numId="31" w16cid:durableId="726760484">
     <w:abstractNumId w:val="3"/>
   </w:num>
   <w:num w:numId="32" w16cid:durableId="399014886">
-    <w:abstractNumId w:val="21"/>
+    <w:abstractNumId w:val="19"/>
   </w:num>
   <w:num w:numId="33" w16cid:durableId="512645413">
-    <w:abstractNumId w:val="38"/>
+    <w:abstractNumId w:val="36"/>
   </w:num>
   <w:num w:numId="34" w16cid:durableId="1188562980">
-    <w:abstractNumId w:val="16"/>
+    <w:abstractNumId w:val="14"/>
   </w:num>
   <w:num w:numId="35" w16cid:durableId="1075277144">
-    <w:abstractNumId w:val="36"/>
+    <w:abstractNumId w:val="34"/>
   </w:num>
   <w:num w:numId="36" w16cid:durableId="848064896">
-    <w:abstractNumId w:val="8"/>
+    <w:abstractNumId w:val="7"/>
   </w:num>
   <w:num w:numId="37" w16cid:durableId="394861365">
     <w:abstractNumId w:val="0"/>
   </w:num>
   <w:num w:numId="38" w16cid:durableId="1551724567">
-    <w:abstractNumId w:val="39"/>
+    <w:abstractNumId w:val="37"/>
   </w:num>
   <w:num w:numId="39" w16cid:durableId="179392482">
     <w:abstractNumId w:val="2"/>
   </w:num>
   <w:num w:numId="40" w16cid:durableId="998193706">
-    <w:abstractNumId w:val="7"/>
+    <w:abstractNumId w:val="6"/>
   </w:num>
   <w:num w:numId="41" w16cid:durableId="1875072376">
-    <w:abstractNumId w:val="9"/>
+    <w:abstractNumId w:val="8"/>
   </w:num>
   <w:num w:numId="42" w16cid:durableId="928346210">
-    <w:abstractNumId w:val="23"/>
+    <w:abstractNumId w:val="21"/>
   </w:num>
   <w:num w:numId="43" w16cid:durableId="53823787">
-    <w:abstractNumId w:val="28"/>
+    <w:abstractNumId w:val="26"/>
   </w:num>
   <w:num w:numId="44" w16cid:durableId="318506695">
-    <w:abstractNumId w:val="14"/>
+    <w:abstractNumId w:val="13"/>
   </w:num>
   <w:num w:numId="45" w16cid:durableId="2083940327">
-    <w:abstractNumId w:val="27"/>
+    <w:abstractNumId w:val="25"/>
   </w:num>
   <w:num w:numId="46" w16cid:durableId="1349019421">
     <w:abstractNumId w:val="4"/>
   </w:num>
   <w:num w:numId="47" w16cid:durableId="434596880">
-    <w:abstractNumId w:val="42"/>
-  </w:num>
-  <w:num w:numId="48" w16cid:durableId="1736508800">
-    <w:abstractNumId w:val="5"/>
-  </w:num>
-  <w:num w:numId="49" w16cid:durableId="546912248">
-    <w:abstractNumId w:val="15"/>
+    <w:abstractNumId w:val="40"/>
   </w:num>
 </w:numbering>
 </file>
 
 <file path=word/styles.xml><?xml version="1.0" encoding="utf-8"?>
-<w:styles xmlns:mc="http://schemas.openxmlformats.org/markup-compatibility/2006" xmlns:r="http://schemas.openxmlformats.org/officeDocument/2006/relationships" xmlns:w="http://schemas.openxmlformats.org/wordprocessingml/2006/main" xmlns:w14="http://schemas.microsoft.com/office/word/2010/wordml" xmlns:w15="http://schemas.microsoft.com/office/word/2012/wordml" xmlns:w16cex="http://schemas.microsoft.com/office/word/2018/wordml/cex" xmlns:w16cid="http://schemas.microsoft.com/office/word/2016/wordml/cid" xmlns:w16="http://schemas.microsoft.com/office/word/2018/wordml" xmlns:w16sdtdh="http://schemas.microsoft.com/office/word/2020/wordml/sdtdatahash" xmlns:w16sdtfl="http://schemas.microsoft.com/office/word/2024/wordml/sdtformatlock" xmlns:w16se="http://schemas.microsoft.com/office/word/2015/wordml/symex" xmlns:w16du="http://schemas.microsoft.com/office/word/2023/wordml/word16du" mc:Ignorable="w14 w15 w16se w16cid w16 w16cex w16sdtdh w16sdtfl w16du">
+<w:styles xmlns:mc="http://schemas.openxmlformats.org/markup-compatibility/2006" xmlns:r="http://schemas.openxmlformats.org/officeDocument/2006/relationships" xmlns:w="http://schemas.openxmlformats.org/wordprocessingml/2006/main" xmlns:w14="http://schemas.microsoft.com/office/word/2010/wordml" xmlns:w15="http://schemas.microsoft.com/office/word/2012/wordml" xmlns:w16cex="http://schemas.microsoft.com/office/word/2018/wordml/cex" xmlns:w16cid="http://schemas.microsoft.com/office/word/2016/wordml/cid" xmlns:w16="http://schemas.microsoft.com/office/word/2018/wordml" xmlns:w16sdtdh="http://schemas.microsoft.com/office/word/2020/wordml/sdtdatahash" xmlns:w16se="http://schemas.microsoft.com/office/word/2015/wordml/symex" mc:Ignorable="w14 w15 w16se w16cid w16 w16cex w16sdtdh">
   <w:docDefaults>
     <w:rPrDefault>
       <w:rPr>
@@ -12968,7 +11248,6 @@
   <w:style w:type="character" w:default="1" w:styleId="DefaultParagraphFont">
     <w:name w:val="Default Paragraph Font"/>
     <w:uiPriority w:val="1"/>
-    <w:semiHidden/>
     <w:unhideWhenUsed/>
   </w:style>
   <w:style w:type="table" w:default="1" w:styleId="TableNormal">
@@ -13994,7 +12273,7 @@
 </file>
 
 <file path=word/glossary/document.xml><?xml version="1.0" encoding="utf-8"?>
-<w:glossaryDocument xmlns:wpc="http://schemas.microsoft.com/office/word/2010/wordprocessingCanvas" xmlns:cx="http://schemas.microsoft.com/office/drawing/2014/chartex" xmlns:cx1="http://schemas.microsoft.com/office/drawing/2015/9/8/chartex" xmlns:cx2="http://schemas.microsoft.com/office/drawing/2015/10/21/chartex" xmlns:cx3="http://schemas.microsoft.com/office/drawing/2016/5/9/chartex" xmlns:cx4="http://schemas.microsoft.com/office/drawing/2016/5/10/chartex" xmlns:cx5="http://schemas.microsoft.com/office/drawing/2016/5/11/chartex" xmlns:cx6="http://schemas.microsoft.com/office/drawing/2016/5/12/chartex" xmlns:cx7="http://schemas.microsoft.com/office/drawing/2016/5/13/chartex" xmlns:cx8="http://schemas.microsoft.com/office/drawing/2016/5/14/chartex" xmlns:mc="http://schemas.openxmlformats.org/markup-compatibility/2006" xmlns:m="http://schemas.openxmlformats.org/officeDocument/2006/math" xmlns:aink="http://schemas.microsoft.com/office/drawing/2016/ink" xmlns:am3d="http://schemas.microsoft.com/office/drawing/2017/model3d" xmlns:oel="http://schemas.microsoft.com/office/2019/extlst" xmlns:r="http://schemas.openxmlformats.org/officeDocument/2006/relationships" xmlns:wp14="http://schemas.microsoft.com/office/word/2010/wordprocessingDrawing" xmlns:wp="http://schemas.openxmlformats.org/drawingml/2006/wordprocessingDrawing" xmlns:wpg="http://schemas.microsoft.com/office/word/2010/wordprocessingGroup" xmlns:wpi="http://schemas.microsoft.com/office/word/2010/wordprocessingInk" xmlns:wps="http://schemas.microsoft.com/office/word/2010/wordprocessingShape" xmlns:o="urn:schemas-microsoft-com:office:office" xmlns:v="urn:schemas-microsoft-com:vml" xmlns:w10="urn:schemas-microsoft-com:office:word" xmlns:w="http://schemas.openxmlformats.org/wordprocessingml/2006/main" xmlns:w14="http://schemas.microsoft.com/office/word/2010/wordml" xmlns:w15="http://schemas.microsoft.com/office/word/2012/wordml" xmlns:w16cex="http://schemas.microsoft.com/office/word/2018/wordml/cex" xmlns:w16cid="http://schemas.microsoft.com/office/word/2016/wordml/cid" xmlns:w16="http://schemas.microsoft.com/office/word/2018/wordml" xmlns:w16sdtdh="http://schemas.microsoft.com/office/word/2020/wordml/sdtdatahash" xmlns:w16sdtfl="http://schemas.microsoft.com/office/word/2024/wordml/sdtformatlock" xmlns:w16se="http://schemas.microsoft.com/office/word/2015/wordml/symex" xmlns:w16du="http://schemas.microsoft.com/office/word/2023/wordml/word16du" xmlns:wne="http://schemas.microsoft.com/office/word/2006/wordml" mc:Ignorable="w14 w15 w16se w16cid w16 w16cex w16sdtdh w16sdtfl w16du wp14">
+<w:glossaryDocument xmlns:wpc="http://schemas.microsoft.com/office/word/2010/wordprocessingCanvas" xmlns:cx="http://schemas.microsoft.com/office/drawing/2014/chartex" xmlns:cx1="http://schemas.microsoft.com/office/drawing/2015/9/8/chartex" xmlns:cx2="http://schemas.microsoft.com/office/drawing/2015/10/21/chartex" xmlns:cx3="http://schemas.microsoft.com/office/drawing/2016/5/9/chartex" xmlns:cx4="http://schemas.microsoft.com/office/drawing/2016/5/10/chartex" xmlns:cx5="http://schemas.microsoft.com/office/drawing/2016/5/11/chartex" xmlns:cx6="http://schemas.microsoft.com/office/drawing/2016/5/12/chartex" xmlns:cx7="http://schemas.microsoft.com/office/drawing/2016/5/13/chartex" xmlns:cx8="http://schemas.microsoft.com/office/drawing/2016/5/14/chartex" xmlns:mc="http://schemas.openxmlformats.org/markup-compatibility/2006" xmlns:aink="http://schemas.microsoft.com/office/drawing/2016/ink" xmlns:am3d="http://schemas.microsoft.com/office/drawing/2017/model3d" xmlns:o="urn:schemas-microsoft-com:office:office" xmlns:oel="http://schemas.microsoft.com/office/2019/extlst" xmlns:r="http://schemas.openxmlformats.org/officeDocument/2006/relationships" xmlns:m="http://schemas.openxmlformats.org/officeDocument/2006/math" xmlns:v="urn:schemas-microsoft-com:vml" xmlns:wp14="http://schemas.microsoft.com/office/word/2010/wordprocessingDrawing" xmlns:wp="http://schemas.openxmlformats.org/drawingml/2006/wordprocessingDrawing" xmlns:w10="urn:schemas-microsoft-com:office:word" xmlns:w="http://schemas.openxmlformats.org/wordprocessingml/2006/main" xmlns:w14="http://schemas.microsoft.com/office/word/2010/wordml" xmlns:w15="http://schemas.microsoft.com/office/word/2012/wordml" xmlns:w16cex="http://schemas.microsoft.com/office/word/2018/wordml/cex" xmlns:w16cid="http://schemas.microsoft.com/office/word/2016/wordml/cid" xmlns:w16="http://schemas.microsoft.com/office/word/2018/wordml" xmlns:w16sdtdh="http://schemas.microsoft.com/office/word/2020/wordml/sdtdatahash" xmlns:w16se="http://schemas.microsoft.com/office/word/2015/wordml/symex" xmlns:wpg="http://schemas.microsoft.com/office/word/2010/wordprocessingGroup" xmlns:wpi="http://schemas.microsoft.com/office/word/2010/wordprocessingInk" xmlns:wne="http://schemas.microsoft.com/office/word/2006/wordml" xmlns:wps="http://schemas.microsoft.com/office/word/2010/wordprocessingShape" mc:Ignorable="w14 w15 w16se w16cid w16 w16cex w16sdtdh wp14">
   <w:docParts>
     <w:docPart>
       <w:docPartPr>
@@ -14092,11 +12371,11 @@
 </file>
 
 <file path=word/glossary/fontTable.xml><?xml version="1.0" encoding="utf-8"?>
-<w:fonts xmlns:mc="http://schemas.openxmlformats.org/markup-compatibility/2006" xmlns:r="http://schemas.openxmlformats.org/officeDocument/2006/relationships" xmlns:w="http://schemas.openxmlformats.org/wordprocessingml/2006/main" xmlns:w14="http://schemas.microsoft.com/office/word/2010/wordml" xmlns:w15="http://schemas.microsoft.com/office/word/2012/wordml" xmlns:w16cex="http://schemas.microsoft.com/office/word/2018/wordml/cex" xmlns:w16cid="http://schemas.microsoft.com/office/word/2016/wordml/cid" xmlns:w16="http://schemas.microsoft.com/office/word/2018/wordml" xmlns:w16sdtdh="http://schemas.microsoft.com/office/word/2020/wordml/sdtdatahash" xmlns:w16sdtfl="http://schemas.microsoft.com/office/word/2024/wordml/sdtformatlock" xmlns:w16se="http://schemas.microsoft.com/office/word/2015/wordml/symex" xmlns:w16du="http://schemas.microsoft.com/office/word/2023/wordml/word16du" mc:Ignorable="w14 w15 w16se w16cid w16 w16cex w16sdtdh w16sdtfl w16du">
+<w:fonts xmlns:mc="http://schemas.openxmlformats.org/markup-compatibility/2006" xmlns:r="http://schemas.openxmlformats.org/officeDocument/2006/relationships" xmlns:w="http://schemas.openxmlformats.org/wordprocessingml/2006/main" xmlns:w14="http://schemas.microsoft.com/office/word/2010/wordml" xmlns:w15="http://schemas.microsoft.com/office/word/2012/wordml" xmlns:w16cex="http://schemas.microsoft.com/office/word/2018/wordml/cex" xmlns:w16cid="http://schemas.microsoft.com/office/word/2016/wordml/cid" xmlns:w16="http://schemas.microsoft.com/office/word/2018/wordml" xmlns:w16sdtdh="http://schemas.microsoft.com/office/word/2020/wordml/sdtdatahash" xmlns:w16se="http://schemas.microsoft.com/office/word/2015/wordml/symex" mc:Ignorable="w14 w15 w16se w16cid w16 w16cex w16sdtdh">
   <w:font w:name="Symbol">
     <w:panose1 w:val="05050102010706020507"/>
     <w:charset w:val="02"/>
-    <w:family w:val="decorative"/>
+    <w:family w:val="roman"/>
     <w:pitch w:val="variable"/>
     <w:sig w:usb0="00000000" w:usb1="10000000" w:usb2="00000000" w:usb3="00000000" w:csb0="80000000" w:csb1="00000000"/>
   </w:font>
@@ -14116,10 +12395,10 @@
   </w:font>
   <w:font w:name="Wingdings">
     <w:panose1 w:val="05000000000000000000"/>
-    <w:charset w:val="4D"/>
-    <w:family w:val="decorative"/>
+    <w:charset w:val="02"/>
+    <w:family w:val="auto"/>
     <w:pitch w:val="variable"/>
-    <w:sig w:usb0="00000003" w:usb1="00000000" w:usb2="00000000" w:usb3="00000000" w:csb0="80000001" w:csb1="00000000"/>
+    <w:sig w:usb0="00000000" w:usb1="10000000" w:usb2="00000000" w:usb3="00000000" w:csb0="80000000" w:csb1="00000000"/>
   </w:font>
   <w:font w:name="Cambria">
     <w:panose1 w:val="02040503050406030204"/>
@@ -14136,16 +12415,18 @@
     <w:sig w:usb0="E4002EFF" w:usb1="C200247B" w:usb2="00000009" w:usb3="00000000" w:csb0="000001FF" w:csb1="00000000"/>
   </w:font>
   <w:font w:name="HGｺﾞｼｯｸM">
-    <w:panose1 w:val="020B0604020202020204"/>
+    <w:panose1 w:val="00000000000000000000"/>
     <w:charset w:val="00"/>
     <w:family w:val="roman"/>
+    <w:notTrueType/>
     <w:pitch w:val="default"/>
   </w:font>
   <w:font w:name="HGMinchoB">
     <w:altName w:val="HG明朝B"/>
-    <w:panose1 w:val="020B0604020202020204"/>
+    <w:panose1 w:val="00000000000000000000"/>
     <w:charset w:val="80"/>
     <w:family w:val="roman"/>
+    <w:notTrueType/>
     <w:pitch w:val="default"/>
   </w:font>
   <w:font w:name="Tahoma">
@@ -14160,24 +12441,21 @@
     <w:charset w:val="00"/>
     <w:family w:val="modern"/>
     <w:pitch w:val="fixed"/>
-    <w:sig w:usb0="E10006FF" w:usb1="4000FCFF" w:usb2="00000009" w:usb3="00000000" w:csb0="0000019F" w:csb1="00000000"/>
+    <w:sig w:usb0="E00006FF" w:usb1="0000FCFF" w:usb2="00000001" w:usb3="00000000" w:csb0="0000019F" w:csb1="00000000"/>
   </w:font>
   <w:font w:name="Aptos">
-    <w:panose1 w:val="020B0004020202020204"/>
     <w:charset w:val="00"/>
     <w:family w:val="swiss"/>
     <w:pitch w:val="variable"/>
     <w:sig w:usb0="20000287" w:usb1="00000003" w:usb2="00000000" w:usb3="00000000" w:csb0="0000019F" w:csb1="00000000"/>
   </w:font>
   <w:font w:name="Yu Mincho">
-    <w:panose1 w:val="02020400000000000000"/>
     <w:charset w:val="80"/>
     <w:family w:val="roman"/>
     <w:pitch w:val="variable"/>
     <w:sig w:usb0="800002E7" w:usb1="2AC7FCFF" w:usb2="00000012" w:usb3="00000000" w:csb0="0002009F" w:csb1="00000000"/>
   </w:font>
   <w:font w:name="Aptos Display">
-    <w:panose1 w:val="020B0004020202020204"/>
     <w:charset w:val="00"/>
     <w:family w:val="swiss"/>
     <w:pitch w:val="variable"/>
@@ -14194,7 +12472,7 @@
 </file>
 
 <file path=word/glossary/settings.xml><?xml version="1.0" encoding="utf-8"?>
-<w:settings xmlns:mc="http://schemas.openxmlformats.org/markup-compatibility/2006" xmlns:m="http://schemas.openxmlformats.org/officeDocument/2006/math" xmlns:r="http://schemas.openxmlformats.org/officeDocument/2006/relationships" xmlns:sl="http://schemas.openxmlformats.org/schemaLibrary/2006/main" xmlns:o="urn:schemas-microsoft-com:office:office" xmlns:v="urn:schemas-microsoft-com:vml" xmlns:w10="urn:schemas-microsoft-com:office:word" xmlns:w="http://schemas.openxmlformats.org/wordprocessingml/2006/main" xmlns:w14="http://schemas.microsoft.com/office/word/2010/wordml" xmlns:w15="http://schemas.microsoft.com/office/word/2012/wordml" xmlns:w16cex="http://schemas.microsoft.com/office/word/2018/wordml/cex" xmlns:w16cid="http://schemas.microsoft.com/office/word/2016/wordml/cid" xmlns:w16="http://schemas.microsoft.com/office/word/2018/wordml" xmlns:w16sdtdh="http://schemas.microsoft.com/office/word/2020/wordml/sdtdatahash" xmlns:w16sdtfl="http://schemas.microsoft.com/office/word/2024/wordml/sdtformatlock" xmlns:w16se="http://schemas.microsoft.com/office/word/2015/wordml/symex" xmlns:w16du="http://schemas.microsoft.com/office/word/2023/wordml/word16du" mc:Ignorable="w14 w15 w16se w16cid w16 w16cex w16sdtdh w16sdtfl w16du">
+<w:settings xmlns:mc="http://schemas.openxmlformats.org/markup-compatibility/2006" xmlns:o="urn:schemas-microsoft-com:office:office" xmlns:r="http://schemas.openxmlformats.org/officeDocument/2006/relationships" xmlns:m="http://schemas.openxmlformats.org/officeDocument/2006/math" xmlns:v="urn:schemas-microsoft-com:vml" xmlns:w10="urn:schemas-microsoft-com:office:word" xmlns:w="http://schemas.openxmlformats.org/wordprocessingml/2006/main" xmlns:w14="http://schemas.microsoft.com/office/word/2010/wordml" xmlns:w15="http://schemas.microsoft.com/office/word/2012/wordml" xmlns:w16cex="http://schemas.microsoft.com/office/word/2018/wordml/cex" xmlns:w16cid="http://schemas.microsoft.com/office/word/2016/wordml/cid" xmlns:w16="http://schemas.microsoft.com/office/word/2018/wordml" xmlns:w16sdtdh="http://schemas.microsoft.com/office/word/2020/wordml/sdtdatahash" xmlns:w16se="http://schemas.microsoft.com/office/word/2015/wordml/symex" xmlns:sl="http://schemas.openxmlformats.org/schemaLibrary/2006/main" mc:Ignorable="w14 w15 w16se w16cid w16 w16cex w16sdtdh">
   <w:view w:val="normal"/>
   <w:defaultTabStop w:val="720"/>
   <w:characterSpacingControl w:val="doNotCompress"/>
@@ -14217,7 +12495,6 @@
     <w:rsid w:val="00386242"/>
     <w:rsid w:val="003B7155"/>
     <w:rsid w:val="003D7F14"/>
-    <w:rsid w:val="00413D59"/>
     <w:rsid w:val="00427F76"/>
     <w:rsid w:val="00563128"/>
     <w:rsid w:val="006E2CD5"/>
@@ -14230,13 +12507,10 @@
     <w:rsid w:val="00AE1B17"/>
     <w:rsid w:val="00AE7445"/>
     <w:rsid w:val="00B8324E"/>
-    <w:rsid w:val="00BA1593"/>
     <w:rsid w:val="00C75739"/>
     <w:rsid w:val="00C76122"/>
     <w:rsid w:val="00D37488"/>
     <w:rsid w:val="00D53DC1"/>
-    <w:rsid w:val="00E202D4"/>
-    <w:rsid w:val="00E75B33"/>
     <w:rsid w:val="00F23CD4"/>
     <w:rsid w:val="00FF4C80"/>
   </w:rsids>
@@ -14262,7 +12536,7 @@
 </file>
 
 <file path=word/glossary/styles.xml><?xml version="1.0" encoding="utf-8"?>
-<w:styles xmlns:mc="http://schemas.openxmlformats.org/markup-compatibility/2006" xmlns:r="http://schemas.openxmlformats.org/officeDocument/2006/relationships" xmlns:w="http://schemas.openxmlformats.org/wordprocessingml/2006/main" xmlns:w14="http://schemas.microsoft.com/office/word/2010/wordml" xmlns:w15="http://schemas.microsoft.com/office/word/2012/wordml" xmlns:w16cex="http://schemas.microsoft.com/office/word/2018/wordml/cex" xmlns:w16cid="http://schemas.microsoft.com/office/word/2016/wordml/cid" xmlns:w16="http://schemas.microsoft.com/office/word/2018/wordml" xmlns:w16sdtdh="http://schemas.microsoft.com/office/word/2020/wordml/sdtdatahash" xmlns:w16sdtfl="http://schemas.microsoft.com/office/word/2024/wordml/sdtformatlock" xmlns:w16se="http://schemas.microsoft.com/office/word/2015/wordml/symex" xmlns:w16du="http://schemas.microsoft.com/office/word/2023/wordml/word16du" mc:Ignorable="w14 w15 w16se w16cid w16 w16cex w16sdtdh w16sdtfl w16du">
+<w:styles xmlns:mc="http://schemas.openxmlformats.org/markup-compatibility/2006" xmlns:r="http://schemas.openxmlformats.org/officeDocument/2006/relationships" xmlns:w="http://schemas.openxmlformats.org/wordprocessingml/2006/main" xmlns:w14="http://schemas.microsoft.com/office/word/2010/wordml" xmlns:w15="http://schemas.microsoft.com/office/word/2012/wordml" xmlns:w16cex="http://schemas.microsoft.com/office/word/2018/wordml/cex" xmlns:w16cid="http://schemas.microsoft.com/office/word/2016/wordml/cid" xmlns:w16="http://schemas.microsoft.com/office/word/2018/wordml" xmlns:w16sdtdh="http://schemas.microsoft.com/office/word/2020/wordml/sdtdatahash" xmlns:w16se="http://schemas.microsoft.com/office/word/2015/wordml/symex" mc:Ignorable="w14 w15 w16se w16cid w16 w16cex w16sdtdh">
   <w:docDefaults>
     <w:rPrDefault>
       <w:rPr>
@@ -14713,7 +12987,7 @@
 </file>
 
 <file path=word/glossary/webSettings.xml><?xml version="1.0" encoding="utf-8"?>
-<w:webSettings xmlns:mc="http://schemas.openxmlformats.org/markup-compatibility/2006" xmlns:r="http://schemas.openxmlformats.org/officeDocument/2006/relationships" xmlns:w="http://schemas.openxmlformats.org/wordprocessingml/2006/main" xmlns:w14="http://schemas.microsoft.com/office/word/2010/wordml" xmlns:w15="http://schemas.microsoft.com/office/word/2012/wordml" xmlns:w16cex="http://schemas.microsoft.com/office/word/2018/wordml/cex" xmlns:w16cid="http://schemas.microsoft.com/office/word/2016/wordml/cid" xmlns:w16="http://schemas.microsoft.com/office/word/2018/wordml" xmlns:w16sdtdh="http://schemas.microsoft.com/office/word/2020/wordml/sdtdatahash" xmlns:w16sdtfl="http://schemas.microsoft.com/office/word/2024/wordml/sdtformatlock" xmlns:w16se="http://schemas.microsoft.com/office/word/2015/wordml/symex" xmlns:w16du="http://schemas.microsoft.com/office/word/2023/wordml/word16du" mc:Ignorable="w14 w15 w16se w16cid w16 w16cex w16sdtdh w16sdtfl w16du">
+<w:webSettings xmlns:mc="http://schemas.openxmlformats.org/markup-compatibility/2006" xmlns:r="http://schemas.openxmlformats.org/officeDocument/2006/relationships" xmlns:w="http://schemas.openxmlformats.org/wordprocessingml/2006/main" xmlns:w14="http://schemas.microsoft.com/office/word/2010/wordml" xmlns:w15="http://schemas.microsoft.com/office/word/2012/wordml" xmlns:w16cex="http://schemas.microsoft.com/office/word/2018/wordml/cex" xmlns:w16cid="http://schemas.microsoft.com/office/word/2016/wordml/cid" xmlns:w16="http://schemas.microsoft.com/office/word/2018/wordml" xmlns:w16sdtdh="http://schemas.microsoft.com/office/word/2020/wordml/sdtdatahash" xmlns:w16se="http://schemas.microsoft.com/office/word/2015/wordml/symex" mc:Ignorable="w14 w15 w16se w16cid w16 w16cex w16sdtdh">
   <w:optimizeForBrowser/>
   <w:allowPNG/>
 </w:webSettings>

</xml_diff>